<commit_message>
change 1 chapter: removed DDD
</commit_message>
<xml_diff>
--- a/ВКР Киво Михаил.docx
+++ b/ВКР Киво Михаил.docx
@@ -760,6 +760,7 @@
           <w:docPartUnique/>
         </w:docPartObj>
       </w:sdtPr>
+      <w:sdtEndPr/>
       <w:sdtContent>
         <w:p>
           <w:pPr>
@@ -4171,7 +4172,15 @@
       </w:r>
       <w:proofErr w:type="spellEnd"/>
       <w:r>
-        <w:t>, анализа и суммаризации речи и получившегося текста.</w:t>
+        <w:t xml:space="preserve">, анализа и </w:t>
+      </w:r>
+      <w:proofErr w:type="spellStart"/>
+      <w:r>
+        <w:t>суммаризации</w:t>
+      </w:r>
+      <w:proofErr w:type="spellEnd"/>
+      <w:r>
+        <w:t xml:space="preserve"> речи и получившегося текста.</w:t>
       </w:r>
     </w:p>
     <w:p>
@@ -5301,7 +5310,15 @@
       </w:r>
       <w:proofErr w:type="spellEnd"/>
       <w:r>
-        <w:t xml:space="preserve"> и Fireflies работают </w:t>
+        <w:t xml:space="preserve"> и </w:t>
+      </w:r>
+      <w:proofErr w:type="spellStart"/>
+      <w:r>
+        <w:t>Fireflies</w:t>
+      </w:r>
+      <w:proofErr w:type="spellEnd"/>
+      <w:r>
+        <w:t xml:space="preserve"> работают </w:t>
       </w:r>
       <w:r>
         <w:t>только</w:t>
@@ -6800,11 +6817,19 @@
         </w:rPr>
         <w:t xml:space="preserve"> благодаря </w:t>
       </w:r>
-      <w:r>
-        <w:rPr>
-          <w:lang w:eastAsia="ru-RU"/>
-        </w:rPr>
-        <w:t xml:space="preserve">RabbitMQ и </w:t>
+      <w:proofErr w:type="spellStart"/>
+      <w:r>
+        <w:rPr>
+          <w:lang w:eastAsia="ru-RU"/>
+        </w:rPr>
+        <w:t>RabbitMQ</w:t>
+      </w:r>
+      <w:proofErr w:type="spellEnd"/>
+      <w:r>
+        <w:rPr>
+          <w:lang w:eastAsia="ru-RU"/>
+        </w:rPr>
+        <w:t xml:space="preserve"> и </w:t>
       </w:r>
       <w:proofErr w:type="spellStart"/>
       <w:r>
@@ -7389,7 +7414,21 @@
         <w:rPr>
           <w:lang w:eastAsia="ru-RU"/>
         </w:rPr>
-        <w:t xml:space="preserve"> Design и стандартными компонентами платформы.</w:t>
+        <w:t xml:space="preserve"> </w:t>
+      </w:r>
+      <w:proofErr w:type="spellStart"/>
+      <w:r>
+        <w:rPr>
+          <w:lang w:eastAsia="ru-RU"/>
+        </w:rPr>
+        <w:t>Design</w:t>
+      </w:r>
+      <w:proofErr w:type="spellEnd"/>
+      <w:r>
+        <w:rPr>
+          <w:lang w:eastAsia="ru-RU"/>
+        </w:rPr>
+        <w:t xml:space="preserve"> и стандартными компонентами платформы.</w:t>
       </w:r>
     </w:p>
     <w:p>
@@ -7604,7 +7643,43 @@
         <w:rPr>
           <w:lang w:eastAsia="ru-RU"/>
         </w:rPr>
-        <w:t xml:space="preserve"> вопросы по содержанию встречи. Такой подход обеспечивает баланс между автоматизацией и контролем, позволяя пользователю вести себя естественно во время встречи, не опасаясь, что неформальные </w:t>
+        <w:t xml:space="preserve"> вопросы по содержанию встречи. </w:t>
+      </w:r>
+      <w:r>
+        <w:rPr>
+          <w:lang w:eastAsia="ru-RU"/>
+        </w:rPr>
+        <w:t>Этот</w:t>
+      </w:r>
+      <w:r>
+        <w:rPr>
+          <w:lang w:eastAsia="ru-RU"/>
+        </w:rPr>
+        <w:t xml:space="preserve"> подход обеспечивает автоматизаци</w:t>
+      </w:r>
+      <w:r>
+        <w:rPr>
+          <w:lang w:eastAsia="ru-RU"/>
+        </w:rPr>
+        <w:t>ю</w:t>
+      </w:r>
+      <w:r>
+        <w:rPr>
+          <w:lang w:eastAsia="ru-RU"/>
+        </w:rPr>
+        <w:t xml:space="preserve"> и контрол</w:t>
+      </w:r>
+      <w:r>
+        <w:rPr>
+          <w:lang w:eastAsia="ru-RU"/>
+        </w:rPr>
+        <w:t>ь</w:t>
+      </w:r>
+      <w:r>
+        <w:rPr>
+          <w:lang w:eastAsia="ru-RU"/>
+        </w:rPr>
+        <w:t xml:space="preserve">, позволяя пользователю вести себя естественно во время встречи, не опасаясь, что неформальные </w:t>
       </w:r>
       <w:r>
         <w:rPr>
@@ -7646,7 +7721,43 @@
         <w:rPr>
           <w:lang w:eastAsia="ru-RU"/>
         </w:rPr>
-        <w:t>Проектирование концептуальной модели системы направлено на формализацию представлений о том, как должен функционировать инструмент автоматического протоколирования деловых встреч с последующей генерацией структурированных резюме и поддержкой интерактивного диалога. На данном этапе система рассматривается не как совокупность программных компонентов, а как абстрактный механизм, поддерживающий деятельность пользователей в условиях необходимости точной, своевременной и конфиденциальной фиксации содержания устных переговоров. Целью моделирования является выявление ключевых понятий предметной области, их взаимосвязей и динамики преобразования данных от момента инициализации встречи до получения итогового результата.</w:t>
+        <w:t xml:space="preserve">Концептуальная модель системы отражает ключевые сущности и процессы, необходимые для автоматического протоколирования деловых встреч. На данном этапе цель заключается не в применении сложных архитектурных методологий, а в выявлении основных объектов, их атрибутов и последовательности обработки данных, </w:t>
+      </w:r>
+      <w:r>
+        <w:rPr>
+          <w:lang w:eastAsia="ru-RU"/>
+        </w:rPr>
+        <w:t xml:space="preserve">для того </w:t>
+      </w:r>
+      <w:r>
+        <w:rPr>
+          <w:lang w:eastAsia="ru-RU"/>
+        </w:rPr>
+        <w:t>что</w:t>
+      </w:r>
+      <w:r>
+        <w:rPr>
+          <w:lang w:eastAsia="ru-RU"/>
+        </w:rPr>
+        <w:t>бы</w:t>
+      </w:r>
+      <w:r>
+        <w:rPr>
+          <w:lang w:eastAsia="ru-RU"/>
+        </w:rPr>
+        <w:t xml:space="preserve"> обеспечит</w:t>
+      </w:r>
+      <w:r>
+        <w:rPr>
+          <w:lang w:eastAsia="ru-RU"/>
+        </w:rPr>
+        <w:t>ь</w:t>
+      </w:r>
+      <w:r>
+        <w:rPr>
+          <w:lang w:eastAsia="ru-RU"/>
+        </w:rPr>
+        <w:t xml:space="preserve"> ясность при проектировании логической архитектуры и базы данных.</w:t>
       </w:r>
     </w:p>
     <w:p>
@@ -7660,89 +7771,7 @@
         <w:rPr>
           <w:lang w:eastAsia="ru-RU"/>
         </w:rPr>
-        <w:t>Для построения концептуальной модели применён подход предметно-ориентированного проектирования (Domain</w:t>
-      </w:r>
-      <w:r>
-        <w:rPr>
-          <w:lang w:eastAsia="ru-RU"/>
-        </w:rPr>
-        <w:t>-</w:t>
-      </w:r>
-      <w:r>
-        <w:rPr>
-          <w:lang w:eastAsia="ru-RU"/>
-        </w:rPr>
-        <w:t>Driven Design</w:t>
-      </w:r>
-      <w:r>
-        <w:rPr>
-          <w:lang w:eastAsia="ru-RU"/>
-        </w:rPr>
-        <w:t>/</w:t>
-      </w:r>
-      <w:r>
-        <w:rPr>
-          <w:lang w:eastAsia="ru-RU"/>
-        </w:rPr>
-        <w:t>DDD). В данно</w:t>
-      </w:r>
-      <w:r>
-        <w:rPr>
-          <w:lang w:eastAsia="ru-RU"/>
-        </w:rPr>
-        <w:t>м</w:t>
-      </w:r>
-      <w:r>
-        <w:rPr>
-          <w:lang w:eastAsia="ru-RU"/>
-        </w:rPr>
-        <w:t xml:space="preserve"> подход</w:t>
-      </w:r>
-      <w:r>
-        <w:rPr>
-          <w:lang w:eastAsia="ru-RU"/>
-        </w:rPr>
-        <w:t>е</w:t>
-      </w:r>
-      <w:r>
-        <w:rPr>
-          <w:lang w:eastAsia="ru-RU"/>
-        </w:rPr>
-        <w:t xml:space="preserve"> была проведена декомпозиция предметной области с использованием методологии </w:t>
-      </w:r>
-      <w:proofErr w:type="spellStart"/>
-      <w:r>
-        <w:rPr>
-          <w:lang w:eastAsia="ru-RU"/>
-        </w:rPr>
-        <w:t>Event</w:t>
-      </w:r>
-      <w:proofErr w:type="spellEnd"/>
-      <w:r>
-        <w:rPr>
-          <w:lang w:eastAsia="ru-RU"/>
-        </w:rPr>
-        <w:t xml:space="preserve"> </w:t>
-      </w:r>
-      <w:proofErr w:type="spellStart"/>
-      <w:r>
-        <w:rPr>
-          <w:lang w:eastAsia="ru-RU"/>
-        </w:rPr>
-        <w:t>Storming</w:t>
-      </w:r>
-      <w:proofErr w:type="spellEnd"/>
-      <w:r>
-        <w:rPr>
-          <w:lang w:eastAsia="ru-RU"/>
-        </w:rPr>
-        <w:t xml:space="preserve">, что позволило выявить доменные события, команды, участников и агрегаты. Участником системы выступает сотрудник </w:t>
-      </w:r>
-      <w:r>
-        <w:rPr>
-          <w:lang w:eastAsia="ru-RU"/>
-        </w:rPr>
-        <w:t>компании</w:t>
+        <w:t>Основной сущностью системы является встреча</w:t>
       </w:r>
       <w:r>
         <w:rPr>
@@ -7754,58 +7783,31 @@
         <w:rPr>
           <w:lang w:eastAsia="ru-RU"/>
         </w:rPr>
-        <w:t>начинающий</w:t>
-      </w:r>
-      <w:r>
-        <w:rPr>
-          <w:lang w:eastAsia="ru-RU"/>
-        </w:rPr>
-        <w:t xml:space="preserve"> запись встречи или анализирующий её результаты.</w:t>
-      </w:r>
-    </w:p>
-    <w:p>
-      <w:pPr>
-        <w:ind w:left="0" w:firstLine="720"/>
-        <w:rPr>
-          <w:lang w:eastAsia="ru-RU"/>
-        </w:rPr>
-      </w:pPr>
-      <w:r>
-        <w:rPr>
-          <w:lang w:eastAsia="ru-RU"/>
-        </w:rPr>
-        <w:t xml:space="preserve">Центральным элементом предметной области является встреча бизнес-объект, представляющий собой зафиксированное событие коммуникации </w:t>
-      </w:r>
-      <w:r>
-        <w:rPr>
-          <w:lang w:eastAsia="ru-RU"/>
-        </w:rPr>
-        <w:lastRenderedPageBreak/>
-        <w:t xml:space="preserve">между двумя и более участниками. </w:t>
-      </w:r>
-      <w:r>
-        <w:rPr>
-          <w:lang w:eastAsia="ru-RU"/>
-        </w:rPr>
-        <w:t>У в</w:t>
-      </w:r>
-      <w:r>
-        <w:rPr>
-          <w:lang w:eastAsia="ru-RU"/>
-        </w:rPr>
-        <w:t>стреч</w:t>
-      </w:r>
-      <w:r>
-        <w:rPr>
-          <w:lang w:eastAsia="ru-RU"/>
-        </w:rPr>
-        <w:t>и есть</w:t>
-      </w:r>
-      <w:r>
-        <w:rPr>
-          <w:lang w:eastAsia="ru-RU"/>
-        </w:rPr>
-        <w:t xml:space="preserve"> </w:t>
+        <w:t xml:space="preserve">событие деловой коммуникации, </w:t>
+      </w:r>
+      <w:r>
+        <w:rPr>
+          <w:lang w:eastAsia="ru-RU"/>
+        </w:rPr>
+        <w:t xml:space="preserve">которое </w:t>
+      </w:r>
+      <w:r>
+        <w:rPr>
+          <w:lang w:eastAsia="ru-RU"/>
+        </w:rPr>
+        <w:t>имее</w:t>
+      </w:r>
+      <w:r>
+        <w:rPr>
+          <w:lang w:eastAsia="ru-RU"/>
+        </w:rPr>
+        <w:t>т</w:t>
+      </w:r>
+      <w:r>
+        <w:rPr>
+          <w:lang w:eastAsia="ru-RU"/>
+        </w:rPr>
+        <w:t xml:space="preserve"> уникальный идентификатор (UUID), </w:t>
       </w:r>
       <w:r>
         <w:rPr>
@@ -7817,7 +7819,7 @@
         <w:rPr>
           <w:lang w:eastAsia="ru-RU"/>
         </w:rPr>
-        <w:t xml:space="preserve">, источник аудиоданных и статус обработки. С момента создания встреча порождает цепочку доменных событий: </w:t>
+        <w:t xml:space="preserve"> начала и окончания, источник аудиоданных (микрофон или загруженный файл) и статус обработки. В ходе своего жизненного цикла встреча проходит этапы:</w:t>
       </w:r>
     </w:p>
     <w:p>
@@ -7825,7 +7827,7 @@
         <w:pStyle w:val="ListParagraph"/>
         <w:numPr>
           <w:ilvl w:val="0"/>
-          <w:numId w:val="15"/>
+          <w:numId w:val="17"/>
         </w:numPr>
         <w:ind w:left="0" w:firstLine="720"/>
         <w:rPr>
@@ -7836,7 +7838,37 @@
         <w:rPr>
           <w:lang w:eastAsia="ru-RU"/>
         </w:rPr>
-        <w:t xml:space="preserve"> Встреча создана;</w:t>
+        <w:t xml:space="preserve"> </w:t>
+      </w:r>
+      <w:r>
+        <w:rPr>
+          <w:lang w:eastAsia="ru-RU"/>
+        </w:rPr>
+        <w:t>Инициализаци</w:t>
+      </w:r>
+      <w:r>
+        <w:rPr>
+          <w:lang w:eastAsia="ru-RU"/>
+        </w:rPr>
+        <w:t>я – это</w:t>
+      </w:r>
+      <w:r>
+        <w:rPr>
+          <w:lang w:eastAsia="ru-RU"/>
+        </w:rPr>
+        <w:t xml:space="preserve"> создание записи через мобильное приложение (</w:t>
+      </w:r>
+      <w:r>
+        <w:rPr>
+          <w:lang w:eastAsia="ru-RU"/>
+        </w:rPr>
+        <w:t>включение</w:t>
+      </w:r>
+      <w:r>
+        <w:rPr>
+          <w:lang w:eastAsia="ru-RU"/>
+        </w:rPr>
+        <w:t xml:space="preserve"> микрофона или выбор аудиофайла);</w:t>
       </w:r>
     </w:p>
     <w:p>
@@ -7844,7 +7876,7 @@
         <w:pStyle w:val="ListParagraph"/>
         <w:numPr>
           <w:ilvl w:val="0"/>
-          <w:numId w:val="15"/>
+          <w:numId w:val="17"/>
         </w:numPr>
         <w:ind w:left="0" w:firstLine="720"/>
         <w:rPr>
@@ -7855,15 +7887,105 @@
         <w:rPr>
           <w:lang w:eastAsia="ru-RU"/>
         </w:rPr>
-        <w:t xml:space="preserve"> Запись начата;</w:t>
-      </w:r>
+        <w:t xml:space="preserve"> </w:t>
+      </w:r>
+      <w:proofErr w:type="spellStart"/>
+      <w:r>
+        <w:rPr>
+          <w:lang w:eastAsia="ru-RU"/>
+        </w:rPr>
+        <w:t>Чанкование</w:t>
+      </w:r>
+      <w:proofErr w:type="spellEnd"/>
+      <w:r>
+        <w:rPr>
+          <w:lang w:eastAsia="ru-RU"/>
+        </w:rPr>
+        <w:t xml:space="preserve"> – это </w:t>
+      </w:r>
+      <w:r>
+        <w:rPr>
+          <w:lang w:eastAsia="ru-RU"/>
+        </w:rPr>
+        <w:t xml:space="preserve">разбиение </w:t>
+      </w:r>
+      <w:proofErr w:type="spellStart"/>
+      <w:r>
+        <w:rPr>
+          <w:lang w:eastAsia="ru-RU"/>
+        </w:rPr>
+        <w:t>аудиопотока</w:t>
+      </w:r>
+      <w:proofErr w:type="spellEnd"/>
+      <w:r>
+        <w:rPr>
+          <w:lang w:eastAsia="ru-RU"/>
+        </w:rPr>
+        <w:t xml:space="preserve"> на </w:t>
+      </w:r>
+      <w:proofErr w:type="spellStart"/>
+      <w:r>
+        <w:rPr>
+          <w:lang w:eastAsia="ru-RU"/>
+        </w:rPr>
+        <w:t>чанки</w:t>
+      </w:r>
+      <w:proofErr w:type="spellEnd"/>
+      <w:r>
+        <w:rPr>
+          <w:lang w:eastAsia="ru-RU"/>
+        </w:rPr>
+        <w:t xml:space="preserve"> по 5 минут с присвоением порядкового номера </w:t>
+      </w:r>
+      <w:proofErr w:type="spellStart"/>
+      <w:r>
+        <w:rPr>
+          <w:lang w:eastAsia="ru-RU"/>
+        </w:rPr>
+        <w:t>ord</w:t>
+      </w:r>
+      <w:proofErr w:type="spellEnd"/>
+      <w:r>
+        <w:rPr>
+          <w:lang w:eastAsia="ru-RU"/>
+        </w:rPr>
+        <w:t xml:space="preserve"> и флага </w:t>
+      </w:r>
+      <w:r>
+        <w:rPr>
+          <w:lang w:eastAsia="ru-RU"/>
+        </w:rPr>
+        <w:t xml:space="preserve">последнего </w:t>
+      </w:r>
+      <w:proofErr w:type="spellStart"/>
+      <w:r>
+        <w:rPr>
+          <w:lang w:eastAsia="ru-RU"/>
+        </w:rPr>
+        <w:t>чанка</w:t>
+      </w:r>
+      <w:proofErr w:type="spellEnd"/>
+      <w:r>
+        <w:rPr>
+          <w:lang w:eastAsia="ru-RU"/>
+        </w:rPr>
+        <w:t xml:space="preserve"> </w:t>
+      </w:r>
+      <w:proofErr w:type="spellStart"/>
+      <w:r>
+        <w:rPr>
+          <w:lang w:eastAsia="ru-RU"/>
+        </w:rPr>
+        <w:t>isLast;</w:t>
+      </w:r>
+      <w:proofErr w:type="spellEnd"/>
     </w:p>
     <w:p>
       <w:pPr>
         <w:pStyle w:val="ListParagraph"/>
         <w:numPr>
           <w:ilvl w:val="0"/>
-          <w:numId w:val="15"/>
+          <w:numId w:val="17"/>
         </w:numPr>
         <w:ind w:left="0" w:firstLine="720"/>
         <w:rPr>
@@ -7874,7 +7996,57 @@
         <w:rPr>
           <w:lang w:eastAsia="ru-RU"/>
         </w:rPr>
-        <w:t xml:space="preserve"> Встреча завершена;</w:t>
+        <w:t xml:space="preserve"> </w:t>
+      </w:r>
+      <w:r>
+        <w:rPr>
+          <w:lang w:eastAsia="ru-RU"/>
+        </w:rPr>
+        <w:t xml:space="preserve">Транскрипция </w:t>
+      </w:r>
+      <w:r>
+        <w:rPr>
+          <w:lang w:eastAsia="ru-RU"/>
+        </w:rPr>
+        <w:t xml:space="preserve">– </w:t>
+      </w:r>
+      <w:r>
+        <w:rPr>
+          <w:lang w:eastAsia="ru-RU"/>
+        </w:rPr>
+        <w:t xml:space="preserve">преобразование каждого </w:t>
+      </w:r>
+      <w:proofErr w:type="spellStart"/>
+      <w:r>
+        <w:rPr>
+          <w:lang w:eastAsia="ru-RU"/>
+        </w:rPr>
+        <w:t>чанка</w:t>
+      </w:r>
+      <w:proofErr w:type="spellEnd"/>
+      <w:r>
+        <w:rPr>
+          <w:lang w:eastAsia="ru-RU"/>
+        </w:rPr>
+        <w:t xml:space="preserve"> в текст модел</w:t>
+      </w:r>
+      <w:r>
+        <w:rPr>
+          <w:lang w:eastAsia="ru-RU"/>
+        </w:rPr>
+        <w:t xml:space="preserve">ью </w:t>
+      </w:r>
+      <w:r>
+        <w:rPr>
+          <w:lang w:eastAsia="ru-RU"/>
+        </w:rPr>
+        <w:t>преобразования речи в текст</w:t>
+      </w:r>
+      <w:r>
+        <w:rPr>
+          <w:lang w:eastAsia="ru-RU"/>
+        </w:rPr>
+        <w:t>;</w:t>
       </w:r>
     </w:p>
     <w:p>
@@ -7882,7 +8054,7 @@
         <w:pStyle w:val="ListParagraph"/>
         <w:numPr>
           <w:ilvl w:val="0"/>
-          <w:numId w:val="15"/>
+          <w:numId w:val="17"/>
         </w:numPr>
         <w:ind w:left="0" w:firstLine="720"/>
         <w:rPr>
@@ -7893,7 +8065,39 @@
         <w:rPr>
           <w:lang w:eastAsia="ru-RU"/>
         </w:rPr>
-        <w:t xml:space="preserve"> Аудиофрагмент обработан;</w:t>
+        <w:t xml:space="preserve"> </w:t>
+      </w:r>
+      <w:proofErr w:type="spellStart"/>
+      <w:r>
+        <w:rPr>
+          <w:lang w:eastAsia="ru-RU"/>
+        </w:rPr>
+        <w:t>Суммаризация</w:t>
+      </w:r>
+      <w:proofErr w:type="spellEnd"/>
+      <w:r>
+        <w:rPr>
+          <w:lang w:eastAsia="ru-RU"/>
+        </w:rPr>
+        <w:t xml:space="preserve"> </w:t>
+      </w:r>
+      <w:r>
+        <w:rPr>
+          <w:lang w:eastAsia="ru-RU"/>
+        </w:rPr>
+        <w:t>-</w:t>
+      </w:r>
+      <w:r>
+        <w:rPr>
+          <w:lang w:eastAsia="ru-RU"/>
+        </w:rPr>
+        <w:t xml:space="preserve"> генерация структурированного резюме с фильтрацией неформального контента</w:t>
+      </w:r>
+      <w:r>
+        <w:rPr>
+          <w:lang w:eastAsia="ru-RU"/>
+        </w:rPr>
+        <w:t>;</w:t>
       </w:r>
     </w:p>
     <w:p>
@@ -7901,7 +8105,7 @@
         <w:pStyle w:val="ListParagraph"/>
         <w:numPr>
           <w:ilvl w:val="0"/>
-          <w:numId w:val="15"/>
+          <w:numId w:val="17"/>
         </w:numPr>
         <w:ind w:left="0" w:firstLine="720"/>
         <w:rPr>
@@ -7912,7 +8116,377 @@
         <w:rPr>
           <w:lang w:eastAsia="ru-RU"/>
         </w:rPr>
-        <w:t xml:space="preserve"> Транскрипция сохранена;</w:t>
+        <w:lastRenderedPageBreak/>
+        <w:t xml:space="preserve"> </w:t>
+      </w:r>
+      <w:r>
+        <w:rPr>
+          <w:lang w:eastAsia="ru-RU"/>
+        </w:rPr>
+        <w:t xml:space="preserve">Завершение </w:t>
+      </w:r>
+      <w:r>
+        <w:rPr>
+          <w:lang w:eastAsia="ru-RU"/>
+        </w:rPr>
+        <w:t>-</w:t>
+      </w:r>
+      <w:r>
+        <w:rPr>
+          <w:lang w:eastAsia="ru-RU"/>
+        </w:rPr>
+        <w:t xml:space="preserve"> сохранение итогового результата в </w:t>
+      </w:r>
+      <w:r>
+        <w:rPr>
+          <w:lang w:eastAsia="ru-RU"/>
+        </w:rPr>
+        <w:t>основное</w:t>
+      </w:r>
+      <w:r>
+        <w:rPr>
+          <w:lang w:eastAsia="ru-RU"/>
+        </w:rPr>
+        <w:t xml:space="preserve"> хранилище и автоматическое удаление </w:t>
+      </w:r>
+      <w:proofErr w:type="spellStart"/>
+      <w:r>
+        <w:rPr>
+          <w:lang w:eastAsia="ru-RU"/>
+        </w:rPr>
+        <w:t>аудиочанков</w:t>
+      </w:r>
+      <w:proofErr w:type="spellEnd"/>
+      <w:r>
+        <w:rPr>
+          <w:lang w:eastAsia="ru-RU"/>
+        </w:rPr>
+        <w:t xml:space="preserve"> и транскрипции</w:t>
+      </w:r>
+      <w:r>
+        <w:rPr>
+          <w:lang w:eastAsia="ru-RU"/>
+        </w:rPr>
+        <w:t xml:space="preserve"> встречи </w:t>
+      </w:r>
+      <w:r>
+        <w:rPr>
+          <w:lang w:eastAsia="ru-RU"/>
+        </w:rPr>
+        <w:t>через 3 часа после окончания встречи.</w:t>
+      </w:r>
+    </w:p>
+    <w:p>
+      <w:pPr>
+        <w:ind w:left="0" w:firstLine="720"/>
+        <w:rPr>
+          <w:lang w:eastAsia="ru-RU"/>
+        </w:rPr>
+      </w:pPr>
+      <w:r>
+        <w:rPr>
+          <w:lang w:eastAsia="ru-RU"/>
+        </w:rPr>
+        <w:t>Второй важной сущностью является чат</w:t>
+      </w:r>
+      <w:r>
+        <w:rPr>
+          <w:lang w:eastAsia="ru-RU"/>
+        </w:rPr>
+        <w:t xml:space="preserve"> -</w:t>
+      </w:r>
+      <w:r>
+        <w:rPr>
+          <w:lang w:eastAsia="ru-RU"/>
+        </w:rPr>
+        <w:t xml:space="preserve"> интерактивный диалог между пользователем и ИИ</w:t>
+      </w:r>
+      <w:r>
+        <w:rPr>
+          <w:lang w:eastAsia="ru-RU"/>
+        </w:rPr>
+        <w:t xml:space="preserve"> </w:t>
+      </w:r>
+      <w:r>
+        <w:rPr>
+          <w:lang w:eastAsia="ru-RU"/>
+        </w:rPr>
+        <w:t xml:space="preserve">моделью, </w:t>
+      </w:r>
+      <w:r>
+        <w:rPr>
+          <w:lang w:eastAsia="ru-RU"/>
+        </w:rPr>
+        <w:t xml:space="preserve">который </w:t>
+      </w:r>
+      <w:proofErr w:type="spellStart"/>
+      <w:r>
+        <w:rPr>
+          <w:lang w:eastAsia="ru-RU"/>
+        </w:rPr>
+        <w:t>позволя</w:t>
+      </w:r>
+      <w:r>
+        <w:rPr>
+          <w:lang w:eastAsia="ru-RU"/>
+        </w:rPr>
+        <w:t>яет</w:t>
+      </w:r>
+      <w:proofErr w:type="spellEnd"/>
+      <w:r>
+        <w:rPr>
+          <w:lang w:eastAsia="ru-RU"/>
+        </w:rPr>
+        <w:t xml:space="preserve"> задавать вопросы по содержанию встречи. Каждый чат связан с </w:t>
+      </w:r>
+      <w:r>
+        <w:rPr>
+          <w:lang w:eastAsia="ru-RU"/>
+        </w:rPr>
+        <w:t>одной</w:t>
+      </w:r>
+      <w:r>
+        <w:rPr>
+          <w:lang w:eastAsia="ru-RU"/>
+        </w:rPr>
+        <w:t xml:space="preserve"> встречей и содержит </w:t>
+      </w:r>
+      <w:r>
+        <w:rPr>
+          <w:lang w:eastAsia="ru-RU"/>
+        </w:rPr>
+        <w:t>массив</w:t>
+      </w:r>
+      <w:r>
+        <w:rPr>
+          <w:lang w:eastAsia="ru-RU"/>
+        </w:rPr>
+        <w:t xml:space="preserve"> сообщений, </w:t>
+      </w:r>
+      <w:proofErr w:type="spellStart"/>
+      <w:r>
+        <w:rPr>
+          <w:lang w:eastAsia="ru-RU"/>
+        </w:rPr>
+        <w:t>которы</w:t>
+      </w:r>
+      <w:proofErr w:type="spellEnd"/>
+      <w:r>
+        <w:rPr>
+          <w:lang w:eastAsia="ru-RU"/>
+        </w:rPr>
+        <w:tab/>
+        <w:t xml:space="preserve">й </w:t>
+      </w:r>
+      <w:r>
+        <w:rPr>
+          <w:lang w:eastAsia="ru-RU"/>
+        </w:rPr>
+        <w:t>хран</w:t>
+      </w:r>
+      <w:r>
+        <w:rPr>
+          <w:lang w:eastAsia="ru-RU"/>
+        </w:rPr>
+        <w:t>ится</w:t>
+      </w:r>
+      <w:r>
+        <w:rPr>
+          <w:lang w:eastAsia="ru-RU"/>
+        </w:rPr>
+        <w:t xml:space="preserve"> в формате JSONB для эффективной передачи в модель </w:t>
+      </w:r>
+      <w:proofErr w:type="spellStart"/>
+      <w:r>
+        <w:rPr>
+          <w:lang w:eastAsia="ru-RU"/>
+        </w:rPr>
+        <w:t>суммаризации</w:t>
+      </w:r>
+      <w:proofErr w:type="spellEnd"/>
+      <w:r>
+        <w:rPr>
+          <w:lang w:eastAsia="ru-RU"/>
+        </w:rPr>
+        <w:t>.</w:t>
+      </w:r>
+    </w:p>
+    <w:p>
+      <w:pPr>
+        <w:ind w:left="0" w:firstLine="720"/>
+        <w:rPr>
+          <w:lang w:eastAsia="ru-RU"/>
+        </w:rPr>
+      </w:pPr>
+      <w:r>
+        <w:rPr>
+          <w:lang w:eastAsia="ru-RU"/>
+        </w:rPr>
+        <w:t xml:space="preserve">Все процессы </w:t>
+      </w:r>
+      <w:r>
+        <w:rPr>
+          <w:lang w:eastAsia="ru-RU"/>
+        </w:rPr>
+        <w:t>проходят</w:t>
+      </w:r>
+      <w:r>
+        <w:rPr>
+          <w:lang w:eastAsia="ru-RU"/>
+        </w:rPr>
+        <w:t xml:space="preserve"> через асинхронные сообщения </w:t>
+      </w:r>
+      <w:r>
+        <w:rPr>
+          <w:lang w:eastAsia="ru-RU"/>
+        </w:rPr>
+        <w:t xml:space="preserve">с помощью </w:t>
+      </w:r>
+      <w:proofErr w:type="spellStart"/>
+      <w:r>
+        <w:rPr>
+          <w:lang w:eastAsia="ru-RU"/>
+        </w:rPr>
+        <w:t>RabbitMQ</w:t>
+      </w:r>
+      <w:proofErr w:type="spellEnd"/>
+      <w:r>
+        <w:rPr>
+          <w:lang w:eastAsia="ru-RU"/>
+        </w:rPr>
+        <w:t xml:space="preserve"> и </w:t>
+      </w:r>
+      <w:proofErr w:type="spellStart"/>
+      <w:r>
+        <w:rPr>
+          <w:lang w:eastAsia="ru-RU"/>
+        </w:rPr>
+        <w:t>RESTful</w:t>
+      </w:r>
+      <w:proofErr w:type="spellEnd"/>
+      <w:r>
+        <w:rPr>
+          <w:lang w:eastAsia="ru-RU"/>
+        </w:rPr>
+        <w:t xml:space="preserve"> API. Такой подход обеспечивает слабую связанность компонентов, отказоустойчивость и возможность повторной обработки при сбоях.</w:t>
+      </w:r>
+      <w:r>
+        <w:rPr>
+          <w:lang w:eastAsia="ru-RU"/>
+        </w:rPr>
+        <w:t xml:space="preserve"> Используется ручное подтверждение сообщений и </w:t>
+      </w:r>
+      <w:r>
+        <w:rPr>
+          <w:lang w:val="en-US" w:eastAsia="ru-RU"/>
+        </w:rPr>
+        <w:t>Dead</w:t>
+      </w:r>
+      <w:r>
+        <w:rPr>
+          <w:lang w:eastAsia="ru-RU"/>
+        </w:rPr>
+        <w:t>-</w:t>
+      </w:r>
+      <w:r>
+        <w:rPr>
+          <w:lang w:val="en-US" w:eastAsia="ru-RU"/>
+        </w:rPr>
+        <w:t>Letter</w:t>
+      </w:r>
+      <w:r>
+        <w:rPr>
+          <w:lang w:eastAsia="ru-RU"/>
+        </w:rPr>
+        <w:t>-</w:t>
+      </w:r>
+      <w:r>
+        <w:rPr>
+          <w:lang w:val="en-US" w:eastAsia="ru-RU"/>
+        </w:rPr>
+        <w:t>Queue</w:t>
+      </w:r>
+      <w:r>
+        <w:rPr>
+          <w:lang w:eastAsia="ru-RU"/>
+        </w:rPr>
+        <w:t xml:space="preserve"> (</w:t>
+      </w:r>
+      <w:r>
+        <w:rPr>
+          <w:lang w:val="en-US" w:eastAsia="ru-RU"/>
+        </w:rPr>
+        <w:t>DQL</w:t>
+      </w:r>
+      <w:r>
+        <w:rPr>
+          <w:lang w:eastAsia="ru-RU"/>
+        </w:rPr>
+        <w:t>)</w:t>
+      </w:r>
+      <w:r>
+        <w:rPr>
+          <w:lang w:eastAsia="ru-RU"/>
+        </w:rPr>
+        <w:t>.</w:t>
+      </w:r>
+      <w:r>
+        <w:rPr>
+          <w:lang w:eastAsia="ru-RU"/>
+        </w:rPr>
+        <w:t xml:space="preserve"> </w:t>
+      </w:r>
+    </w:p>
+    <w:p>
+      <w:pPr>
+        <w:ind w:left="0" w:firstLine="720"/>
+        <w:rPr>
+          <w:lang w:eastAsia="ru-RU"/>
+        </w:rPr>
+      </w:pPr>
+      <w:r>
+        <w:rPr>
+          <w:lang w:eastAsia="ru-RU"/>
+        </w:rPr>
+        <w:t xml:space="preserve">Для визуализации функциональных границ системы построена диаграмма вариантов использования </w:t>
+      </w:r>
+      <w:r>
+        <w:rPr>
+          <w:lang w:eastAsia="ru-RU"/>
+        </w:rPr>
+        <w:t xml:space="preserve">на </w:t>
+      </w:r>
+      <w:r>
+        <w:rPr>
+          <w:lang w:eastAsia="ru-RU"/>
+        </w:rPr>
+        <w:t>рисунк</w:t>
+      </w:r>
+      <w:r>
+        <w:rPr>
+          <w:lang w:eastAsia="ru-RU"/>
+        </w:rPr>
+        <w:t>е</w:t>
+      </w:r>
+      <w:r>
+        <w:rPr>
+          <w:lang w:eastAsia="ru-RU"/>
+        </w:rPr>
+        <w:t xml:space="preserve"> 6. Основным </w:t>
+      </w:r>
+      <w:proofErr w:type="spellStart"/>
+      <w:r>
+        <w:rPr>
+          <w:lang w:eastAsia="ru-RU"/>
+        </w:rPr>
+        <w:t>актором</w:t>
+      </w:r>
+      <w:proofErr w:type="spellEnd"/>
+      <w:r>
+        <w:rPr>
+          <w:lang w:eastAsia="ru-RU"/>
+        </w:rPr>
+        <w:t xml:space="preserve"> выступает пользователь, который может:</w:t>
       </w:r>
     </w:p>
     <w:p>
@@ -7920,7 +8494,7 @@
         <w:pStyle w:val="ListParagraph"/>
         <w:numPr>
           <w:ilvl w:val="0"/>
-          <w:numId w:val="15"/>
+          <w:numId w:val="17"/>
         </w:numPr>
         <w:ind w:left="0" w:firstLine="720"/>
         <w:rPr>
@@ -7931,7 +8505,55 @@
         <w:rPr>
           <w:lang w:eastAsia="ru-RU"/>
         </w:rPr>
-        <w:t xml:space="preserve"> Речь отфильтрована;</w:t>
+        <w:t xml:space="preserve"> </w:t>
+      </w:r>
+      <w:r>
+        <w:rPr>
+          <w:lang w:eastAsia="ru-RU"/>
+        </w:rPr>
+        <w:t>создать встречу (запис</w:t>
+      </w:r>
+      <w:r>
+        <w:rPr>
+          <w:lang w:eastAsia="ru-RU"/>
+        </w:rPr>
+        <w:t>ать</w:t>
+      </w:r>
+      <w:r>
+        <w:rPr>
+          <w:lang w:eastAsia="ru-RU"/>
+        </w:rPr>
+        <w:t xml:space="preserve"> или загруз</w:t>
+      </w:r>
+      <w:r>
+        <w:rPr>
+          <w:lang w:eastAsia="ru-RU"/>
+        </w:rPr>
+        <w:t>ить</w:t>
+      </w:r>
+      <w:r>
+        <w:rPr>
+          <w:lang w:eastAsia="ru-RU"/>
+        </w:rPr>
+        <w:t xml:space="preserve"> </w:t>
+      </w:r>
+      <w:r>
+        <w:rPr>
+          <w:lang w:eastAsia="ru-RU"/>
+        </w:rPr>
+        <w:t>целый файл</w:t>
+      </w:r>
+      <w:r>
+        <w:rPr>
+          <w:lang w:eastAsia="ru-RU"/>
+        </w:rPr>
+        <w:t>)</w:t>
+      </w:r>
+      <w:r>
+        <w:rPr>
+          <w:lang w:eastAsia="ru-RU"/>
+        </w:rPr>
+        <w:t>;</w:t>
       </w:r>
     </w:p>
     <w:p>
@@ -7939,7 +8561,7 @@
         <w:pStyle w:val="ListParagraph"/>
         <w:numPr>
           <w:ilvl w:val="0"/>
-          <w:numId w:val="15"/>
+          <w:numId w:val="17"/>
         </w:numPr>
         <w:ind w:left="0" w:firstLine="720"/>
         <w:rPr>
@@ -7950,7 +8572,19 @@
         <w:rPr>
           <w:lang w:eastAsia="ru-RU"/>
         </w:rPr>
-        <w:t xml:space="preserve"> Результат сохранён в БД;</w:t>
+        <w:t xml:space="preserve"> </w:t>
+      </w:r>
+      <w:r>
+        <w:rPr>
+          <w:lang w:eastAsia="ru-RU"/>
+        </w:rPr>
+        <w:t>просматривать список встреч</w:t>
+      </w:r>
+      <w:r>
+        <w:rPr>
+          <w:lang w:eastAsia="ru-RU"/>
+        </w:rPr>
+        <w:t>;</w:t>
       </w:r>
     </w:p>
     <w:p>
@@ -7958,7 +8592,7 @@
         <w:pStyle w:val="ListParagraph"/>
         <w:numPr>
           <w:ilvl w:val="0"/>
-          <w:numId w:val="15"/>
+          <w:numId w:val="17"/>
         </w:numPr>
         <w:ind w:left="0" w:firstLine="720"/>
         <w:rPr>
@@ -7969,89 +8603,31 @@
         <w:rPr>
           <w:lang w:eastAsia="ru-RU"/>
         </w:rPr>
-        <w:t xml:space="preserve"> Временные данные удалены спустя 3 часа.</w:t>
-      </w:r>
-    </w:p>
-    <w:p>
-      <w:pPr>
-        <w:ind w:left="0" w:firstLine="720"/>
-        <w:rPr>
-          <w:lang w:eastAsia="ru-RU"/>
-        </w:rPr>
-      </w:pPr>
-      <w:r>
-        <w:rPr>
-          <w:lang w:eastAsia="ru-RU"/>
-        </w:rPr>
-        <w:t>На основе выявленных событий и команд были определены три ключевых агрегата, которы</w:t>
-      </w:r>
-      <w:r>
-        <w:rPr>
-          <w:lang w:eastAsia="ru-RU"/>
-        </w:rPr>
-        <w:t>е</w:t>
-      </w:r>
-      <w:r>
-        <w:rPr>
-          <w:lang w:eastAsia="ru-RU"/>
-        </w:rPr>
-        <w:t xml:space="preserve"> инкапсулиру</w:t>
-      </w:r>
-      <w:r>
-        <w:rPr>
-          <w:lang w:eastAsia="ru-RU"/>
-        </w:rPr>
-        <w:t>ю</w:t>
-      </w:r>
-      <w:r>
-        <w:rPr>
-          <w:lang w:eastAsia="ru-RU"/>
-        </w:rPr>
-        <w:t>т связанную группу сущностей и обеспечива</w:t>
-      </w:r>
-      <w:r>
-        <w:rPr>
-          <w:lang w:eastAsia="ru-RU"/>
-        </w:rPr>
-        <w:t>ю</w:t>
-      </w:r>
-      <w:r>
-        <w:rPr>
-          <w:lang w:eastAsia="ru-RU"/>
-        </w:rPr>
-        <w:t>т целостность данных:</w:t>
-      </w:r>
-    </w:p>
-    <w:p>
-      <w:pPr>
-        <w:ind w:left="0" w:firstLine="720"/>
-        <w:rPr>
-          <w:lang w:eastAsia="ru-RU"/>
-        </w:rPr>
-      </w:pPr>
-      <w:r>
-        <w:rPr>
-          <w:lang w:eastAsia="ru-RU"/>
-        </w:rPr>
-        <w:t xml:space="preserve">Агрегат «Встреча» отвечает за управление </w:t>
-      </w:r>
-      <w:r>
-        <w:rPr>
-          <w:lang w:eastAsia="ru-RU"/>
-        </w:rPr>
-        <w:t>данными</w:t>
-      </w:r>
-      <w:r>
-        <w:rPr>
-          <w:lang w:eastAsia="ru-RU"/>
-        </w:rPr>
-        <w:t xml:space="preserve"> встречи, координацию этапов обработки и хранение результатов. Он принимает команды</w:t>
-      </w:r>
-      <w:r>
-        <w:rPr>
-          <w:lang w:eastAsia="ru-RU"/>
-        </w:rPr>
-        <w:t>:</w:t>
+        <w:t xml:space="preserve"> </w:t>
+      </w:r>
+      <w:r>
+        <w:rPr>
+          <w:lang w:eastAsia="ru-RU"/>
+        </w:rPr>
+        <w:t xml:space="preserve">просматривать </w:t>
+      </w:r>
+      <w:r>
+        <w:rPr>
+          <w:lang w:eastAsia="ru-RU"/>
+        </w:rPr>
+        <w:t xml:space="preserve">автоматически сгенерированные </w:t>
+      </w:r>
+      <w:r>
+        <w:rPr>
+          <w:lang w:eastAsia="ru-RU"/>
+        </w:rPr>
+        <w:t>чаты по встрече</w:t>
+      </w:r>
+      <w:r>
+        <w:rPr>
+          <w:lang w:eastAsia="ru-RU"/>
+        </w:rPr>
+        <w:t>;</w:t>
       </w:r>
     </w:p>
     <w:p>
@@ -8059,7 +8635,7 @@
         <w:pStyle w:val="ListParagraph"/>
         <w:numPr>
           <w:ilvl w:val="0"/>
-          <w:numId w:val="10"/>
+          <w:numId w:val="17"/>
         </w:numPr>
         <w:ind w:left="0" w:firstLine="720"/>
         <w:rPr>
@@ -8070,463 +8646,13 @@
         <w:rPr>
           <w:lang w:eastAsia="ru-RU"/>
         </w:rPr>
-        <w:t xml:space="preserve"> </w:t>
-      </w:r>
-      <w:r>
-        <w:rPr>
-          <w:lang w:eastAsia="ru-RU"/>
-        </w:rPr>
-        <w:t>Создать встречу</w:t>
-      </w:r>
-      <w:r>
-        <w:rPr>
-          <w:lang w:eastAsia="ru-RU"/>
-        </w:rPr>
-        <w:t>;</w:t>
-      </w:r>
-    </w:p>
-    <w:p>
-      <w:pPr>
-        <w:pStyle w:val="ListParagraph"/>
-        <w:numPr>
-          <w:ilvl w:val="0"/>
-          <w:numId w:val="10"/>
-        </w:numPr>
-        <w:ind w:left="0" w:firstLine="720"/>
-        <w:rPr>
-          <w:lang w:eastAsia="ru-RU"/>
-        </w:rPr>
-      </w:pPr>
-      <w:r>
-        <w:rPr>
-          <w:lang w:eastAsia="ru-RU"/>
-        </w:rPr>
-        <w:t xml:space="preserve"> Начать запись;</w:t>
-      </w:r>
-    </w:p>
-    <w:p>
-      <w:pPr>
-        <w:pStyle w:val="ListParagraph"/>
-        <w:numPr>
-          <w:ilvl w:val="0"/>
-          <w:numId w:val="10"/>
-        </w:numPr>
-        <w:ind w:left="0" w:firstLine="720"/>
-        <w:rPr>
-          <w:lang w:eastAsia="ru-RU"/>
-        </w:rPr>
-      </w:pPr>
-      <w:r>
-        <w:rPr>
-          <w:lang w:eastAsia="ru-RU"/>
-        </w:rPr>
-        <w:t xml:space="preserve"> Удалить данные встречи;</w:t>
-      </w:r>
-    </w:p>
-    <w:p>
-      <w:pPr>
-        <w:pStyle w:val="ListParagraph"/>
-        <w:numPr>
-          <w:ilvl w:val="0"/>
-          <w:numId w:val="10"/>
-        </w:numPr>
-        <w:ind w:left="0" w:firstLine="720"/>
-        <w:rPr>
-          <w:lang w:eastAsia="ru-RU"/>
-        </w:rPr>
-      </w:pPr>
-      <w:r>
-        <w:rPr>
-          <w:lang w:eastAsia="ru-RU"/>
-        </w:rPr>
-        <w:t xml:space="preserve"> </w:t>
-      </w:r>
-      <w:r>
-        <w:rPr>
-          <w:lang w:eastAsia="ru-RU"/>
-        </w:rPr>
-        <w:t>Завершить встречу</w:t>
-      </w:r>
-      <w:r>
-        <w:rPr>
-          <w:lang w:eastAsia="ru-RU"/>
-        </w:rPr>
-        <w:t>.</w:t>
-      </w:r>
-    </w:p>
-    <w:p>
-      <w:pPr>
-        <w:ind w:left="0" w:firstLine="720"/>
-        <w:rPr>
-          <w:lang w:eastAsia="ru-RU"/>
-        </w:rPr>
-      </w:pPr>
-      <w:r>
-        <w:rPr>
-          <w:lang w:eastAsia="ru-RU"/>
-        </w:rPr>
-        <w:t>Агрегат «Транскрипция» реализует логику преобразования аудиофрагментов в текстовое представление. Он реагирует на событие «Аудиофрагмент обработан», выполняет распознавание речи с учётом контекста русскоязычной деловой коммуникации и сохраняет результат как часть полной транскрипции. Ключевые команды агрегата:</w:t>
-      </w:r>
-    </w:p>
-    <w:p>
-      <w:pPr>
-        <w:pStyle w:val="ListParagraph"/>
-        <w:numPr>
-          <w:ilvl w:val="0"/>
-          <w:numId w:val="10"/>
-        </w:numPr>
-        <w:ind w:left="0" w:firstLine="720"/>
-        <w:rPr>
-          <w:lang w:eastAsia="ru-RU"/>
-        </w:rPr>
-      </w:pPr>
-      <w:r>
-        <w:rPr>
-          <w:lang w:eastAsia="ru-RU"/>
-        </w:rPr>
-        <w:t xml:space="preserve"> Обработать </w:t>
-      </w:r>
-      <w:proofErr w:type="spellStart"/>
-      <w:r>
-        <w:rPr>
-          <w:lang w:eastAsia="ru-RU"/>
-        </w:rPr>
-        <w:t>аудиофрагмент</w:t>
-      </w:r>
-      <w:proofErr w:type="spellEnd"/>
-      <w:r>
-        <w:rPr>
-          <w:lang w:eastAsia="ru-RU"/>
-        </w:rPr>
-        <w:t>;</w:t>
-      </w:r>
-    </w:p>
-    <w:p>
-      <w:pPr>
-        <w:pStyle w:val="ListParagraph"/>
-        <w:numPr>
-          <w:ilvl w:val="0"/>
-          <w:numId w:val="10"/>
-        </w:numPr>
-        <w:ind w:left="0" w:firstLine="720"/>
-        <w:rPr>
-          <w:lang w:eastAsia="ru-RU"/>
-        </w:rPr>
-      </w:pPr>
-      <w:r>
-        <w:rPr>
-          <w:lang w:eastAsia="ru-RU"/>
-        </w:rPr>
-        <w:t xml:space="preserve"> Сохранить транскрипцию</w:t>
-      </w:r>
-      <w:r>
-        <w:rPr>
-          <w:lang w:eastAsia="ru-RU"/>
-        </w:rPr>
-        <w:t>;</w:t>
-      </w:r>
-    </w:p>
-    <w:p>
-      <w:pPr>
-        <w:pStyle w:val="ListParagraph"/>
-        <w:numPr>
-          <w:ilvl w:val="0"/>
-          <w:numId w:val="10"/>
-        </w:numPr>
-        <w:ind w:left="0" w:firstLine="720"/>
-        <w:rPr>
-          <w:lang w:eastAsia="ru-RU"/>
-        </w:rPr>
-      </w:pPr>
-      <w:r>
-        <w:rPr>
-          <w:lang w:eastAsia="ru-RU"/>
-        </w:rPr>
-        <w:t xml:space="preserve"> Опубликовать событие о завершении транскрипции.</w:t>
-      </w:r>
-    </w:p>
-    <w:p>
-      <w:pPr>
-        <w:ind w:left="0" w:firstLine="720"/>
-        <w:rPr>
-          <w:lang w:eastAsia="ru-RU"/>
-        </w:rPr>
-      </w:pPr>
-      <w:r>
-        <w:rPr>
-          <w:lang w:eastAsia="ru-RU"/>
-        </w:rPr>
-        <w:lastRenderedPageBreak/>
-        <w:t xml:space="preserve">Агрегат «Суммаризация» отвечает за генерацию </w:t>
-      </w:r>
-      <w:r>
-        <w:rPr>
-          <w:lang w:eastAsia="ru-RU"/>
-        </w:rPr>
-        <w:t>шаблонных</w:t>
-      </w:r>
-      <w:r>
-        <w:rPr>
-          <w:lang w:eastAsia="ru-RU"/>
-        </w:rPr>
-        <w:t xml:space="preserve"> </w:t>
-      </w:r>
-      <w:r>
-        <w:rPr>
-          <w:lang w:eastAsia="ru-RU"/>
-        </w:rPr>
-        <w:t>итогов</w:t>
-      </w:r>
-      <w:r>
-        <w:rPr>
-          <w:lang w:eastAsia="ru-RU"/>
-        </w:rPr>
-        <w:t xml:space="preserve"> встречи. Он </w:t>
-      </w:r>
-      <w:r>
-        <w:rPr>
-          <w:lang w:eastAsia="ru-RU"/>
-        </w:rPr>
-        <w:t>подписан</w:t>
-      </w:r>
-      <w:r>
-        <w:rPr>
-          <w:lang w:eastAsia="ru-RU"/>
-        </w:rPr>
-        <w:t xml:space="preserve"> на событие «Транскрипция </w:t>
-      </w:r>
-      <w:r>
-        <w:rPr>
-          <w:lang w:eastAsia="ru-RU"/>
-        </w:rPr>
-        <w:t>окончена</w:t>
-      </w:r>
-      <w:r>
-        <w:rPr>
-          <w:lang w:eastAsia="ru-RU"/>
-        </w:rPr>
-        <w:t>» и выполняет:</w:t>
-      </w:r>
-    </w:p>
-    <w:p>
-      <w:pPr>
-        <w:pStyle w:val="ListParagraph"/>
-        <w:numPr>
-          <w:ilvl w:val="0"/>
-          <w:numId w:val="10"/>
-        </w:numPr>
-        <w:ind w:left="0" w:firstLine="720"/>
-        <w:rPr>
-          <w:lang w:eastAsia="ru-RU"/>
-        </w:rPr>
-      </w:pPr>
-      <w:r>
-        <w:rPr>
-          <w:lang w:eastAsia="ru-RU"/>
-        </w:rPr>
-        <w:t xml:space="preserve"> Получить полную транскрипцию;</w:t>
-      </w:r>
-    </w:p>
-    <w:p>
-      <w:pPr>
-        <w:pStyle w:val="ListParagraph"/>
-        <w:numPr>
-          <w:ilvl w:val="0"/>
-          <w:numId w:val="10"/>
-        </w:numPr>
-        <w:ind w:left="0" w:firstLine="720"/>
-        <w:rPr>
-          <w:lang w:eastAsia="ru-RU"/>
-        </w:rPr>
-      </w:pPr>
-      <w:r>
-        <w:rPr>
-          <w:lang w:eastAsia="ru-RU"/>
-        </w:rPr>
-        <w:t xml:space="preserve"> Фильтрация неформальной речи;</w:t>
-      </w:r>
-    </w:p>
-    <w:p>
-      <w:pPr>
-        <w:pStyle w:val="ListParagraph"/>
-        <w:numPr>
-          <w:ilvl w:val="0"/>
-          <w:numId w:val="10"/>
-        </w:numPr>
-        <w:ind w:left="0" w:firstLine="720"/>
-        <w:rPr>
-          <w:lang w:eastAsia="ru-RU"/>
-        </w:rPr>
-      </w:pPr>
-      <w:r>
-        <w:rPr>
-          <w:lang w:eastAsia="ru-RU"/>
-        </w:rPr>
-        <w:t xml:space="preserve"> Генерация структурированного резюме;</w:t>
-      </w:r>
-    </w:p>
-    <w:p>
-      <w:pPr>
-        <w:pStyle w:val="ListParagraph"/>
-        <w:numPr>
-          <w:ilvl w:val="0"/>
-          <w:numId w:val="10"/>
-        </w:numPr>
-        <w:ind w:left="0" w:firstLine="720"/>
-        <w:rPr>
-          <w:lang w:eastAsia="ru-RU"/>
-        </w:rPr>
-      </w:pPr>
-      <w:r>
-        <w:rPr>
-          <w:lang w:eastAsia="ru-RU"/>
-        </w:rPr>
-        <w:t xml:space="preserve"> Сохранение результата в БД;</w:t>
-      </w:r>
-    </w:p>
-    <w:p>
-      <w:pPr>
-        <w:pStyle w:val="ListParagraph"/>
-        <w:numPr>
-          <w:ilvl w:val="0"/>
-          <w:numId w:val="10"/>
-        </w:numPr>
-        <w:ind w:left="0" w:firstLine="720"/>
-        <w:rPr>
-          <w:lang w:eastAsia="ru-RU"/>
-        </w:rPr>
-      </w:pPr>
-      <w:r>
-        <w:rPr>
-          <w:lang w:eastAsia="ru-RU"/>
-        </w:rPr>
-        <w:t xml:space="preserve"> Ответ на вопрос пользователя.</w:t>
-      </w:r>
-    </w:p>
-    <w:p>
-      <w:pPr>
-        <w:ind w:left="0" w:firstLine="720"/>
-        <w:rPr>
-          <w:lang w:eastAsia="ru-RU"/>
-        </w:rPr>
-      </w:pPr>
-      <w:r>
-        <w:rPr>
-          <w:lang w:eastAsia="ru-RU"/>
-        </w:rPr>
-        <w:t xml:space="preserve">Ключевая особенность данного агрегата </w:t>
-      </w:r>
-      <w:r>
-        <w:rPr>
-          <w:lang w:eastAsia="ru-RU"/>
-        </w:rPr>
-        <w:t>– это</w:t>
-      </w:r>
-      <w:r>
-        <w:rPr>
-          <w:lang w:eastAsia="ru-RU"/>
-        </w:rPr>
-        <w:t xml:space="preserve"> применение фильтрации неформального контента, что позволяет пользователю вести себя естественно во время встречи, не опасаясь попадания </w:t>
-      </w:r>
-      <w:r>
-        <w:rPr>
-          <w:lang w:eastAsia="ru-RU"/>
-        </w:rPr>
-        <w:t>лишнего</w:t>
-      </w:r>
-      <w:r>
-        <w:rPr>
-          <w:lang w:eastAsia="ru-RU"/>
-        </w:rPr>
-        <w:t xml:space="preserve"> в официальный документ.</w:t>
-      </w:r>
-      <w:r>
-        <w:rPr>
-          <w:lang w:eastAsia="ru-RU"/>
-        </w:rPr>
-        <w:t xml:space="preserve"> Д</w:t>
-      </w:r>
-      <w:r>
-        <w:rPr>
-          <w:lang w:eastAsia="ru-RU"/>
-        </w:rPr>
-        <w:t>иаграмм</w:t>
-      </w:r>
-      <w:r>
-        <w:rPr>
-          <w:lang w:eastAsia="ru-RU"/>
-        </w:rPr>
-        <w:t>а</w:t>
-      </w:r>
-      <w:r>
-        <w:rPr>
-          <w:lang w:eastAsia="ru-RU"/>
-        </w:rPr>
-        <w:t xml:space="preserve"> </w:t>
-      </w:r>
-      <w:proofErr w:type="spellStart"/>
-      <w:r>
-        <w:rPr>
-          <w:lang w:eastAsia="ru-RU"/>
-        </w:rPr>
-        <w:t>Event</w:t>
-      </w:r>
-      <w:proofErr w:type="spellEnd"/>
-      <w:r>
-        <w:rPr>
-          <w:lang w:eastAsia="ru-RU"/>
-        </w:rPr>
-        <w:t xml:space="preserve"> </w:t>
-      </w:r>
-      <w:proofErr w:type="spellStart"/>
-      <w:r>
-        <w:rPr>
-          <w:lang w:eastAsia="ru-RU"/>
-        </w:rPr>
-        <w:t>Storming</w:t>
-      </w:r>
-      <w:proofErr w:type="spellEnd"/>
-      <w:r>
-        <w:rPr>
-          <w:lang w:eastAsia="ru-RU"/>
-        </w:rPr>
-        <w:t xml:space="preserve"> с выявленными </w:t>
-      </w:r>
-      <w:r>
-        <w:rPr>
-          <w:lang w:eastAsia="ru-RU"/>
-        </w:rPr>
-        <w:t>а</w:t>
-      </w:r>
-      <w:r>
-        <w:rPr>
-          <w:lang w:eastAsia="ru-RU"/>
-        </w:rPr>
-        <w:t>г</w:t>
-      </w:r>
-      <w:r>
-        <w:rPr>
-          <w:lang w:eastAsia="ru-RU"/>
-        </w:rPr>
-        <w:t>регатами</w:t>
-      </w:r>
-      <w:r>
-        <w:rPr>
-          <w:lang w:eastAsia="ru-RU"/>
-        </w:rPr>
-        <w:t xml:space="preserve"> показана на Рис. </w:t>
-      </w:r>
-      <w:r>
-        <w:rPr>
-          <w:lang w:eastAsia="ru-RU"/>
-        </w:rPr>
-        <w:t>4</w:t>
-      </w:r>
-      <w:r>
-        <w:rPr>
-          <w:lang w:eastAsia="ru-RU"/>
-        </w:rPr>
-        <w:t>.</w:t>
+        <w:t xml:space="preserve"> отправлять сообщения в</w:t>
+      </w:r>
+      <w:r>
+        <w:rPr>
+          <w:lang w:eastAsia="ru-RU"/>
+        </w:rPr>
+        <w:t xml:space="preserve"> ИИ через чат.</w:t>
       </w:r>
     </w:p>
     <w:p>
@@ -8542,761 +8668,7 @@
           <w:noProof/>
           <w:lang w:eastAsia="ru-RU"/>
         </w:rPr>
-        <w:drawing>
-          <wp:inline distT="0" distB="0" distL="0" distR="0" wp14:anchorId="003E809F" wp14:editId="07226969">
-            <wp:extent cx="5702239" cy="2344616"/>
-            <wp:effectExtent l="0" t="0" r="0" b="0"/>
-            <wp:docPr id="12" name="Picture 12"/>
-            <wp:cNvGraphicFramePr>
-              <a:graphicFrameLocks xmlns:a="http://schemas.openxmlformats.org/drawingml/2006/main" noChangeAspect="1"/>
-            </wp:cNvGraphicFramePr>
-            <a:graphic xmlns:a="http://schemas.openxmlformats.org/drawingml/2006/main">
-              <a:graphicData uri="http://schemas.openxmlformats.org/drawingml/2006/picture">
-                <pic:pic xmlns:pic="http://schemas.openxmlformats.org/drawingml/2006/picture">
-                  <pic:nvPicPr>
-                    <pic:cNvPr id="12" name="Untitled.png"/>
-                    <pic:cNvPicPr/>
-                  </pic:nvPicPr>
-                  <pic:blipFill rotWithShape="1">
-                    <a:blip r:embed="rId13" cstate="print">
-                      <a:extLst>
-                        <a:ext uri="{28A0092B-C50C-407E-A947-70E740481C1C}">
-                          <a14:useLocalDpi xmlns:a14="http://schemas.microsoft.com/office/drawing/2010/main" val="0"/>
-                        </a:ext>
-                      </a:extLst>
-                    </a:blip>
-                    <a:srcRect t="53460"/>
-                    <a:stretch/>
-                  </pic:blipFill>
-                  <pic:spPr bwMode="auto">
-                    <a:xfrm>
-                      <a:off x="0" y="0"/>
-                      <a:ext cx="5713350" cy="2349185"/>
-                    </a:xfrm>
-                    <a:prstGeom prst="rect">
-                      <a:avLst/>
-                    </a:prstGeom>
-                    <a:ln>
-                      <a:noFill/>
-                    </a:ln>
-                    <a:extLst>
-                      <a:ext uri="{53640926-AAD7-44D8-BBD7-CCE9431645EC}">
-                        <a14:shadowObscured xmlns:a14="http://schemas.microsoft.com/office/drawing/2010/main"/>
-                      </a:ext>
-                    </a:extLst>
-                  </pic:spPr>
-                </pic:pic>
-              </a:graphicData>
-            </a:graphic>
-          </wp:inline>
-        </w:drawing>
-      </w:r>
-    </w:p>
-    <w:p>
-      <w:pPr>
-        <w:ind w:left="0" w:firstLine="720"/>
-        <w:jc w:val="center"/>
-        <w:rPr>
-          <w:lang w:eastAsia="ru-RU"/>
-        </w:rPr>
-      </w:pPr>
-      <w:r>
-        <w:rPr>
-          <w:lang w:eastAsia="ru-RU"/>
-        </w:rPr>
-        <w:t xml:space="preserve">Рисунок </w:t>
-      </w:r>
-      <w:r>
-        <w:rPr>
-          <w:lang w:eastAsia="ru-RU"/>
-        </w:rPr>
-        <w:t>4</w:t>
-      </w:r>
-      <w:r>
-        <w:rPr>
-          <w:lang w:eastAsia="ru-RU"/>
-        </w:rPr>
-        <w:t xml:space="preserve"> </w:t>
-      </w:r>
-      <w:r>
-        <w:rPr>
-          <w:lang w:eastAsia="ru-RU"/>
-        </w:rPr>
-        <w:t>–</w:t>
-      </w:r>
-      <w:r>
-        <w:rPr>
-          <w:lang w:eastAsia="ru-RU"/>
-        </w:rPr>
-        <w:t xml:space="preserve"> </w:t>
-      </w:r>
-      <w:r>
-        <w:rPr>
-          <w:lang w:eastAsia="ru-RU"/>
-        </w:rPr>
-        <w:t>Д</w:t>
-      </w:r>
-      <w:r>
-        <w:rPr>
-          <w:lang w:eastAsia="ru-RU"/>
-        </w:rPr>
-        <w:t>иаграмм</w:t>
-      </w:r>
-      <w:r>
-        <w:rPr>
-          <w:lang w:eastAsia="ru-RU"/>
-        </w:rPr>
-        <w:t>а</w:t>
-      </w:r>
-      <w:r>
-        <w:rPr>
-          <w:lang w:eastAsia="ru-RU"/>
-        </w:rPr>
-        <w:t xml:space="preserve"> </w:t>
-      </w:r>
-      <w:proofErr w:type="spellStart"/>
-      <w:r>
-        <w:rPr>
-          <w:lang w:eastAsia="ru-RU"/>
-        </w:rPr>
-        <w:t>Event</w:t>
-      </w:r>
-      <w:proofErr w:type="spellEnd"/>
-      <w:r>
-        <w:rPr>
-          <w:lang w:eastAsia="ru-RU"/>
-        </w:rPr>
-        <w:t xml:space="preserve"> </w:t>
-      </w:r>
-      <w:proofErr w:type="spellStart"/>
-      <w:r>
-        <w:rPr>
-          <w:lang w:eastAsia="ru-RU"/>
-        </w:rPr>
-        <w:t>Storming</w:t>
-      </w:r>
-      <w:proofErr w:type="spellEnd"/>
-      <w:r>
-        <w:rPr>
-          <w:lang w:eastAsia="ru-RU"/>
-        </w:rPr>
-        <w:t xml:space="preserve"> с выявленными </w:t>
-      </w:r>
-      <w:r>
-        <w:rPr>
-          <w:lang w:eastAsia="ru-RU"/>
-        </w:rPr>
-        <w:t>агрегатами</w:t>
-      </w:r>
-    </w:p>
-    <w:p>
-      <w:pPr>
-        <w:ind w:left="0" w:firstLine="720"/>
-        <w:jc w:val="center"/>
-        <w:rPr>
-          <w:lang w:eastAsia="ru-RU"/>
-        </w:rPr>
-      </w:pPr>
-    </w:p>
-    <w:p>
-      <w:pPr>
-        <w:ind w:left="0" w:firstLine="720"/>
-        <w:rPr>
-          <w:lang w:eastAsia="ru-RU"/>
-        </w:rPr>
-      </w:pPr>
-      <w:r>
-        <w:rPr>
-          <w:lang w:eastAsia="ru-RU"/>
-        </w:rPr>
-        <w:t xml:space="preserve">В рамках каждого агрегата выделены сущности и объекты-значения. Агрегат «Встреча» имеет корень </w:t>
-      </w:r>
-      <w:r>
-        <w:rPr>
-          <w:lang w:eastAsia="ru-RU"/>
-        </w:rPr>
-        <w:t>-</w:t>
-      </w:r>
-      <w:r>
-        <w:rPr>
-          <w:lang w:eastAsia="ru-RU"/>
-        </w:rPr>
-        <w:t xml:space="preserve"> сущность Встреча, которая обладает уникальным идентификатором (UUID) и управляет жизненным циклом связанных объектов. Объектом-значения является Статус обработки, так как его идентичность определяется исключительно значениями полей. Агрегат «Транскрипция» включает сущность Аудиофрагмент (с порядковым номером </w:t>
-      </w:r>
-      <w:proofErr w:type="spellStart"/>
-      <w:r>
-        <w:rPr>
-          <w:lang w:eastAsia="ru-RU"/>
-        </w:rPr>
-        <w:t>ord</w:t>
-      </w:r>
-      <w:proofErr w:type="spellEnd"/>
-      <w:r>
-        <w:rPr>
-          <w:lang w:eastAsia="ru-RU"/>
-        </w:rPr>
-        <w:t xml:space="preserve"> и признаком завершения </w:t>
-      </w:r>
-      <w:proofErr w:type="spellStart"/>
-      <w:r>
-        <w:rPr>
-          <w:lang w:eastAsia="ru-RU"/>
-        </w:rPr>
-        <w:t>isLast</w:t>
-      </w:r>
-      <w:proofErr w:type="spellEnd"/>
-      <w:r>
-        <w:rPr>
-          <w:lang w:eastAsia="ru-RU"/>
-        </w:rPr>
-        <w:t xml:space="preserve">) и объект-значение Текстовый фрагмент. Агрегат «Суммаризация» содержит сущности Чат и Сообщение, где </w:t>
-      </w:r>
-      <w:r>
-        <w:rPr>
-          <w:lang w:eastAsia="ru-RU"/>
-        </w:rPr>
         <w:lastRenderedPageBreak/>
-        <w:t>Сообщение является объектом-значением, так как его смысл определяется только текстом и ролью отправителя (пользователь/система).</w:t>
-      </w:r>
-    </w:p>
-    <w:p>
-      <w:pPr>
-        <w:ind w:left="0" w:firstLine="720"/>
-        <w:rPr>
-          <w:lang w:eastAsia="ru-RU"/>
-        </w:rPr>
-      </w:pPr>
-      <w:r>
-        <w:rPr>
-          <w:lang w:eastAsia="ru-RU"/>
-        </w:rPr>
-        <w:t>Особое внимание в модели уделено управлению данными. Правило</w:t>
-      </w:r>
-      <w:r>
-        <w:rPr>
-          <w:lang w:eastAsia="ru-RU"/>
-        </w:rPr>
-        <w:t xml:space="preserve">, что </w:t>
-      </w:r>
-      <w:r>
-        <w:rPr>
-          <w:lang w:eastAsia="ru-RU"/>
-        </w:rPr>
-        <w:t>все временные артефакты удаляются через 3 часа после завершения встречи</w:t>
-      </w:r>
-      <w:r>
-        <w:rPr>
-          <w:lang w:eastAsia="ru-RU"/>
-        </w:rPr>
-        <w:t xml:space="preserve"> оформлено</w:t>
-      </w:r>
-      <w:r>
-        <w:rPr>
-          <w:lang w:eastAsia="ru-RU"/>
-        </w:rPr>
-        <w:t xml:space="preserve"> как доменное событие «Временные данные удалены», которое инициируется таймером и приводит к выполнению команды «Удаление метаданных».</w:t>
-      </w:r>
-      <w:r>
-        <w:rPr>
-          <w:lang w:eastAsia="ru-RU"/>
-        </w:rPr>
-        <w:t xml:space="preserve"> Диаграмма </w:t>
-      </w:r>
-      <w:r>
-        <w:rPr>
-          <w:lang w:val="en-US" w:eastAsia="ru-RU"/>
-        </w:rPr>
-        <w:t>Event Storming п</w:t>
-      </w:r>
-      <w:r>
-        <w:rPr>
-          <w:lang w:eastAsia="ru-RU"/>
-        </w:rPr>
-        <w:t xml:space="preserve">оказана на рисунке </w:t>
-      </w:r>
-      <w:r>
-        <w:rPr>
-          <w:lang w:eastAsia="ru-RU"/>
-        </w:rPr>
-        <w:t>5</w:t>
-      </w:r>
-      <w:r>
-        <w:rPr>
-          <w:lang w:eastAsia="ru-RU"/>
-        </w:rPr>
-        <w:t>.</w:t>
-      </w:r>
-    </w:p>
-    <w:p>
-      <w:pPr>
-        <w:ind w:left="0" w:firstLine="720"/>
-        <w:jc w:val="center"/>
-        <w:rPr>
-          <w:lang w:eastAsia="ru-RU"/>
-        </w:rPr>
-      </w:pPr>
-      <w:r>
-        <w:rPr>
-          <w:noProof/>
-          <w:lang w:eastAsia="ru-RU"/>
-        </w:rPr>
-        <w:drawing>
-          <wp:inline distT="0" distB="0" distL="0" distR="0" wp14:anchorId="7DA681D3" wp14:editId="7638FB11">
-            <wp:extent cx="5940425" cy="2782277"/>
-            <wp:effectExtent l="0" t="0" r="0" b="0"/>
-            <wp:docPr id="11" name="Picture 11"/>
-            <wp:cNvGraphicFramePr>
-              <a:graphicFrameLocks xmlns:a="http://schemas.openxmlformats.org/drawingml/2006/main" noChangeAspect="1"/>
-            </wp:cNvGraphicFramePr>
-            <a:graphic xmlns:a="http://schemas.openxmlformats.org/drawingml/2006/main">
-              <a:graphicData uri="http://schemas.openxmlformats.org/drawingml/2006/picture">
-                <pic:pic xmlns:pic="http://schemas.openxmlformats.org/drawingml/2006/picture">
-                  <pic:nvPicPr>
-                    <pic:cNvPr id="11" name="Untitled.png"/>
-                    <pic:cNvPicPr/>
-                  </pic:nvPicPr>
-                  <pic:blipFill rotWithShape="1">
-                    <a:blip r:embed="rId14" cstate="print">
-                      <a:extLst>
-                        <a:ext uri="{28A0092B-C50C-407E-A947-70E740481C1C}">
-                          <a14:useLocalDpi xmlns:a14="http://schemas.microsoft.com/office/drawing/2010/main" val="0"/>
-                        </a:ext>
-                      </a:extLst>
-                    </a:blip>
-                    <a:srcRect b="46987"/>
-                    <a:stretch/>
-                  </pic:blipFill>
-                  <pic:spPr bwMode="auto">
-                    <a:xfrm>
-                      <a:off x="0" y="0"/>
-                      <a:ext cx="5940425" cy="2782277"/>
-                    </a:xfrm>
-                    <a:prstGeom prst="rect">
-                      <a:avLst/>
-                    </a:prstGeom>
-                    <a:ln>
-                      <a:noFill/>
-                    </a:ln>
-                    <a:extLst>
-                      <a:ext uri="{53640926-AAD7-44D8-BBD7-CCE9431645EC}">
-                        <a14:shadowObscured xmlns:a14="http://schemas.microsoft.com/office/drawing/2010/main"/>
-                      </a:ext>
-                    </a:extLst>
-                  </pic:spPr>
-                </pic:pic>
-              </a:graphicData>
-            </a:graphic>
-          </wp:inline>
-        </w:drawing>
-      </w:r>
-    </w:p>
-    <w:p>
-      <w:pPr>
-        <w:ind w:left="0" w:firstLine="720"/>
-        <w:jc w:val="center"/>
-        <w:rPr>
-          <w:rFonts w:cs="Times New Roman"/>
-          <w:szCs w:val="28"/>
-          <w:lang w:val="en-US"/>
-        </w:rPr>
-      </w:pPr>
-      <w:r>
-        <w:rPr>
-          <w:lang w:eastAsia="ru-RU"/>
-        </w:rPr>
-        <w:t xml:space="preserve">Рисунок </w:t>
-      </w:r>
-      <w:r>
-        <w:rPr>
-          <w:lang w:eastAsia="ru-RU"/>
-        </w:rPr>
-        <w:t>5</w:t>
-      </w:r>
-      <w:r>
-        <w:rPr>
-          <w:lang w:eastAsia="ru-RU"/>
-        </w:rPr>
-        <w:t xml:space="preserve"> - </w:t>
-      </w:r>
-      <w:r>
-        <w:rPr>
-          <w:rFonts w:cs="Times New Roman"/>
-          <w:szCs w:val="28"/>
-        </w:rPr>
-        <w:t xml:space="preserve">Диаграмма </w:t>
-      </w:r>
-      <w:r>
-        <w:rPr>
-          <w:rFonts w:cs="Times New Roman"/>
-          <w:szCs w:val="28"/>
-          <w:lang w:val="en-US"/>
-        </w:rPr>
-        <w:t>Event</w:t>
-      </w:r>
-      <w:r>
-        <w:rPr>
-          <w:rFonts w:cs="Times New Roman"/>
-          <w:szCs w:val="28"/>
-        </w:rPr>
-        <w:t xml:space="preserve"> </w:t>
-      </w:r>
-      <w:r>
-        <w:rPr>
-          <w:rFonts w:cs="Times New Roman"/>
-          <w:szCs w:val="28"/>
-          <w:lang w:val="en-US"/>
-        </w:rPr>
-        <w:t>Storming</w:t>
-      </w:r>
-    </w:p>
-    <w:p>
-      <w:pPr>
-        <w:ind w:left="0"/>
-        <w:rPr>
-          <w:lang w:eastAsia="ru-RU"/>
-        </w:rPr>
-      </w:pPr>
-    </w:p>
-    <w:p>
-      <w:pPr>
-        <w:ind w:left="0" w:firstLine="720"/>
-        <w:rPr>
-          <w:lang w:eastAsia="ru-RU"/>
-        </w:rPr>
-      </w:pPr>
-      <w:r>
-        <w:rPr>
-          <w:lang w:eastAsia="ru-RU"/>
-        </w:rPr>
-        <w:t xml:space="preserve">Для фиксации функциональных границ системы построена диаграмма вариантов использования. Основным актором </w:t>
-      </w:r>
-      <w:r>
-        <w:rPr>
-          <w:lang w:eastAsia="ru-RU"/>
-        </w:rPr>
-        <w:t>является</w:t>
-      </w:r>
-      <w:r>
-        <w:rPr>
-          <w:lang w:eastAsia="ru-RU"/>
-        </w:rPr>
-        <w:t xml:space="preserve"> </w:t>
-      </w:r>
-      <w:r>
-        <w:rPr>
-          <w:lang w:eastAsia="ru-RU"/>
-        </w:rPr>
-        <w:t>п</w:t>
-      </w:r>
-      <w:r>
-        <w:rPr>
-          <w:lang w:eastAsia="ru-RU"/>
-        </w:rPr>
-        <w:t>ользователь, который взаимодействует с системой через ключевые сценарии:</w:t>
-      </w:r>
-    </w:p>
-    <w:p>
-      <w:pPr>
-        <w:pStyle w:val="ListParagraph"/>
-        <w:numPr>
-          <w:ilvl w:val="0"/>
-          <w:numId w:val="12"/>
-        </w:numPr>
-        <w:ind w:left="0" w:firstLine="720"/>
-        <w:rPr>
-          <w:lang w:eastAsia="ru-RU"/>
-        </w:rPr>
-      </w:pPr>
-      <w:r>
-        <w:rPr>
-          <w:lang w:eastAsia="ru-RU"/>
-        </w:rPr>
-        <w:t xml:space="preserve"> </w:t>
-      </w:r>
-      <w:r>
-        <w:rPr>
-          <w:lang w:eastAsia="ru-RU"/>
-        </w:rPr>
-        <w:t>Создать</w:t>
-      </w:r>
-      <w:r>
-        <w:rPr>
-          <w:lang w:eastAsia="ru-RU"/>
-        </w:rPr>
-        <w:t xml:space="preserve"> встречу</w:t>
-      </w:r>
-      <w:r>
-        <w:rPr>
-          <w:lang w:eastAsia="ru-RU"/>
-        </w:rPr>
-        <w:t xml:space="preserve"> - </w:t>
-      </w:r>
-      <w:r>
-        <w:rPr>
-          <w:lang w:eastAsia="ru-RU"/>
-        </w:rPr>
-        <w:t xml:space="preserve">выбор: запуск записи через микрофон или загрузка </w:t>
-      </w:r>
-      <w:r>
-        <w:rPr>
-          <w:lang w:eastAsia="ru-RU"/>
-        </w:rPr>
-        <w:t xml:space="preserve">целого </w:t>
-      </w:r>
-      <w:r>
-        <w:rPr>
-          <w:lang w:eastAsia="ru-RU"/>
-        </w:rPr>
-        <w:t>аудиофайла;</w:t>
-      </w:r>
-    </w:p>
-    <w:p>
-      <w:pPr>
-        <w:pStyle w:val="ListParagraph"/>
-        <w:numPr>
-          <w:ilvl w:val="0"/>
-          <w:numId w:val="11"/>
-        </w:numPr>
-        <w:ind w:left="0" w:firstLine="720"/>
-        <w:rPr>
-          <w:lang w:eastAsia="ru-RU"/>
-        </w:rPr>
-      </w:pPr>
-      <w:r>
-        <w:rPr>
-          <w:lang w:eastAsia="ru-RU"/>
-        </w:rPr>
-        <w:t xml:space="preserve"> </w:t>
-      </w:r>
-      <w:r>
-        <w:rPr>
-          <w:lang w:eastAsia="ru-RU"/>
-        </w:rPr>
-        <w:t xml:space="preserve">Получить </w:t>
-      </w:r>
-      <w:r>
-        <w:rPr>
-          <w:lang w:eastAsia="ru-RU"/>
-        </w:rPr>
-        <w:t>суммаризацию</w:t>
-      </w:r>
-      <w:r>
-        <w:rPr>
-          <w:lang w:eastAsia="ru-RU"/>
-        </w:rPr>
-        <w:t xml:space="preserve"> </w:t>
-      </w:r>
-      <w:r>
-        <w:rPr>
-          <w:lang w:eastAsia="ru-RU"/>
-        </w:rPr>
-        <w:t>-</w:t>
-      </w:r>
-      <w:r>
-        <w:rPr>
-          <w:lang w:eastAsia="ru-RU"/>
-        </w:rPr>
-        <w:t xml:space="preserve"> </w:t>
-      </w:r>
-      <w:r>
-        <w:rPr>
-          <w:lang w:eastAsia="ru-RU"/>
-        </w:rPr>
-        <w:t xml:space="preserve">просмотр автоматически сгенерированных </w:t>
-      </w:r>
-      <w:r>
-        <w:rPr>
-          <w:lang w:eastAsia="ru-RU"/>
-        </w:rPr>
-        <w:t>шаблонов</w:t>
-      </w:r>
-      <w:r>
-        <w:rPr>
-          <w:lang w:eastAsia="ru-RU"/>
-        </w:rPr>
-        <w:t>;</w:t>
-      </w:r>
-    </w:p>
-    <w:p>
-      <w:pPr>
-        <w:pStyle w:val="ListParagraph"/>
-        <w:numPr>
-          <w:ilvl w:val="0"/>
-          <w:numId w:val="11"/>
-        </w:numPr>
-        <w:ind w:left="0" w:firstLine="720"/>
-        <w:rPr>
-          <w:lang w:eastAsia="ru-RU"/>
-        </w:rPr>
-      </w:pPr>
-      <w:r>
-        <w:rPr>
-          <w:lang w:eastAsia="ru-RU"/>
-        </w:rPr>
-        <w:t xml:space="preserve"> </w:t>
-      </w:r>
-      <w:r>
-        <w:rPr>
-          <w:lang w:eastAsia="ru-RU"/>
-        </w:rPr>
-        <w:t>Отправить</w:t>
-      </w:r>
-      <w:r>
-        <w:rPr>
-          <w:lang w:eastAsia="ru-RU"/>
-        </w:rPr>
-        <w:t xml:space="preserve"> </w:t>
-      </w:r>
-      <w:r>
-        <w:rPr>
-          <w:lang w:eastAsia="ru-RU"/>
-        </w:rPr>
-        <w:t>сообщение в</w:t>
-      </w:r>
-      <w:r>
-        <w:rPr>
-          <w:lang w:eastAsia="ru-RU"/>
-        </w:rPr>
-        <w:t xml:space="preserve"> чат </w:t>
-      </w:r>
-      <w:r>
-        <w:rPr>
-          <w:lang w:eastAsia="ru-RU"/>
-        </w:rPr>
-        <w:t>-</w:t>
-      </w:r>
-      <w:r>
-        <w:rPr>
-          <w:lang w:eastAsia="ru-RU"/>
-        </w:rPr>
-        <w:t xml:space="preserve"> </w:t>
-      </w:r>
-      <w:r>
-        <w:rPr>
-          <w:lang w:eastAsia="ru-RU"/>
-        </w:rPr>
-        <w:t xml:space="preserve">задание вопросов по содержанию встречи с </w:t>
-      </w:r>
-      <w:r>
-        <w:rPr>
-          <w:lang w:eastAsia="ru-RU"/>
-        </w:rPr>
-        <w:t>выводом ответов от модели ИИ в стриминговом формате</w:t>
-      </w:r>
-      <w:r>
-        <w:rPr>
-          <w:lang w:eastAsia="ru-RU"/>
-        </w:rPr>
-        <w:t>;</w:t>
-      </w:r>
-    </w:p>
-    <w:p>
-      <w:pPr>
-        <w:pStyle w:val="ListParagraph"/>
-        <w:numPr>
-          <w:ilvl w:val="0"/>
-          <w:numId w:val="11"/>
-        </w:numPr>
-        <w:ind w:left="0" w:firstLine="720"/>
-        <w:rPr>
-          <w:lang w:eastAsia="ru-RU"/>
-        </w:rPr>
-      </w:pPr>
-      <w:r>
-        <w:rPr>
-          <w:lang w:eastAsia="ru-RU"/>
-        </w:rPr>
-        <w:t xml:space="preserve"> </w:t>
-      </w:r>
-      <w:r>
-        <w:rPr>
-          <w:lang w:eastAsia="ru-RU"/>
-        </w:rPr>
-        <w:t>Просмотр список встреч</w:t>
-      </w:r>
-      <w:r>
-        <w:rPr>
-          <w:lang w:eastAsia="ru-RU"/>
-        </w:rPr>
-        <w:t xml:space="preserve"> </w:t>
-      </w:r>
-      <w:r>
-        <w:rPr>
-          <w:lang w:eastAsia="ru-RU"/>
-        </w:rPr>
-        <w:t>-</w:t>
-      </w:r>
-      <w:r>
-        <w:rPr>
-          <w:lang w:eastAsia="ru-RU"/>
-        </w:rPr>
-        <w:t xml:space="preserve"> </w:t>
-      </w:r>
-      <w:r>
-        <w:rPr>
-          <w:lang w:eastAsia="ru-RU"/>
-        </w:rPr>
-        <w:t xml:space="preserve">просмотр </w:t>
-      </w:r>
-      <w:r>
-        <w:rPr>
-          <w:lang w:eastAsia="ru-RU"/>
-        </w:rPr>
-        <w:t>всех встреч в списке.</w:t>
-      </w:r>
-    </w:p>
-    <w:p>
-      <w:pPr>
-        <w:ind w:left="0" w:firstLine="720"/>
-        <w:rPr>
-          <w:lang w:eastAsia="ru-RU"/>
-        </w:rPr>
-      </w:pPr>
-      <w:r>
-        <w:rPr>
-          <w:lang w:eastAsia="ru-RU"/>
-        </w:rPr>
-        <w:lastRenderedPageBreak/>
-        <w:t xml:space="preserve">Диаграмма использования </w:t>
-      </w:r>
-      <w:r>
-        <w:rPr>
-          <w:lang w:eastAsia="ru-RU"/>
-        </w:rPr>
-        <w:t xml:space="preserve">для актора пользователь </w:t>
-      </w:r>
-      <w:r>
-        <w:rPr>
-          <w:lang w:eastAsia="ru-RU"/>
-        </w:rPr>
-        <w:t xml:space="preserve">изображена на рисунке </w:t>
-      </w:r>
-      <w:r>
-        <w:rPr>
-          <w:lang w:eastAsia="ru-RU"/>
-        </w:rPr>
-        <w:t>6</w:t>
-      </w:r>
-      <w:r>
-        <w:rPr>
-          <w:lang w:eastAsia="ru-RU"/>
-        </w:rPr>
-        <w:t>.</w:t>
-      </w:r>
-    </w:p>
-    <w:p>
-      <w:pPr>
-        <w:ind w:left="0" w:firstLine="720"/>
-        <w:jc w:val="center"/>
-        <w:rPr>
-          <w:lang w:eastAsia="ru-RU"/>
-        </w:rPr>
-      </w:pPr>
-      <w:r>
-        <w:rPr>
-          <w:noProof/>
-          <w:lang w:eastAsia="ru-RU"/>
-        </w:rPr>
         <w:drawing>
           <wp:inline distT="0" distB="0" distL="0" distR="0" wp14:anchorId="197A96BF" wp14:editId="4D5CB4EA">
             <wp:extent cx="5236936" cy="3444293"/>
@@ -9313,7 +8685,7 @@
                     <pic:cNvPicPr/>
                   </pic:nvPicPr>
                   <pic:blipFill>
-                    <a:blip r:embed="rId15">
+                    <a:blip r:embed="rId13">
                       <a:extLst>
                         <a:ext uri="{28A0092B-C50C-407E-A947-70E740481C1C}">
                           <a14:useLocalDpi xmlns:a14="http://schemas.microsoft.com/office/drawing/2010/main" val="0"/>
@@ -9386,7 +8758,31 @@
         <w:rPr>
           <w:lang w:eastAsia="ru-RU"/>
         </w:rPr>
-        <w:t xml:space="preserve">Диаграмма классов концептуального уровня отражает связи между ключевыми сущностями предметной области, которые соответствуют агрегатам системы. Основная сущность – это </w:t>
+        <w:t xml:space="preserve">Диаграмма классов </w:t>
+      </w:r>
+      <w:r>
+        <w:rPr>
+          <w:lang w:eastAsia="ru-RU"/>
+        </w:rPr>
+        <w:t xml:space="preserve">на </w:t>
+      </w:r>
+      <w:r>
+        <w:rPr>
+          <w:lang w:eastAsia="ru-RU"/>
+        </w:rPr>
+        <w:t>рисунк</w:t>
+      </w:r>
+      <w:r>
+        <w:rPr>
+          <w:lang w:eastAsia="ru-RU"/>
+        </w:rPr>
+        <w:t>е</w:t>
+      </w:r>
+      <w:r>
+        <w:rPr>
+          <w:lang w:eastAsia="ru-RU"/>
+        </w:rPr>
+        <w:t xml:space="preserve"> 7 отражает связи между сущностями: </w:t>
       </w:r>
       <w:proofErr w:type="spellStart"/>
       <w:r>
@@ -9400,160 +8796,155 @@
         <w:rPr>
           <w:lang w:eastAsia="ru-RU"/>
         </w:rPr>
-        <w:t>, которая инкапсулирует данные встречи, список участников и коллекцию чатов. Статус встречи является перечислением (</w:t>
+        <w:t xml:space="preserve">, </w:t>
       </w:r>
       <w:proofErr w:type="spellStart"/>
       <w:r>
         <w:rPr>
           <w:lang w:eastAsia="ru-RU"/>
         </w:rPr>
-        <w:t>MeetingStatus</w:t>
+        <w:t>Chat</w:t>
       </w:r>
       <w:proofErr w:type="spellEnd"/>
       <w:r>
         <w:rPr>
           <w:lang w:eastAsia="ru-RU"/>
         </w:rPr>
-        <w:t xml:space="preserve">) со значениями: NEW, END, PROCESSED, ARCHIVED. Связь между встречей и пользователями реализована через вспомогательную сущность </w:t>
+        <w:t xml:space="preserve">, </w:t>
       </w:r>
       <w:proofErr w:type="spellStart"/>
       <w:r>
         <w:rPr>
           <w:lang w:eastAsia="ru-RU"/>
         </w:rPr>
-        <w:t>Participants</w:t>
+        <w:t>Participant</w:t>
       </w:r>
       <w:proofErr w:type="spellEnd"/>
       <w:r>
         <w:rPr>
           <w:lang w:eastAsia="ru-RU"/>
         </w:rPr>
-        <w:t xml:space="preserve">. Каждая запись в </w:t>
+        <w:t xml:space="preserve">. Сущность </w:t>
       </w:r>
       <w:proofErr w:type="spellStart"/>
       <w:r>
         <w:rPr>
           <w:lang w:eastAsia="ru-RU"/>
         </w:rPr>
-        <w:t>Participants</w:t>
+        <w:t>Meeting</w:t>
       </w:r>
       <w:proofErr w:type="spellEnd"/>
       <w:r>
         <w:rPr>
           <w:lang w:eastAsia="ru-RU"/>
         </w:rPr>
-        <w:t xml:space="preserve"> содержит идентификатор встречи и пользователя и флаг наличия голоса пользователя в БД.</w:t>
-      </w:r>
-    </w:p>
-    <w:p>
-      <w:pPr>
-        <w:ind w:left="0" w:firstLine="720"/>
-        <w:rPr>
-          <w:lang w:eastAsia="ru-RU"/>
-        </w:rPr>
-      </w:pPr>
-      <w:r>
-        <w:rPr>
-          <w:lang w:eastAsia="ru-RU"/>
-        </w:rPr>
-        <w:t xml:space="preserve">Сущность </w:t>
+        <w:t xml:space="preserve"> содержит </w:t>
+      </w:r>
+      <w:r>
+        <w:rPr>
+          <w:lang w:eastAsia="ru-RU"/>
+        </w:rPr>
+        <w:t>данные</w:t>
+      </w:r>
+      <w:r>
+        <w:rPr>
+          <w:lang w:eastAsia="ru-RU"/>
+        </w:rPr>
+        <w:t xml:space="preserve"> встречи и ссылки на связанные чаты. Атрибут </w:t>
       </w:r>
       <w:proofErr w:type="spellStart"/>
       <w:r>
         <w:rPr>
           <w:lang w:eastAsia="ru-RU"/>
         </w:rPr>
-        <w:t>Chat</w:t>
+        <w:t>Meeting</w:t>
       </w:r>
       <w:proofErr w:type="spellEnd"/>
       <w:r>
         <w:rPr>
-          <w:lang w:eastAsia="ru-RU"/>
-        </w:rPr>
-        <w:t xml:space="preserve"> содержит имя чата, дату создания и сообщения в формате JSONB</w:t>
-      </w:r>
-      <w:r>
-        <w:rPr>
-          <w:lang w:eastAsia="ru-RU"/>
-        </w:rPr>
-        <w:t xml:space="preserve">, </w:t>
-      </w:r>
-      <w:r>
-        <w:rPr>
-          <w:lang w:eastAsia="ru-RU"/>
-        </w:rPr>
-        <w:t xml:space="preserve">что </w:t>
-      </w:r>
-      <w:r>
-        <w:rPr>
-          <w:lang w:eastAsia="ru-RU"/>
-        </w:rPr>
-        <w:t>позволяет быстро извлекать данные чата для передачи с запросом в модель ИИ</w:t>
-      </w:r>
-      <w:r>
-        <w:rPr>
-          <w:lang w:eastAsia="ru-RU"/>
-        </w:rPr>
-        <w:t xml:space="preserve">. </w:t>
-      </w:r>
-    </w:p>
-    <w:p>
-      <w:pPr>
-        <w:ind w:left="0" w:firstLine="720"/>
-        <w:rPr>
-          <w:lang w:eastAsia="ru-RU"/>
-        </w:rPr>
-      </w:pPr>
-      <w:r>
-        <w:rPr>
-          <w:lang w:eastAsia="ru-RU"/>
-        </w:rPr>
-        <w:t xml:space="preserve">Все сущности объединены в рамках агрегата «Встреча», где </w:t>
+          <w:lang w:val="en-US" w:eastAsia="ru-RU"/>
+        </w:rPr>
+        <w:t>Status</w:t>
+      </w:r>
+      <w:r>
+        <w:rPr>
+          <w:lang w:eastAsia="ru-RU"/>
+        </w:rPr>
+        <w:t xml:space="preserve"> реализован как перечисление (NEW, END, PROCESSED, ARCHIVED) и отражает текущее состояние обработки</w:t>
+      </w:r>
+      <w:r>
+        <w:rPr>
+          <w:lang w:eastAsia="ru-RU"/>
+        </w:rPr>
+        <w:t xml:space="preserve"> встречи</w:t>
+      </w:r>
+      <w:r>
+        <w:rPr>
+          <w:lang w:eastAsia="ru-RU"/>
+        </w:rPr>
+        <w:t>. Сообщения в чатах хранятся в поле</w:t>
+      </w:r>
+      <w:r>
+        <w:rPr>
+          <w:lang w:eastAsia="ru-RU"/>
+        </w:rPr>
+        <w:t xml:space="preserve"> m</w:t>
       </w:r>
       <w:proofErr w:type="spellStart"/>
       <w:r>
         <w:rPr>
-          <w:lang w:eastAsia="ru-RU"/>
-        </w:rPr>
-        <w:t>Meeting</w:t>
+          <w:lang w:val="en-US" w:eastAsia="ru-RU"/>
+        </w:rPr>
+        <w:t>essages</w:t>
       </w:r>
       <w:proofErr w:type="spellEnd"/>
       <w:r>
         <w:rPr>
           <w:lang w:eastAsia="ru-RU"/>
         </w:rPr>
-        <w:t xml:space="preserve"> выступает корнем агрегации. Это гарантирует целостность данных: при </w:t>
-      </w:r>
-      <w:r>
-        <w:rPr>
-          <w:lang w:eastAsia="ru-RU"/>
-        </w:rPr>
-        <w:lastRenderedPageBreak/>
-        <w:t xml:space="preserve">удалении встречи автоматически удаляются все связанные чаты, а операции с </w:t>
-      </w:r>
-      <w:r>
-        <w:rPr>
-          <w:lang w:eastAsia="ru-RU"/>
-        </w:rPr>
-        <w:t>аудиофайлами</w:t>
-      </w:r>
-      <w:r>
-        <w:rPr>
-          <w:lang w:eastAsia="ru-RU"/>
-        </w:rPr>
-        <w:t xml:space="preserve"> и транскрипцией не влияют на статическую модель предметной области. Диаграмма классов представлена на рисунке </w:t>
-      </w:r>
-      <w:r>
-        <w:rPr>
-          <w:lang w:eastAsia="ru-RU"/>
-        </w:rPr>
-        <w:t>7</w:t>
-      </w:r>
-      <w:r>
-        <w:rPr>
-          <w:lang w:eastAsia="ru-RU"/>
-        </w:rPr>
-        <w:t>.</w:t>
+        <w:t xml:space="preserve"> типа</w:t>
+      </w:r>
+      <w:r>
+        <w:rPr>
+          <w:lang w:eastAsia="ru-RU"/>
+        </w:rPr>
+        <w:t xml:space="preserve"> JSONB, что позволяет эффективно </w:t>
+      </w:r>
+      <w:r>
+        <w:rPr>
+          <w:lang w:eastAsia="ru-RU"/>
+        </w:rPr>
+        <w:t>хранить</w:t>
+      </w:r>
+      <w:r>
+        <w:rPr>
+          <w:lang w:eastAsia="ru-RU"/>
+        </w:rPr>
+        <w:t xml:space="preserve"> и </w:t>
+      </w:r>
+      <w:r>
+        <w:rPr>
+          <w:lang w:eastAsia="ru-RU"/>
+        </w:rPr>
+        <w:t>использовать</w:t>
+      </w:r>
+      <w:r>
+        <w:rPr>
+          <w:lang w:eastAsia="ru-RU"/>
+        </w:rPr>
+        <w:t xml:space="preserve"> диалоги при запросах к ИИ</w:t>
+      </w:r>
+      <w:r>
+        <w:rPr>
+          <w:lang w:eastAsia="ru-RU"/>
+        </w:rPr>
+        <w:t xml:space="preserve"> </w:t>
+      </w:r>
+      <w:r>
+        <w:rPr>
+          <w:lang w:eastAsia="ru-RU"/>
+        </w:rPr>
+        <w:t>модели.</w:t>
       </w:r>
     </w:p>
     <w:p>
@@ -9569,10 +8960,11 @@
           <w:noProof/>
           <w:lang w:val="en-US" w:eastAsia="ru-RU"/>
         </w:rPr>
+        <w:lastRenderedPageBreak/>
         <w:drawing>
-          <wp:inline distT="0" distB="0" distL="0" distR="0" wp14:anchorId="388423A8" wp14:editId="558CF686">
-            <wp:extent cx="5591175" cy="3617819"/>
-            <wp:effectExtent l="0" t="0" r="0" b="1905"/>
+          <wp:inline distT="0" distB="0" distL="0" distR="0" wp14:anchorId="388423A8" wp14:editId="0F455E5B">
+            <wp:extent cx="5667740" cy="3667362"/>
+            <wp:effectExtent l="0" t="0" r="0" b="3175"/>
             <wp:docPr id="6" name="Picture 6"/>
             <wp:cNvGraphicFramePr>
               <a:graphicFrameLocks xmlns:a="http://schemas.openxmlformats.org/drawingml/2006/main" noChangeAspect="1"/>
@@ -9585,7 +8977,7 @@
                     <pic:cNvPicPr/>
                   </pic:nvPicPr>
                   <pic:blipFill rotWithShape="1">
-                    <a:blip r:embed="rId16">
+                    <a:blip r:embed="rId14">
                       <a:extLst>
                         <a:ext uri="{28A0092B-C50C-407E-A947-70E740481C1C}">
                           <a14:useLocalDpi xmlns:a14="http://schemas.microsoft.com/office/drawing/2010/main" val="0"/>
@@ -9598,7 +8990,7 @@
                   <pic:spPr bwMode="auto">
                     <a:xfrm>
                       <a:off x="0" y="0"/>
-                      <a:ext cx="5603994" cy="3626114"/>
+                      <a:ext cx="5687433" cy="3680105"/>
                     </a:xfrm>
                     <a:prstGeom prst="rect">
                       <a:avLst/>
@@ -9670,49 +9062,53 @@
         <w:rPr>
           <w:lang w:eastAsia="ru-RU"/>
         </w:rPr>
-        <w:t xml:space="preserve">Таким образом, концептуальная модель </w:t>
-      </w:r>
-      <w:r>
-        <w:rPr>
-          <w:lang w:eastAsia="ru-RU"/>
-        </w:rPr>
-        <w:t>описывает</w:t>
-      </w:r>
-      <w:r>
-        <w:rPr>
-          <w:lang w:eastAsia="ru-RU"/>
-        </w:rPr>
-        <w:t xml:space="preserve"> систему как инструмент поддержки деловой коммуникации, где сложные процессы ИИ</w:t>
-      </w:r>
-      <w:r>
-        <w:rPr>
-          <w:lang w:eastAsia="ru-RU"/>
-        </w:rPr>
-        <w:t>-</w:t>
-      </w:r>
-      <w:r>
-        <w:rPr>
-          <w:lang w:eastAsia="ru-RU"/>
-        </w:rPr>
-        <w:t>обработки скрыты за простыми пользовательскими действиями. Модель обеспечивает четкое разделение ответственности между доменными компонентами, сохраняя фокус на бизнес-ценности: точной фиксации решений, автоматическом структурировании информации и защите конфиденциальности неформальн</w:t>
-      </w:r>
-      <w:r>
-        <w:rPr>
-          <w:lang w:eastAsia="ru-RU"/>
-        </w:rPr>
-        <w:t xml:space="preserve">ого </w:t>
-      </w:r>
-      <w:r>
-        <w:rPr>
-          <w:lang w:eastAsia="ru-RU"/>
-        </w:rPr>
-        <w:t xml:space="preserve">общения. Полученные результаты определяют функциональные и структурные требования </w:t>
-      </w:r>
-      <w:r>
-        <w:rPr>
-          <w:lang w:eastAsia="ru-RU"/>
-        </w:rPr>
-        <w:t>для дальнейшего проектирования системы.</w:t>
+        <w:t>Итак</w:t>
+      </w:r>
+      <w:r>
+        <w:rPr>
+          <w:lang w:eastAsia="ru-RU"/>
+        </w:rPr>
+        <w:t xml:space="preserve">, концептуальная модель фокусируется на практической стороне предметной области, избегая излишней формализации. Она </w:t>
+      </w:r>
+      <w:r>
+        <w:rPr>
+          <w:lang w:eastAsia="ru-RU"/>
+        </w:rPr>
+        <w:t>является</w:t>
+      </w:r>
+      <w:r>
+        <w:rPr>
+          <w:lang w:eastAsia="ru-RU"/>
+        </w:rPr>
+        <w:t xml:space="preserve"> основой для проектирования логической архитектуры и базы данных, обеспечивая соответствие функциональным требованиям без привязки к сложным архитектурным паттернам, таким как </w:t>
+      </w:r>
+      <w:proofErr w:type="spellStart"/>
+      <w:r>
+        <w:rPr>
+          <w:lang w:eastAsia="ru-RU"/>
+        </w:rPr>
+        <w:t>Domain-Driven</w:t>
+      </w:r>
+      <w:proofErr w:type="spellEnd"/>
+      <w:r>
+        <w:rPr>
+          <w:lang w:eastAsia="ru-RU"/>
+        </w:rPr>
+        <w:t xml:space="preserve"> </w:t>
+      </w:r>
+      <w:proofErr w:type="spellStart"/>
+      <w:r>
+        <w:rPr>
+          <w:lang w:eastAsia="ru-RU"/>
+        </w:rPr>
+        <w:t>Design</w:t>
+      </w:r>
+      <w:proofErr w:type="spellEnd"/>
+      <w:r>
+        <w:rPr>
+          <w:lang w:eastAsia="ru-RU"/>
+        </w:rPr>
+        <w:t>.</w:t>
       </w:r>
     </w:p>
     <w:p>
@@ -9742,14 +9138,22 @@
         <w:rPr>
           <w:lang w:eastAsia="ru-RU"/>
         </w:rPr>
-        <w:t xml:space="preserve">Логическая архитектура системы определяет способ декомпозиции бизнес-логики на управляемые компоненты с чётким распределением ответственности. На данном этапе проектирования система рассматривается </w:t>
-      </w:r>
+        <w:t>Логическая архитектура системы определяет способ декомпозиции бизнес-логики на управляемые компоненты с чётким распределением ответственности. На данном этапе проектирования система рассматривается не как набор серверов или баз данных, а как совокупность логически изолированных слоёв, каждый из которых решает строго определённую задачу и взаимодействует с соседними по заранее установленным правилам. Целью является обеспечение простоты понимания, тестируемости и устойчивости к изменениям требований.</w:t>
+      </w:r>
+    </w:p>
+    <w:p>
+      <w:pPr>
+        <w:ind w:left="0" w:firstLine="720"/>
+        <w:rPr>
+          <w:lang w:eastAsia="ru-RU"/>
+        </w:rPr>
+      </w:pPr>
       <w:r>
         <w:rPr>
           <w:lang w:eastAsia="ru-RU"/>
         </w:rPr>
         <w:lastRenderedPageBreak/>
-        <w:t>не как набор серверов или баз данных, а как совокупность логически изолированных слоёв, каждый из которых решает строго определённую задачу и взаимодействует с соседними по заранее установленным правилам. Целью является обеспечение простоты понимания, тестируемости и устойчивости к изменениям требований.</w:t>
+        <w:t>В процессе анализа были рассмотрены три архитектурных подхода: слоистая архитектура, гексагональная архитектура (порты и адаптеры) и паттерн CQRS.</w:t>
       </w:r>
     </w:p>
     <w:p>
@@ -9763,7 +9167,153 @@
         <w:rPr>
           <w:lang w:eastAsia="ru-RU"/>
         </w:rPr>
-        <w:t>В процессе анализа были рассмотрены три архитектурных подхода: слоистая архитектура, гексагональная архитектура (порты и адаптеры) и паттерн CQRS.</w:t>
+        <w:t xml:space="preserve">Гексагональная архитектура обеспечивает высокую степень изоляции бизнес-логики за счёт использования портов и адаптеров. Однако для разрабатываемой системы, </w:t>
+      </w:r>
+      <w:r>
+        <w:rPr>
+          <w:lang w:eastAsia="ru-RU"/>
+        </w:rPr>
+        <w:t>у которой</w:t>
+      </w:r>
+      <w:r>
+        <w:rPr>
+          <w:lang w:eastAsia="ru-RU"/>
+        </w:rPr>
+        <w:t xml:space="preserve"> </w:t>
+      </w:r>
+      <w:r>
+        <w:rPr>
+          <w:lang w:eastAsia="ru-RU"/>
+        </w:rPr>
+        <w:t xml:space="preserve">примерно </w:t>
+      </w:r>
+      <w:r>
+        <w:rPr>
+          <w:lang w:eastAsia="ru-RU"/>
+        </w:rPr>
+        <w:t>линейны</w:t>
+      </w:r>
+      <w:r>
+        <w:rPr>
+          <w:lang w:eastAsia="ru-RU"/>
+        </w:rPr>
+        <w:t>й</w:t>
+      </w:r>
+      <w:r>
+        <w:rPr>
+          <w:lang w:eastAsia="ru-RU"/>
+        </w:rPr>
+        <w:t xml:space="preserve"> сценари</w:t>
+      </w:r>
+      <w:r>
+        <w:rPr>
+          <w:lang w:eastAsia="ru-RU"/>
+        </w:rPr>
+        <w:t>й</w:t>
+      </w:r>
+      <w:r>
+        <w:rPr>
+          <w:lang w:eastAsia="ru-RU"/>
+        </w:rPr>
+        <w:t xml:space="preserve"> обработки (запись, транскрипция, </w:t>
+      </w:r>
+      <w:proofErr w:type="spellStart"/>
+      <w:r>
+        <w:rPr>
+          <w:lang w:eastAsia="ru-RU"/>
+        </w:rPr>
+        <w:t>суммаризация</w:t>
+      </w:r>
+      <w:proofErr w:type="spellEnd"/>
+      <w:r>
+        <w:rPr>
+          <w:lang w:eastAsia="ru-RU"/>
+        </w:rPr>
+        <w:t xml:space="preserve"> и</w:t>
+      </w:r>
+      <w:r>
+        <w:rPr>
+          <w:lang w:eastAsia="ru-RU"/>
+        </w:rPr>
+        <w:t xml:space="preserve"> диалог) и </w:t>
+      </w:r>
+      <w:r>
+        <w:rPr>
+          <w:lang w:eastAsia="ru-RU"/>
+        </w:rPr>
+        <w:t>небольшое</w:t>
+      </w:r>
+      <w:r>
+        <w:rPr>
+          <w:lang w:eastAsia="ru-RU"/>
+        </w:rPr>
+        <w:t xml:space="preserve"> число внешних взаимодействий, </w:t>
+      </w:r>
+      <w:r>
+        <w:rPr>
+          <w:lang w:eastAsia="ru-RU"/>
+        </w:rPr>
+        <w:t>использование</w:t>
+      </w:r>
+      <w:r>
+        <w:rPr>
+          <w:lang w:eastAsia="ru-RU"/>
+        </w:rPr>
+        <w:t xml:space="preserve"> </w:t>
+      </w:r>
+      <w:r>
+        <w:rPr>
+          <w:lang w:eastAsia="ru-RU"/>
+        </w:rPr>
+        <w:t>этого</w:t>
+      </w:r>
+      <w:r>
+        <w:rPr>
+          <w:lang w:eastAsia="ru-RU"/>
+        </w:rPr>
+        <w:t xml:space="preserve"> паттерна</w:t>
+      </w:r>
+      <w:r>
+        <w:rPr>
+          <w:lang w:eastAsia="ru-RU"/>
+        </w:rPr>
+        <w:t xml:space="preserve"> </w:t>
+      </w:r>
+      <w:r>
+        <w:rPr>
+          <w:lang w:eastAsia="ru-RU"/>
+        </w:rPr>
+        <w:t>было бы излишне</w:t>
+      </w:r>
+      <w:r>
+        <w:rPr>
+          <w:lang w:eastAsia="ru-RU"/>
+        </w:rPr>
+        <w:t xml:space="preserve">: </w:t>
+      </w:r>
+      <w:r>
+        <w:rPr>
+          <w:lang w:eastAsia="ru-RU"/>
+        </w:rPr>
+        <w:t>нужно</w:t>
+      </w:r>
+      <w:r>
+        <w:rPr>
+          <w:lang w:eastAsia="ru-RU"/>
+        </w:rPr>
+        <w:t xml:space="preserve"> бы</w:t>
+      </w:r>
+      <w:r>
+        <w:rPr>
+          <w:lang w:eastAsia="ru-RU"/>
+        </w:rPr>
+        <w:t>ло бы</w:t>
+      </w:r>
+      <w:r>
+        <w:rPr>
+          <w:lang w:eastAsia="ru-RU"/>
+        </w:rPr>
+        <w:t xml:space="preserve"> описывать отдельные порты и адаптеры для каждого этапа жизненного цикла встречи, что увеличило бы объём кода и усложнило бы восприятие архитектуры без выигрыша в гибкости.</w:t>
       </w:r>
     </w:p>
     <w:p>
@@ -9777,135 +9327,152 @@
         <w:rPr>
           <w:lang w:eastAsia="ru-RU"/>
         </w:rPr>
-        <w:t xml:space="preserve">Гексагональная архитектура обеспечивает высокую степень изоляции бизнес-логики за счёт использования портов и адаптеров. Однако для разрабатываемой системы, </w:t>
-      </w:r>
-      <w:r>
-        <w:rPr>
-          <w:lang w:eastAsia="ru-RU"/>
-        </w:rPr>
-        <w:t>у которой</w:t>
-      </w:r>
-      <w:r>
-        <w:rPr>
-          <w:lang w:eastAsia="ru-RU"/>
-        </w:rPr>
+        <w:t xml:space="preserve">Паттерн CQRS предполагает разделение операций изменения состояния и операций чтения. Хотя система предполагает частое чтение итогов и </w:t>
+      </w:r>
+      <w:r>
+        <w:rPr>
+          <w:lang w:eastAsia="ru-RU"/>
+        </w:rPr>
+        <w:t>небольшое количество</w:t>
+      </w:r>
+      <w:r>
+        <w:rPr>
+          <w:lang w:eastAsia="ru-RU"/>
+        </w:rPr>
+        <w:t xml:space="preserve"> создани</w:t>
+      </w:r>
+      <w:r>
+        <w:rPr>
+          <w:lang w:eastAsia="ru-RU"/>
+        </w:rPr>
+        <w:t>я</w:t>
+      </w:r>
+      <w:r>
+        <w:rPr>
+          <w:lang w:eastAsia="ru-RU"/>
+        </w:rPr>
+        <w:t xml:space="preserve"> новых встреч, основная сложность </w:t>
+      </w:r>
+      <w:r>
+        <w:rPr>
+          <w:lang w:eastAsia="ru-RU"/>
+        </w:rPr>
+        <w:t>заключена</w:t>
+      </w:r>
+      <w:r>
+        <w:rPr>
+          <w:lang w:eastAsia="ru-RU"/>
+        </w:rPr>
+        <w:t xml:space="preserve"> в корректной последовательной обработке данны</w:t>
+      </w:r>
+      <w:r>
+        <w:rPr>
+          <w:lang w:eastAsia="ru-RU"/>
+        </w:rPr>
+        <w:t>х</w:t>
+      </w:r>
+      <w:r>
+        <w:rPr>
+          <w:lang w:eastAsia="ru-RU"/>
+        </w:rPr>
+        <w:t>.</w:t>
+      </w:r>
+      <w:r>
         <w:t xml:space="preserve"> </w:t>
       </w:r>
       <w:r>
         <w:rPr>
           <w:lang w:eastAsia="ru-RU"/>
         </w:rPr>
-        <w:t xml:space="preserve">примерно </w:t>
-      </w:r>
-      <w:r>
-        <w:rPr>
-          <w:lang w:eastAsia="ru-RU"/>
-        </w:rPr>
-        <w:t>линейны</w:t>
-      </w:r>
-      <w:r>
-        <w:rPr>
-          <w:lang w:eastAsia="ru-RU"/>
-        </w:rPr>
-        <w:t>й</w:t>
-      </w:r>
-      <w:r>
-        <w:rPr>
-          <w:lang w:eastAsia="ru-RU"/>
-        </w:rPr>
-        <w:t xml:space="preserve"> сценари</w:t>
-      </w:r>
-      <w:r>
-        <w:rPr>
-          <w:lang w:eastAsia="ru-RU"/>
-        </w:rPr>
-        <w:t>й</w:t>
-      </w:r>
-      <w:r>
-        <w:rPr>
-          <w:lang w:eastAsia="ru-RU"/>
-        </w:rPr>
-        <w:t xml:space="preserve"> обработки (запись, транскрипция, </w:t>
+        <w:t>В этом случае физическое разделение моделей было бы необоснованным, потому что операции записи и чтения логически связаны в рамках одного контекста</w:t>
+      </w:r>
+      <w:r>
+        <w:rPr>
+          <w:lang w:eastAsia="ru-RU"/>
+        </w:rPr>
+        <w:t xml:space="preserve">, </w:t>
+      </w:r>
+      <w:r>
+        <w:rPr>
+          <w:lang w:eastAsia="ru-RU"/>
+        </w:rPr>
+        <w:t>то есть встречи</w:t>
+      </w:r>
+      <w:r>
+        <w:rPr>
+          <w:lang w:eastAsia="ru-RU"/>
+        </w:rPr>
+        <w:t>,</w:t>
+      </w:r>
+      <w:r>
+        <w:rPr>
+          <w:lang w:eastAsia="ru-RU"/>
+        </w:rPr>
+        <w:t xml:space="preserve"> и не требуют независимой оптимизации.</w:t>
+      </w:r>
+    </w:p>
+    <w:p>
+      <w:pPr>
+        <w:ind w:left="0" w:firstLine="720"/>
+        <w:rPr>
+          <w:lang w:eastAsia="ru-RU"/>
+        </w:rPr>
+      </w:pPr>
+      <w:r>
+        <w:rPr>
+          <w:lang w:eastAsia="ru-RU"/>
+        </w:rPr>
+        <w:t xml:space="preserve">Слоистая архитектура оказалась наиболее подходящей для решаемой задачи. Она предполагает организацию системы в виде трёх слоёв: презентационного, бизнес-логики и доступа к данным. Каждый слой имеет </w:t>
+      </w:r>
+      <w:r>
+        <w:rPr>
+          <w:lang w:val="en-US" w:eastAsia="ru-RU"/>
+        </w:rPr>
+        <w:t>c</w:t>
       </w:r>
       <w:proofErr w:type="spellStart"/>
       <w:r>
         <w:rPr>
           <w:lang w:eastAsia="ru-RU"/>
         </w:rPr>
-        <w:t>суммаризация</w:t>
+        <w:t>трого</w:t>
       </w:r>
       <w:proofErr w:type="spellEnd"/>
       <w:r>
         <w:rPr>
           <w:lang w:eastAsia="ru-RU"/>
         </w:rPr>
-        <w:t xml:space="preserve"> и</w:t>
-      </w:r>
-      <w:r>
-        <w:rPr>
-          <w:lang w:eastAsia="ru-RU"/>
-        </w:rPr>
-        <w:t xml:space="preserve"> диалог) и </w:t>
-      </w:r>
-      <w:r>
-        <w:rPr>
-          <w:lang w:eastAsia="ru-RU"/>
-        </w:rPr>
-        <w:t>небольшое</w:t>
-      </w:r>
-      <w:r>
-        <w:rPr>
-          <w:lang w:eastAsia="ru-RU"/>
-        </w:rPr>
-        <w:t xml:space="preserve"> число внешних взаимодействий, внедрение данного</w:t>
-      </w:r>
-      <w:r>
-        <w:rPr>
-          <w:lang w:eastAsia="ru-RU"/>
-        </w:rPr>
-        <w:t xml:space="preserve"> паттерна</w:t>
-      </w:r>
-      <w:r>
-        <w:rPr>
-          <w:lang w:eastAsia="ru-RU"/>
-        </w:rPr>
         <w:t xml:space="preserve"> </w:t>
       </w:r>
       <w:r>
         <w:rPr>
           <w:lang w:eastAsia="ru-RU"/>
         </w:rPr>
-        <w:t>было бы излишне</w:t>
-      </w:r>
-      <w:r>
-        <w:rPr>
-          <w:lang w:eastAsia="ru-RU"/>
-        </w:rPr>
-        <w:t xml:space="preserve">: </w:t>
-      </w:r>
-      <w:r>
-        <w:rPr>
-          <w:lang w:eastAsia="ru-RU"/>
-        </w:rPr>
-        <w:t>нужно</w:t>
-      </w:r>
-      <w:r>
-        <w:rPr>
-          <w:lang w:eastAsia="ru-RU"/>
-        </w:rPr>
-        <w:t xml:space="preserve"> бы</w:t>
-      </w:r>
-      <w:r>
-        <w:rPr>
-          <w:lang w:eastAsia="ru-RU"/>
-        </w:rPr>
-        <w:t>ло бы</w:t>
-      </w:r>
-      <w:r>
-        <w:rPr>
-          <w:lang w:eastAsia="ru-RU"/>
-        </w:rPr>
-        <w:t xml:space="preserve"> описывать отдельные порты и адаптеры для каждого этапа жизненного цикла встречи, что увеличило бы объём кода и усложнило бы восприятие архитектуры без выигрыша в гибкости.</w:t>
+        <w:t xml:space="preserve">определённую ответственность и </w:t>
+      </w:r>
+      <w:r>
+        <w:rPr>
+          <w:lang w:eastAsia="ru-RU"/>
+        </w:rPr>
+        <w:t xml:space="preserve">может </w:t>
+      </w:r>
+      <w:r>
+        <w:rPr>
+          <w:lang w:eastAsia="ru-RU"/>
+        </w:rPr>
+        <w:t>взаимодейств</w:t>
+      </w:r>
+      <w:r>
+        <w:rPr>
+          <w:lang w:eastAsia="ru-RU"/>
+        </w:rPr>
+        <w:t>овать</w:t>
+      </w:r>
+      <w:r>
+        <w:rPr>
+          <w:lang w:eastAsia="ru-RU"/>
+        </w:rPr>
+        <w:t xml:space="preserve"> только с соседними слоями. Зависимости направлены сверху вниз: презентационный слой зависит от бизнес-логики, а бизнес-логика - от абстракций доступа к данным.</w:t>
       </w:r>
     </w:p>
     <w:p>
@@ -9919,49 +9486,65 @@
         <w:rPr>
           <w:lang w:eastAsia="ru-RU"/>
         </w:rPr>
-        <w:t xml:space="preserve">Паттерн CQRS предполагает разделение операций изменения состояния и операций чтения. Хотя система предполагает частое чтение итогов и </w:t>
-      </w:r>
-      <w:r>
-        <w:rPr>
-          <w:lang w:eastAsia="ru-RU"/>
-        </w:rPr>
-        <w:t>небольшое количество</w:t>
-      </w:r>
-      <w:r>
-        <w:rPr>
-          <w:lang w:eastAsia="ru-RU"/>
-        </w:rPr>
-        <w:t xml:space="preserve"> создани</w:t>
-      </w:r>
-      <w:r>
-        <w:rPr>
-          <w:lang w:eastAsia="ru-RU"/>
-        </w:rPr>
-        <w:t>я</w:t>
-      </w:r>
-      <w:r>
-        <w:rPr>
-          <w:lang w:eastAsia="ru-RU"/>
-        </w:rPr>
-        <w:t xml:space="preserve"> новых встреч, основная сложность </w:t>
-      </w:r>
-      <w:r>
-        <w:rPr>
-          <w:lang w:eastAsia="ru-RU"/>
-        </w:rPr>
-        <w:t>заключена</w:t>
-      </w:r>
-      <w:r>
-        <w:rPr>
-          <w:lang w:eastAsia="ru-RU"/>
-        </w:rPr>
-        <w:t xml:space="preserve"> в корректной последовательной обработке данны</w:t>
-      </w:r>
-      <w:r>
-        <w:rPr>
-          <w:lang w:eastAsia="ru-RU"/>
-        </w:rPr>
-        <w:t>х</w:t>
+        <w:t xml:space="preserve">В итоге слоистая архитектура выбрана в качестве основы логической структуры системы, так как она </w:t>
+      </w:r>
+      <w:proofErr w:type="spellStart"/>
+      <w:r>
+        <w:rPr>
+          <w:lang w:eastAsia="ru-RU"/>
+        </w:rPr>
+        <w:t>обсепечивает</w:t>
+      </w:r>
+      <w:proofErr w:type="spellEnd"/>
+      <w:r>
+        <w:rPr>
+          <w:lang w:eastAsia="ru-RU"/>
+        </w:rPr>
+        <w:t xml:space="preserve"> простот</w:t>
+      </w:r>
+      <w:r>
+        <w:rPr>
+          <w:lang w:eastAsia="ru-RU"/>
+        </w:rPr>
+        <w:t>у</w:t>
+      </w:r>
+      <w:r>
+        <w:rPr>
+          <w:lang w:eastAsia="ru-RU"/>
+        </w:rPr>
+        <w:t xml:space="preserve">, </w:t>
+      </w:r>
+      <w:proofErr w:type="spellStart"/>
+      <w:r>
+        <w:rPr>
+          <w:lang w:eastAsia="ru-RU"/>
+        </w:rPr>
+        <w:t>поддерживаемость</w:t>
+      </w:r>
+      <w:proofErr w:type="spellEnd"/>
+      <w:r>
+        <w:rPr>
+          <w:lang w:eastAsia="ru-RU"/>
+        </w:rPr>
+        <w:t xml:space="preserve"> и функциональн</w:t>
+      </w:r>
+      <w:r>
+        <w:rPr>
+          <w:lang w:eastAsia="ru-RU"/>
+        </w:rPr>
+        <w:t>ую</w:t>
+      </w:r>
+      <w:r>
+        <w:rPr>
+          <w:lang w:eastAsia="ru-RU"/>
+        </w:rPr>
+        <w:t xml:space="preserve"> полнот</w:t>
+      </w:r>
+      <w:r>
+        <w:rPr>
+          <w:lang w:eastAsia="ru-RU"/>
+        </w:rPr>
+        <w:t>у</w:t>
       </w:r>
       <w:r>
         <w:rPr>
@@ -9970,201 +9553,11 @@
         <w:t>.</w:t>
       </w:r>
       <w:r>
+        <w:rPr>
+          <w:lang w:eastAsia="ru-RU"/>
+        </w:rPr>
         <w:t xml:space="preserve"> </w:t>
       </w:r>
-      <w:r>
-        <w:rPr>
-          <w:lang w:eastAsia="ru-RU"/>
-        </w:rPr>
-        <w:t>В этом случае физическое разделение моделей было бы необоснованным, потому что операции записи и чтения логически связаны в рамках одного контекста</w:t>
-      </w:r>
-      <w:r>
-        <w:rPr>
-          <w:lang w:eastAsia="ru-RU"/>
-        </w:rPr>
-        <w:t xml:space="preserve">, </w:t>
-      </w:r>
-      <w:r>
-        <w:rPr>
-          <w:lang w:eastAsia="ru-RU"/>
-        </w:rPr>
-        <w:t>то есть встречи</w:t>
-      </w:r>
-      <w:r>
-        <w:rPr>
-          <w:lang w:eastAsia="ru-RU"/>
-        </w:rPr>
-        <w:t>,</w:t>
-      </w:r>
-      <w:r>
-        <w:rPr>
-          <w:lang w:eastAsia="ru-RU"/>
-        </w:rPr>
-        <w:t xml:space="preserve"> и не требуют независимой оптимизации.</w:t>
-      </w:r>
-    </w:p>
-    <w:p>
-      <w:pPr>
-        <w:ind w:left="0" w:firstLine="720"/>
-        <w:rPr>
-          <w:lang w:eastAsia="ru-RU"/>
-        </w:rPr>
-      </w:pPr>
-      <w:r>
-        <w:rPr>
-          <w:lang w:eastAsia="ru-RU"/>
-        </w:rPr>
-        <w:t xml:space="preserve">Слоистая архитектура оказалась наиболее подходящей для решаемой задачи. Она предполагает организацию системы в виде трёх слоёв: презентационного, бизнес-логики и доступа к данным. Каждый слой имеет </w:t>
-      </w:r>
-      <w:r>
-        <w:rPr>
-          <w:lang w:val="en-US" w:eastAsia="ru-RU"/>
-        </w:rPr>
-        <w:t>c</w:t>
-      </w:r>
-      <w:proofErr w:type="spellStart"/>
-      <w:r>
-        <w:rPr>
-          <w:lang w:eastAsia="ru-RU"/>
-        </w:rPr>
-        <w:t>трого</w:t>
-      </w:r>
-      <w:proofErr w:type="spellEnd"/>
-      <w:r>
-        <w:rPr>
-          <w:lang w:eastAsia="ru-RU"/>
-        </w:rPr>
-        <w:t xml:space="preserve"> </w:t>
-      </w:r>
-      <w:r>
-        <w:rPr>
-          <w:lang w:eastAsia="ru-RU"/>
-        </w:rPr>
-        <w:t xml:space="preserve">определённую ответственность и </w:t>
-      </w:r>
-      <w:r>
-        <w:rPr>
-          <w:lang w:eastAsia="ru-RU"/>
-        </w:rPr>
-        <w:t xml:space="preserve">может </w:t>
-      </w:r>
-      <w:r>
-        <w:rPr>
-          <w:lang w:eastAsia="ru-RU"/>
-        </w:rPr>
-        <w:t>взаимодейств</w:t>
-      </w:r>
-      <w:r>
-        <w:rPr>
-          <w:lang w:eastAsia="ru-RU"/>
-        </w:rPr>
-        <w:t>овать</w:t>
-      </w:r>
-      <w:r>
-        <w:rPr>
-          <w:lang w:eastAsia="ru-RU"/>
-        </w:rPr>
-        <w:t xml:space="preserve"> только с соседними слоями. Зависимости направлены сверху вниз: презентационный слой зависит от бизнес-логики, а бизнес-логика - от абстракций доступа к данным.</w:t>
-      </w:r>
-    </w:p>
-    <w:p>
-      <w:pPr>
-        <w:ind w:left="0" w:firstLine="720"/>
-        <w:rPr>
-          <w:lang w:eastAsia="ru-RU"/>
-        </w:rPr>
-      </w:pPr>
-      <w:r>
-        <w:rPr>
-          <w:lang w:eastAsia="ru-RU"/>
-        </w:rPr>
-        <w:lastRenderedPageBreak/>
-        <w:t xml:space="preserve">В итоге слоистая архитектура выбрана в качестве основы логической структуры системы, так как она </w:t>
-      </w:r>
-      <w:proofErr w:type="spellStart"/>
-      <w:r>
-        <w:rPr>
-          <w:lang w:eastAsia="ru-RU"/>
-        </w:rPr>
-        <w:t>обсепечивает</w:t>
-      </w:r>
-      <w:proofErr w:type="spellEnd"/>
-      <w:r>
-        <w:rPr>
-          <w:lang w:eastAsia="ru-RU"/>
-        </w:rPr>
-        <w:t xml:space="preserve"> простот</w:t>
-      </w:r>
-      <w:r>
-        <w:rPr>
-          <w:lang w:eastAsia="ru-RU"/>
-        </w:rPr>
-        <w:t>у</w:t>
-      </w:r>
-      <w:r>
-        <w:rPr>
-          <w:lang w:eastAsia="ru-RU"/>
-        </w:rPr>
-        <w:t xml:space="preserve">, </w:t>
-      </w:r>
-      <w:proofErr w:type="spellStart"/>
-      <w:r>
-        <w:rPr>
-          <w:lang w:eastAsia="ru-RU"/>
-        </w:rPr>
-        <w:t>поддерживаемость</w:t>
-      </w:r>
-      <w:proofErr w:type="spellEnd"/>
-      <w:r>
-        <w:rPr>
-          <w:lang w:eastAsia="ru-RU"/>
-        </w:rPr>
-        <w:t xml:space="preserve"> и функциональн</w:t>
-      </w:r>
-      <w:r>
-        <w:rPr>
-          <w:lang w:eastAsia="ru-RU"/>
-        </w:rPr>
-        <w:t>ую</w:t>
-      </w:r>
-      <w:r>
-        <w:rPr>
-          <w:lang w:eastAsia="ru-RU"/>
-        </w:rPr>
-        <w:t xml:space="preserve"> полнот</w:t>
-      </w:r>
-      <w:r>
-        <w:rPr>
-          <w:lang w:eastAsia="ru-RU"/>
-        </w:rPr>
-        <w:t>у</w:t>
-      </w:r>
-      <w:r>
-        <w:rPr>
-          <w:lang w:eastAsia="ru-RU"/>
-        </w:rPr>
-        <w:t>.</w:t>
-      </w:r>
-      <w:r>
-        <w:rPr>
-          <w:lang w:eastAsia="ru-RU"/>
-        </w:rPr>
-        <w:t xml:space="preserve"> Схема </w:t>
-      </w:r>
-      <w:r>
-        <w:rPr>
-          <w:lang w:eastAsia="ru-RU"/>
-        </w:rPr>
-        <w:t>декомпозиции на логические слои</w:t>
-      </w:r>
-      <w:r>
-        <w:rPr>
-          <w:lang w:eastAsia="ru-RU"/>
-        </w:rPr>
-        <w:t xml:space="preserve"> представлена на рисунке 8.</w:t>
-      </w:r>
-      <w:bookmarkStart w:id="12" w:name="_GoBack"/>
-      <w:bookmarkEnd w:id="12"/>
     </w:p>
     <w:p>
       <w:pPr>
@@ -10179,6 +9572,7 @@
           <w:noProof/>
           <w:lang w:eastAsia="ru-RU"/>
         </w:rPr>
+        <w:lastRenderedPageBreak/>
         <w:drawing>
           <wp:inline distT="0" distB="0" distL="0" distR="0" wp14:anchorId="702ECB57" wp14:editId="39B9E021">
             <wp:extent cx="5059758" cy="5633545"/>
@@ -10195,7 +9589,7 @@
                     <pic:cNvPicPr/>
                   </pic:nvPicPr>
                   <pic:blipFill rotWithShape="1">
-                    <a:blip r:embed="rId17">
+                    <a:blip r:embed="rId15">
                       <a:extLst>
                         <a:ext uri="{28A0092B-C50C-407E-A947-70E740481C1C}">
                           <a14:useLocalDpi xmlns:a14="http://schemas.microsoft.com/office/drawing/2010/main" val="0"/>
@@ -10277,14 +9671,14 @@
           <w:lang w:eastAsia="ru-RU"/>
         </w:rPr>
       </w:pPr>
-      <w:bookmarkStart w:id="13" w:name="_Toc228041473"/>
+      <w:bookmarkStart w:id="12" w:name="_Toc228041473"/>
       <w:r>
         <w:rPr>
           <w:lang w:eastAsia="ru-RU"/>
         </w:rPr>
         <w:t>Определение функциональных слоёв</w:t>
       </w:r>
-      <w:bookmarkEnd w:id="13"/>
+      <w:bookmarkEnd w:id="12"/>
     </w:p>
     <w:p>
       <w:pPr>
@@ -10335,14 +9729,7 @@
         <w:rPr>
           <w:lang w:eastAsia="ru-RU"/>
         </w:rPr>
-        <w:t xml:space="preserve"> API, обрабатывает входящие HTTP-запросы и формирует ответы. Данный слой не содержит бизнес-логики и не </w:t>
-      </w:r>
-      <w:r>
-        <w:rPr>
-          <w:lang w:eastAsia="ru-RU"/>
-        </w:rPr>
-        <w:lastRenderedPageBreak/>
-        <w:t xml:space="preserve">выполняет прямую работу с хранилищами данных. Его единственная задача </w:t>
+        <w:t xml:space="preserve"> API, обрабатывает входящие HTTP-запросы и формирует ответы. Данный слой не содержит бизнес-логики и не выполняет прямую работу с хранилищами данных. Его единственная задача </w:t>
       </w:r>
       <w:r>
         <w:rPr>
@@ -10387,6 +9774,7 @@
         <w:rPr>
           <w:lang w:eastAsia="ru-RU"/>
         </w:rPr>
+        <w:lastRenderedPageBreak/>
         <w:t xml:space="preserve"> </w:t>
       </w:r>
       <w:r>
@@ -10594,7 +9982,31 @@
         <w:rPr>
           <w:lang w:eastAsia="ru-RU"/>
         </w:rPr>
-        <w:t xml:space="preserve">Для обеспечения инверсии зависимостей слой бизнес-логики взаимодействует со слоем доступа к данным через интерфейсы, а не через конкретные реализации. Это гарантирует, что изменение способа хранения аудио или текста не повлияет на </w:t>
+        <w:t xml:space="preserve">Для обеспечения инверсии зависимостей слой бизнес-логики взаимодействует со слоем доступа к данным через интерфейсы, а не через реализации. Это гарантирует, что изменение способа хранения аудио или текста не повлияет </w:t>
+      </w:r>
+      <w:r>
+        <w:rPr>
+          <w:lang w:eastAsia="ru-RU"/>
+        </w:rPr>
+        <w:t xml:space="preserve">и </w:t>
+      </w:r>
+      <w:r>
+        <w:rPr>
+          <w:lang w:eastAsia="ru-RU"/>
+        </w:rPr>
+        <w:t>н</w:t>
+      </w:r>
+      <w:r>
+        <w:rPr>
+          <w:lang w:eastAsia="ru-RU"/>
+        </w:rPr>
+        <w:t>е</w:t>
+      </w:r>
+      <w:r>
+        <w:rPr>
+          <w:lang w:eastAsia="ru-RU"/>
+        </w:rPr>
+        <w:t xml:space="preserve"> </w:t>
       </w:r>
       <w:r>
         <w:rPr>
@@ -10668,7 +10080,19 @@
         <w:rPr>
           <w:lang w:eastAsia="ru-RU"/>
         </w:rPr>
-        <w:t xml:space="preserve"> ИИ-сервисами. Он реализует интерфейсы, объявленные в слое бизнес-логики, и инкапсулирует всю техническую сложность взаимодействия с этими системами. </w:t>
+        <w:t xml:space="preserve"> ИИ</w:t>
+      </w:r>
+      <w:r>
+        <w:rPr>
+          <w:lang w:eastAsia="ru-RU"/>
+        </w:rPr>
+        <w:t xml:space="preserve"> </w:t>
+      </w:r>
+      <w:r>
+        <w:rPr>
+          <w:lang w:eastAsia="ru-RU"/>
+        </w:rPr>
+        <w:t xml:space="preserve">сервисами. Он реализует интерфейсы, объявленные в слое бизнес-логики, и инкапсулирует всю техническую сложность взаимодействия с этими системами. </w:t>
       </w:r>
       <w:r>
         <w:rPr>
@@ -10726,14 +10150,14 @@
           <w:lang w:eastAsia="ru-RU"/>
         </w:rPr>
       </w:pPr>
-      <w:bookmarkStart w:id="14" w:name="_Toc228041474"/>
+      <w:bookmarkStart w:id="13" w:name="_Toc228041474"/>
       <w:r>
         <w:rPr>
           <w:lang w:eastAsia="ru-RU"/>
         </w:rPr>
         <w:t>Взаимодействие компонентов</w:t>
       </w:r>
-      <w:bookmarkEnd w:id="14"/>
+      <w:bookmarkEnd w:id="13"/>
     </w:p>
     <w:p>
       <w:pPr>
@@ -11002,14 +10426,14 @@
         <w:rPr>
           <w:lang w:eastAsia="ru-RU"/>
         </w:rPr>
-        <w:t xml:space="preserve"> с</w:t>
+        <w:t xml:space="preserve"> </w:t>
       </w:r>
       <w:proofErr w:type="spellStart"/>
       <w:r>
         <w:rPr>
           <w:lang w:eastAsia="ru-RU"/>
         </w:rPr>
-        <w:t>уммаризация</w:t>
+        <w:t>суммаризация</w:t>
       </w:r>
       <w:proofErr w:type="spellEnd"/>
       <w:r>
@@ -11048,72 +10472,84 @@
         <w:rPr>
           <w:lang w:eastAsia="ru-RU"/>
         </w:rPr>
+        <w:t xml:space="preserve">По завершении пользователь может </w:t>
+      </w:r>
+      <w:r>
+        <w:rPr>
+          <w:lang w:eastAsia="ru-RU"/>
+        </w:rPr>
+        <w:t>просмотреть</w:t>
+      </w:r>
+      <w:r>
+        <w:rPr>
+          <w:lang w:eastAsia="ru-RU"/>
+        </w:rPr>
+        <w:t xml:space="preserve"> итоги или </w:t>
+      </w:r>
+      <w:r>
+        <w:rPr>
+          <w:lang w:eastAsia="ru-RU"/>
+        </w:rPr>
+        <w:t>создать</w:t>
+      </w:r>
+      <w:r>
+        <w:rPr>
+          <w:lang w:eastAsia="ru-RU"/>
+        </w:rPr>
+        <w:t xml:space="preserve"> </w:t>
+      </w:r>
+      <w:r>
+        <w:rPr>
+          <w:lang w:eastAsia="ru-RU"/>
+        </w:rPr>
+        <w:t xml:space="preserve">новый чат, </w:t>
+      </w:r>
+      <w:r>
+        <w:rPr>
+          <w:lang w:eastAsia="ru-RU"/>
+        </w:rPr>
+        <w:t>запрос снова проходит через презентационный слой к бизнес-логике, которая извлекает данные через абстракции доступа к данным.</w:t>
+      </w:r>
+    </w:p>
+    <w:p>
+      <w:pPr>
+        <w:ind w:left="0" w:firstLine="720"/>
+        <w:rPr>
+          <w:lang w:eastAsia="ru-RU"/>
+        </w:rPr>
+      </w:pPr>
+      <w:r>
+        <w:rPr>
+          <w:lang w:eastAsia="ru-RU"/>
+        </w:rPr>
+        <w:t>Такая организация обеспечивает предсказуемость, контролируемость и возможность повторной обработки при сбоях.</w:t>
+      </w:r>
+    </w:p>
+    <w:p>
+      <w:pPr>
+        <w:ind w:left="0" w:firstLine="720"/>
+        <w:rPr>
+          <w:lang w:eastAsia="ru-RU"/>
+        </w:rPr>
+      </w:pPr>
+      <w:r>
+        <w:rPr>
+          <w:lang w:eastAsia="ru-RU"/>
+        </w:rPr>
         <w:lastRenderedPageBreak/>
-        <w:t xml:space="preserve">По завершении пользователь может </w:t>
-      </w:r>
-      <w:r>
-        <w:rPr>
-          <w:lang w:eastAsia="ru-RU"/>
-        </w:rPr>
-        <w:t>просмотреть</w:t>
-      </w:r>
-      <w:r>
-        <w:rPr>
-          <w:lang w:eastAsia="ru-RU"/>
-        </w:rPr>
-        <w:t xml:space="preserve"> итоги или </w:t>
-      </w:r>
-      <w:r>
-        <w:rPr>
-          <w:lang w:eastAsia="ru-RU"/>
-        </w:rPr>
-        <w:t>создать</w:t>
-      </w:r>
-      <w:r>
-        <w:rPr>
-          <w:lang w:eastAsia="ru-RU"/>
-        </w:rPr>
-        <w:t xml:space="preserve"> </w:t>
-      </w:r>
-      <w:r>
-        <w:rPr>
-          <w:lang w:eastAsia="ru-RU"/>
-        </w:rPr>
-        <w:t xml:space="preserve">новый чат, </w:t>
-      </w:r>
-      <w:r>
-        <w:rPr>
-          <w:lang w:eastAsia="ru-RU"/>
-        </w:rPr>
-        <w:t>запрос снова проходит через презентационный слой к бизнес-логике, которая извлекает данные через абстракции доступа к данным.</w:t>
-      </w:r>
-    </w:p>
-    <w:p>
-      <w:pPr>
-        <w:ind w:left="0" w:firstLine="720"/>
-        <w:rPr>
-          <w:lang w:eastAsia="ru-RU"/>
-        </w:rPr>
-      </w:pPr>
-      <w:r>
-        <w:rPr>
-          <w:lang w:eastAsia="ru-RU"/>
-        </w:rPr>
-        <w:t>Такая организация обеспечивает предсказуемость, контролируемость и возможность повторной обработки при сбоях.</w:t>
-      </w:r>
-    </w:p>
-    <w:p>
-      <w:pPr>
-        <w:ind w:left="0" w:firstLine="720"/>
-        <w:rPr>
-          <w:lang w:eastAsia="ru-RU"/>
-        </w:rPr>
-      </w:pPr>
-      <w:r>
-        <w:rPr>
-          <w:lang w:eastAsia="ru-RU"/>
-        </w:rPr>
-        <w:t xml:space="preserve">Таким образом, спроектированная логическая архитектура на основе слоистого подхода создаёт прочный фундамент для </w:t>
+        <w:t xml:space="preserve">Таким образом, спроектированная логическая архитектура на основе слоистого подхода создаёт </w:t>
+      </w:r>
+      <w:r>
+        <w:rPr>
+          <w:lang w:eastAsia="ru-RU"/>
+        </w:rPr>
+        <w:t>надежный</w:t>
+      </w:r>
+      <w:r>
+        <w:rPr>
+          <w:lang w:eastAsia="ru-RU"/>
+        </w:rPr>
+        <w:t xml:space="preserve"> фундамент для </w:t>
       </w:r>
       <w:r>
         <w:rPr>
@@ -11154,31 +10590,55 @@
       <w:pPr>
         <w:pStyle w:val="Heading1"/>
       </w:pPr>
-      <w:bookmarkStart w:id="15" w:name="_Toc228041475"/>
+      <w:bookmarkStart w:id="14" w:name="_Toc228041475"/>
       <w:r>
         <w:lastRenderedPageBreak/>
         <w:t>ТЕХНИЧЕСКАЯ ЧАСТЬ</w:t>
       </w:r>
+      <w:bookmarkEnd w:id="14"/>
+    </w:p>
+    <w:p>
+      <w:pPr>
+        <w:pStyle w:val="Heading2"/>
+        <w:rPr>
+          <w:lang w:val="en-US"/>
+        </w:rPr>
+      </w:pPr>
+      <w:bookmarkStart w:id="15" w:name="_Toc228041476"/>
+      <w:r>
+        <w:rPr>
+          <w:lang w:val="en-US"/>
+        </w:rPr>
+        <w:t>Выбор платформы разработки</w:t>
+      </w:r>
       <w:bookmarkEnd w:id="15"/>
     </w:p>
     <w:p>
       <w:pPr>
+        <w:rPr>
+          <w:lang w:val="en-US"/>
+        </w:rPr>
+      </w:pPr>
+    </w:p>
+    <w:p>
+      <w:pPr>
         <w:pStyle w:val="Heading2"/>
         <w:rPr>
           <w:lang w:val="en-US"/>
         </w:rPr>
       </w:pPr>
-      <w:bookmarkStart w:id="16" w:name="_Toc228041476"/>
+      <w:bookmarkStart w:id="16" w:name="_Toc228041477"/>
       <w:r>
         <w:rPr>
           <w:lang w:val="en-US"/>
         </w:rPr>
-        <w:t>Выбор платформы разработки</w:t>
+        <w:t>Выбор архитектурного стиля реализации</w:t>
       </w:r>
       <w:bookmarkEnd w:id="16"/>
     </w:p>
     <w:p>
       <w:pPr>
+        <w:ind w:left="0"/>
         <w:rPr>
           <w:lang w:val="en-US"/>
         </w:rPr>
@@ -11191,17 +10651,86 @@
           <w:lang w:val="en-US"/>
         </w:rPr>
       </w:pPr>
-      <w:bookmarkStart w:id="17" w:name="_Toc228041477"/>
+      <w:bookmarkStart w:id="17" w:name="_Toc228041478"/>
       <w:r>
         <w:rPr>
           <w:lang w:val="en-US"/>
         </w:rPr>
-        <w:t>Выбор архитектурного стиля реализации</w:t>
+        <w:t>Выбор технологического стека</w:t>
       </w:r>
       <w:bookmarkEnd w:id="17"/>
     </w:p>
     <w:p>
       <w:pPr>
+        <w:rPr>
+          <w:lang w:val="en-US"/>
+        </w:rPr>
+      </w:pPr>
+    </w:p>
+    <w:p>
+      <w:pPr>
+        <w:pStyle w:val="Heading2"/>
+        <w:rPr>
+          <w:lang w:val="en-US"/>
+        </w:rPr>
+      </w:pPr>
+      <w:bookmarkStart w:id="18" w:name="_Toc228041479"/>
+      <w:r>
+        <w:rPr>
+          <w:lang w:val="en-US"/>
+        </w:rPr>
+        <w:t>Выбор инструментов разработки</w:t>
+      </w:r>
+      <w:bookmarkEnd w:id="18"/>
+    </w:p>
+    <w:p>
+      <w:pPr>
+        <w:rPr>
+          <w:lang w:val="en-US"/>
+        </w:rPr>
+      </w:pPr>
+    </w:p>
+    <w:p>
+      <w:pPr>
+        <w:pStyle w:val="Heading2"/>
+        <w:rPr>
+          <w:lang w:val="en-US"/>
+        </w:rPr>
+      </w:pPr>
+      <w:bookmarkStart w:id="19" w:name="_Toc228041480"/>
+      <w:r>
+        <w:rPr>
+          <w:lang w:val="en-US"/>
+        </w:rPr>
+        <w:t>Проектирование базы данных</w:t>
+      </w:r>
+      <w:bookmarkEnd w:id="19"/>
+    </w:p>
+    <w:p>
+      <w:pPr>
+        <w:rPr>
+          <w:lang w:val="en-US"/>
+        </w:rPr>
+      </w:pPr>
+    </w:p>
+    <w:p>
+      <w:pPr>
+        <w:pStyle w:val="Heading2"/>
+        <w:rPr>
+          <w:lang w:val="en-US"/>
+        </w:rPr>
+      </w:pPr>
+      <w:bookmarkStart w:id="20" w:name="_Toc228041481"/>
+      <w:r>
+        <w:rPr>
+          <w:lang w:val="en-US"/>
+        </w:rPr>
+        <w:t>Инструменты мониторинга и логирования</w:t>
+      </w:r>
+      <w:bookmarkEnd w:id="20"/>
+    </w:p>
+    <w:p>
+      <w:pPr>
         <w:ind w:left="0"/>
         <w:rPr>
           <w:lang w:val="en-US"/>
@@ -11215,107 +10744,14 @@
           <w:lang w:val="en-US"/>
         </w:rPr>
       </w:pPr>
-      <w:bookmarkStart w:id="18" w:name="_Toc228041478"/>
+      <w:bookmarkStart w:id="21" w:name="_Toc228041482"/>
       <w:r>
         <w:rPr>
           <w:lang w:val="en-US"/>
         </w:rPr>
-        <w:t>Выбор технологического стека</w:t>
-      </w:r>
-      <w:bookmarkEnd w:id="18"/>
-    </w:p>
-    <w:p>
-      <w:pPr>
-        <w:rPr>
-          <w:lang w:val="en-US"/>
-        </w:rPr>
-      </w:pPr>
-    </w:p>
-    <w:p>
-      <w:pPr>
-        <w:pStyle w:val="Heading2"/>
-        <w:rPr>
-          <w:lang w:val="en-US"/>
-        </w:rPr>
-      </w:pPr>
-      <w:bookmarkStart w:id="19" w:name="_Toc228041479"/>
-      <w:r>
-        <w:rPr>
-          <w:lang w:val="en-US"/>
-        </w:rPr>
-        <w:t>Выбор инструментов разработки</w:t>
-      </w:r>
-      <w:bookmarkEnd w:id="19"/>
-    </w:p>
-    <w:p>
-      <w:pPr>
-        <w:rPr>
-          <w:lang w:val="en-US"/>
-        </w:rPr>
-      </w:pPr>
-    </w:p>
-    <w:p>
-      <w:pPr>
-        <w:pStyle w:val="Heading2"/>
-        <w:rPr>
-          <w:lang w:val="en-US"/>
-        </w:rPr>
-      </w:pPr>
-      <w:bookmarkStart w:id="20" w:name="_Toc228041480"/>
-      <w:r>
-        <w:rPr>
-          <w:lang w:val="en-US"/>
-        </w:rPr>
-        <w:t>Проектирование базы данных</w:t>
-      </w:r>
-      <w:bookmarkEnd w:id="20"/>
-    </w:p>
-    <w:p>
-      <w:pPr>
-        <w:rPr>
-          <w:lang w:val="en-US"/>
-        </w:rPr>
-      </w:pPr>
-    </w:p>
-    <w:p>
-      <w:pPr>
-        <w:pStyle w:val="Heading2"/>
-        <w:rPr>
-          <w:lang w:val="en-US"/>
-        </w:rPr>
-      </w:pPr>
-      <w:bookmarkStart w:id="21" w:name="_Toc228041481"/>
-      <w:r>
-        <w:rPr>
-          <w:lang w:val="en-US"/>
-        </w:rPr>
-        <w:t>Инструменты мониторинга и логирования</w:t>
+        <w:t>Обеспечение информационной безопасности</w:t>
       </w:r>
       <w:bookmarkEnd w:id="21"/>
-    </w:p>
-    <w:p>
-      <w:pPr>
-        <w:ind w:left="0"/>
-        <w:rPr>
-          <w:lang w:val="en-US"/>
-        </w:rPr>
-      </w:pPr>
-    </w:p>
-    <w:p>
-      <w:pPr>
-        <w:pStyle w:val="Heading2"/>
-        <w:rPr>
-          <w:lang w:val="en-US"/>
-        </w:rPr>
-      </w:pPr>
-      <w:bookmarkStart w:id="22" w:name="_Toc228041482"/>
-      <w:r>
-        <w:rPr>
-          <w:lang w:val="en-US"/>
-        </w:rPr>
-        <w:t>Обеспечение информационной безопасности</w:t>
-      </w:r>
-      <w:bookmarkEnd w:id="22"/>
     </w:p>
     <w:p>
       <w:pPr>
@@ -11350,20 +10786,31 @@
       <w:pPr>
         <w:pStyle w:val="Heading1"/>
       </w:pPr>
-      <w:bookmarkStart w:id="23" w:name="_Toc228041483"/>
+      <w:bookmarkStart w:id="22" w:name="_Toc228041483"/>
       <w:r>
         <w:lastRenderedPageBreak/>
         <w:t>ПРАКТИЧЕСКАЯ ЧАСТЬ</w:t>
       </w:r>
+      <w:bookmarkEnd w:id="22"/>
+    </w:p>
+    <w:p>
+      <w:pPr>
+        <w:pStyle w:val="Heading2"/>
+      </w:pPr>
+      <w:bookmarkStart w:id="23" w:name="_Toc228041484"/>
+      <w:r>
+        <w:t>Анализ требований и планирование</w:t>
+      </w:r>
       <w:bookmarkEnd w:id="23"/>
     </w:p>
+    <w:p/>
     <w:p>
       <w:pPr>
         <w:pStyle w:val="Heading2"/>
       </w:pPr>
-      <w:bookmarkStart w:id="24" w:name="_Toc228041484"/>
-      <w:r>
-        <w:t>Анализ требований и планирование</w:t>
+      <w:bookmarkStart w:id="24" w:name="_Toc228041485"/>
+      <w:r>
+        <w:t>Прототипирование интерфейса</w:t>
       </w:r>
       <w:bookmarkEnd w:id="24"/>
     </w:p>
@@ -11372,129 +10819,118 @@
       <w:pPr>
         <w:pStyle w:val="Heading2"/>
       </w:pPr>
-      <w:bookmarkStart w:id="25" w:name="_Toc228041485"/>
-      <w:r>
-        <w:t>Прототипирование интерфейса</w:t>
+      <w:bookmarkStart w:id="25" w:name="_Toc228041486"/>
+      <w:r>
+        <w:t>Реализация системы</w:t>
       </w:r>
       <w:bookmarkEnd w:id="25"/>
     </w:p>
+    <w:p>
+      <w:pPr>
+        <w:pStyle w:val="Heading3"/>
+      </w:pPr>
+      <w:bookmarkStart w:id="26" w:name="_Toc228041487"/>
+      <w:r>
+        <w:t>Реализация модуля управления встречами</w:t>
+      </w:r>
+      <w:bookmarkEnd w:id="26"/>
+    </w:p>
+    <w:p>
+      <w:pPr>
+        <w:pStyle w:val="Heading3"/>
+      </w:pPr>
+      <w:bookmarkStart w:id="27" w:name="_Toc228041488"/>
+      <w:r>
+        <w:t>Реализация модуля транскрипции встреч</w:t>
+      </w:r>
+      <w:bookmarkEnd w:id="27"/>
+    </w:p>
+    <w:p>
+      <w:pPr>
+        <w:pStyle w:val="Heading3"/>
+      </w:pPr>
+      <w:bookmarkStart w:id="28" w:name="_Toc228041489"/>
+      <w:r>
+        <w:t>Реализация модуля суммаризации встреч</w:t>
+      </w:r>
+      <w:bookmarkEnd w:id="28"/>
+    </w:p>
+    <w:p>
+      <w:pPr>
+        <w:pStyle w:val="Heading3"/>
+      </w:pPr>
+      <w:bookmarkStart w:id="29" w:name="_Toc228041490"/>
+      <w:r>
+        <w:t>Реализация мобильного приложения под A</w:t>
+      </w:r>
+      <w:r>
+        <w:rPr>
+          <w:lang w:val="en-US"/>
+        </w:rPr>
+        <w:t>ndroid</w:t>
+      </w:r>
+      <w:bookmarkEnd w:id="29"/>
+    </w:p>
+    <w:p>
+      <w:pPr>
+        <w:ind w:left="0"/>
+      </w:pPr>
+    </w:p>
+    <w:p>
+      <w:pPr>
+        <w:pStyle w:val="Heading2"/>
+      </w:pPr>
+      <w:bookmarkStart w:id="30" w:name="_Toc228041491"/>
+      <w:r>
+        <w:t>Тестирование системы</w:t>
+      </w:r>
+      <w:bookmarkEnd w:id="30"/>
+    </w:p>
+    <w:p>
+      <w:pPr>
+        <w:pStyle w:val="Heading3"/>
+      </w:pPr>
+      <w:bookmarkStart w:id="31" w:name="_Toc228041492"/>
+      <w:r>
+        <w:t>Функциональное тестирование</w:t>
+      </w:r>
+      <w:bookmarkEnd w:id="31"/>
+    </w:p>
+    <w:p>
+      <w:pPr>
+        <w:pStyle w:val="Heading3"/>
+      </w:pPr>
+      <w:bookmarkStart w:id="32" w:name="_Toc228041493"/>
+      <w:r>
+        <w:t>Нефункциональное тестирование</w:t>
+      </w:r>
+      <w:bookmarkEnd w:id="32"/>
+    </w:p>
+    <w:p>
+      <w:pPr>
+        <w:ind w:left="0"/>
+      </w:pPr>
+    </w:p>
+    <w:p>
+      <w:pPr>
+        <w:pStyle w:val="Heading2"/>
+      </w:pPr>
+      <w:bookmarkStart w:id="33" w:name="_Toc228041494"/>
+      <w:r>
+        <w:t>Демонстрация работы системы</w:t>
+      </w:r>
+      <w:bookmarkEnd w:id="33"/>
+    </w:p>
     <w:p/>
     <w:p>
       <w:pPr>
         <w:pStyle w:val="Heading2"/>
       </w:pPr>
-      <w:bookmarkStart w:id="26" w:name="_Toc228041486"/>
-      <w:r>
-        <w:t>Реализация системы</w:t>
-      </w:r>
-      <w:bookmarkEnd w:id="26"/>
-    </w:p>
-    <w:p>
-      <w:pPr>
-        <w:pStyle w:val="Heading3"/>
-      </w:pPr>
-      <w:bookmarkStart w:id="27" w:name="_Toc228041487"/>
-      <w:r>
-        <w:t>Реализация модуля управления встречами</w:t>
-      </w:r>
-      <w:bookmarkEnd w:id="27"/>
-    </w:p>
-    <w:p>
-      <w:pPr>
-        <w:pStyle w:val="Heading3"/>
-      </w:pPr>
-      <w:bookmarkStart w:id="28" w:name="_Toc228041488"/>
-      <w:r>
-        <w:t>Реализация модуля транскрипции встреч</w:t>
-      </w:r>
-      <w:bookmarkEnd w:id="28"/>
-    </w:p>
-    <w:p>
-      <w:pPr>
-        <w:pStyle w:val="Heading3"/>
-      </w:pPr>
-      <w:bookmarkStart w:id="29" w:name="_Toc228041489"/>
-      <w:r>
-        <w:t>Реализация модуля суммаризации встреч</w:t>
-      </w:r>
-      <w:bookmarkEnd w:id="29"/>
-    </w:p>
-    <w:p>
-      <w:pPr>
-        <w:pStyle w:val="Heading3"/>
-      </w:pPr>
-      <w:bookmarkStart w:id="30" w:name="_Toc228041490"/>
-      <w:r>
-        <w:t>Реализация мобильного приложения под A</w:t>
-      </w:r>
-      <w:r>
-        <w:rPr>
-          <w:lang w:val="en-US"/>
-        </w:rPr>
-        <w:t>ndroid</w:t>
-      </w:r>
-      <w:bookmarkEnd w:id="30"/>
-    </w:p>
-    <w:p>
-      <w:pPr>
-        <w:ind w:left="0"/>
-      </w:pPr>
-    </w:p>
-    <w:p>
-      <w:pPr>
-        <w:pStyle w:val="Heading2"/>
-      </w:pPr>
-      <w:bookmarkStart w:id="31" w:name="_Toc228041491"/>
-      <w:r>
-        <w:t>Тестирование системы</w:t>
-      </w:r>
-      <w:bookmarkEnd w:id="31"/>
-    </w:p>
-    <w:p>
-      <w:pPr>
-        <w:pStyle w:val="Heading3"/>
-      </w:pPr>
-      <w:bookmarkStart w:id="32" w:name="_Toc228041492"/>
-      <w:r>
-        <w:t>Функциональное тестирование</w:t>
-      </w:r>
-      <w:bookmarkEnd w:id="32"/>
-    </w:p>
-    <w:p>
-      <w:pPr>
-        <w:pStyle w:val="Heading3"/>
-      </w:pPr>
-      <w:bookmarkStart w:id="33" w:name="_Toc228041493"/>
-      <w:r>
-        <w:t>Нефункциональное тестирование</w:t>
-      </w:r>
-      <w:bookmarkEnd w:id="33"/>
-    </w:p>
-    <w:p>
-      <w:pPr>
-        <w:ind w:left="0"/>
-      </w:pPr>
-    </w:p>
-    <w:p>
-      <w:pPr>
-        <w:pStyle w:val="Heading2"/>
-      </w:pPr>
-      <w:bookmarkStart w:id="34" w:name="_Toc228041494"/>
-      <w:r>
-        <w:t>Демонстрация работы системы</w:t>
+      <w:bookmarkStart w:id="34" w:name="_Toc228041495"/>
+      <w:r>
+        <w:t>Перспективы развития</w:t>
       </w:r>
       <w:bookmarkEnd w:id="34"/>
-    </w:p>
-    <w:p/>
-    <w:p>
-      <w:pPr>
-        <w:pStyle w:val="Heading2"/>
-      </w:pPr>
-      <w:bookmarkStart w:id="35" w:name="_Toc228041495"/>
-      <w:r>
-        <w:t>Перспективы развития</w:t>
-      </w:r>
-      <w:bookmarkEnd w:id="35"/>
     </w:p>
     <w:p/>
     <w:p>
@@ -11518,7 +10954,7 @@
           <w:rFonts w:cs="Times New Roman"/>
         </w:rPr>
       </w:pPr>
-      <w:bookmarkStart w:id="36" w:name="_Toc228041496"/>
+      <w:bookmarkStart w:id="35" w:name="_Toc228041496"/>
       <w:r>
         <w:rPr>
           <w:rFonts w:cs="Times New Roman"/>
@@ -11526,7 +10962,7 @@
         <w:lastRenderedPageBreak/>
         <w:t>ЗАКЛЮЧЕНИЕ</w:t>
       </w:r>
-      <w:bookmarkEnd w:id="36"/>
+      <w:bookmarkEnd w:id="35"/>
     </w:p>
     <w:p>
       <w:pPr>
@@ -11572,7 +11008,7 @@
           <w:rFonts w:cs="Times New Roman"/>
         </w:rPr>
       </w:pPr>
-      <w:bookmarkStart w:id="37" w:name="_Toc228041497"/>
+      <w:bookmarkStart w:id="36" w:name="_Toc228041497"/>
       <w:r>
         <w:rPr>
           <w:rFonts w:cs="Times New Roman"/>
@@ -11580,7 +11016,7 @@
         <w:lastRenderedPageBreak/>
         <w:t>СПИСОК ИСПОЛЬЗОВАННЫХ ИСТОЧНИКОВ</w:t>
       </w:r>
-      <w:bookmarkEnd w:id="37"/>
+      <w:bookmarkEnd w:id="36"/>
     </w:p>
     <w:p>
       <w:pPr>
@@ -11891,7 +11327,7 @@
         </w:rPr>
         <w:t xml:space="preserve"> </w:t>
       </w:r>
-      <w:hyperlink r:id="rId18" w:history="1">
+      <w:hyperlink r:id="rId16" w:history="1">
         <w:r>
           <w:rPr>
             <w:rStyle w:val="Hyperlink"/>
@@ -13101,7 +12537,7 @@
           <w:rFonts w:cs="Times New Roman"/>
         </w:rPr>
       </w:pPr>
-      <w:bookmarkStart w:id="38" w:name="_Toc228041498"/>
+      <w:bookmarkStart w:id="37" w:name="_Toc228041498"/>
       <w:r>
         <w:rPr>
           <w:rFonts w:cs="Times New Roman"/>
@@ -13109,26 +12545,19 @@
         <w:lastRenderedPageBreak/>
         <w:t>ПРИЛОЖЕНИЕ А</w:t>
       </w:r>
+      <w:bookmarkEnd w:id="37"/>
+    </w:p>
+    <w:p>
+      <w:pPr>
+        <w:ind w:left="0"/>
+      </w:pPr>
+    </w:p>
+    <w:p>
+      <w:pPr>
+        <w:ind w:left="0"/>
+      </w:pPr>
+      <w:bookmarkStart w:id="38" w:name="_GoBack"/>
       <w:bookmarkEnd w:id="38"/>
-      <w:r>
-        <w:rPr>
-          <w:rFonts w:cs="Times New Roman"/>
-        </w:rPr>
-        <w:br/>
-      </w:r>
-    </w:p>
-    <w:p>
-      <w:pPr>
-        <w:pStyle w:val="a"/>
-        <w:numPr>
-          <w:ilvl w:val="0"/>
-          <w:numId w:val="0"/>
-        </w:numPr>
-        <w:rPr>
-          <w:rFonts w:cs="Times New Roman"/>
-          <w:sz w:val="24"/>
-        </w:rPr>
-      </w:pPr>
     </w:p>
     <w:p>
       <w:pPr>
@@ -13228,6 +12657,11 @@
         <w:docPartUnique/>
       </w:docPartObj>
     </w:sdtPr>
+    <w:sdtEndPr>
+      <w:rPr>
+        <w:rStyle w:val="PageNumber"/>
+      </w:rPr>
+    </w:sdtEndPr>
     <w:sdtContent>
       <w:p>
         <w:pPr>
@@ -13279,6 +12713,11 @@
         <w:docPartUnique/>
       </w:docPartObj>
     </w:sdtPr>
+    <w:sdtEndPr>
+      <w:rPr>
+        <w:rStyle w:val="PageNumber"/>
+      </w:rPr>
+    </w:sdtEndPr>
     <w:sdtContent>
       <w:p>
         <w:pPr>
@@ -14236,6 +13675,119 @@
     </w:lvl>
   </w:abstractNum>
   <w:abstractNum w:abstractNumId="8" w15:restartNumberingAfterBreak="0">
+    <w:nsid w:val="3C0B2746"/>
+    <w:multiLevelType w:val="hybridMultilevel"/>
+    <w:tmpl w:val="8FA8841C"/>
+    <w:lvl w:ilvl="0" w:tplc="FC4C96BC">
+      <w:start w:val="1"/>
+      <w:numFmt w:val="bullet"/>
+      <w:lvlText w:val=""/>
+      <w:lvlJc w:val="left"/>
+      <w:pPr>
+        <w:ind w:left="1429" w:hanging="360"/>
+      </w:pPr>
+      <w:rPr>
+        <w:rFonts w:ascii="Symbol" w:hAnsi="Symbol" w:hint="default"/>
+      </w:rPr>
+    </w:lvl>
+    <w:lvl w:ilvl="1" w:tplc="04090003" w:tentative="1">
+      <w:start w:val="1"/>
+      <w:numFmt w:val="bullet"/>
+      <w:lvlText w:val="o"/>
+      <w:lvlJc w:val="left"/>
+      <w:pPr>
+        <w:ind w:left="2160" w:hanging="360"/>
+      </w:pPr>
+      <w:rPr>
+        <w:rFonts w:ascii="Courier New" w:hAnsi="Courier New" w:cs="Courier New" w:hint="default"/>
+      </w:rPr>
+    </w:lvl>
+    <w:lvl w:ilvl="2" w:tplc="04090005" w:tentative="1">
+      <w:start w:val="1"/>
+      <w:numFmt w:val="bullet"/>
+      <w:lvlText w:val=""/>
+      <w:lvlJc w:val="left"/>
+      <w:pPr>
+        <w:ind w:left="2880" w:hanging="360"/>
+      </w:pPr>
+      <w:rPr>
+        <w:rFonts w:ascii="Wingdings" w:hAnsi="Wingdings" w:hint="default"/>
+      </w:rPr>
+    </w:lvl>
+    <w:lvl w:ilvl="3" w:tplc="04090001" w:tentative="1">
+      <w:start w:val="1"/>
+      <w:numFmt w:val="bullet"/>
+      <w:lvlText w:val=""/>
+      <w:lvlJc w:val="left"/>
+      <w:pPr>
+        <w:ind w:left="3600" w:hanging="360"/>
+      </w:pPr>
+      <w:rPr>
+        <w:rFonts w:ascii="Symbol" w:hAnsi="Symbol" w:hint="default"/>
+      </w:rPr>
+    </w:lvl>
+    <w:lvl w:ilvl="4" w:tplc="04090003" w:tentative="1">
+      <w:start w:val="1"/>
+      <w:numFmt w:val="bullet"/>
+      <w:lvlText w:val="o"/>
+      <w:lvlJc w:val="left"/>
+      <w:pPr>
+        <w:ind w:left="4320" w:hanging="360"/>
+      </w:pPr>
+      <w:rPr>
+        <w:rFonts w:ascii="Courier New" w:hAnsi="Courier New" w:cs="Courier New" w:hint="default"/>
+      </w:rPr>
+    </w:lvl>
+    <w:lvl w:ilvl="5" w:tplc="04090005" w:tentative="1">
+      <w:start w:val="1"/>
+      <w:numFmt w:val="bullet"/>
+      <w:lvlText w:val=""/>
+      <w:lvlJc w:val="left"/>
+      <w:pPr>
+        <w:ind w:left="5040" w:hanging="360"/>
+      </w:pPr>
+      <w:rPr>
+        <w:rFonts w:ascii="Wingdings" w:hAnsi="Wingdings" w:hint="default"/>
+      </w:rPr>
+    </w:lvl>
+    <w:lvl w:ilvl="6" w:tplc="04090001" w:tentative="1">
+      <w:start w:val="1"/>
+      <w:numFmt w:val="bullet"/>
+      <w:lvlText w:val=""/>
+      <w:lvlJc w:val="left"/>
+      <w:pPr>
+        <w:ind w:left="5760" w:hanging="360"/>
+      </w:pPr>
+      <w:rPr>
+        <w:rFonts w:ascii="Symbol" w:hAnsi="Symbol" w:hint="default"/>
+      </w:rPr>
+    </w:lvl>
+    <w:lvl w:ilvl="7" w:tplc="04090003" w:tentative="1">
+      <w:start w:val="1"/>
+      <w:numFmt w:val="bullet"/>
+      <w:lvlText w:val="o"/>
+      <w:lvlJc w:val="left"/>
+      <w:pPr>
+        <w:ind w:left="6480" w:hanging="360"/>
+      </w:pPr>
+      <w:rPr>
+        <w:rFonts w:ascii="Courier New" w:hAnsi="Courier New" w:cs="Courier New" w:hint="default"/>
+      </w:rPr>
+    </w:lvl>
+    <w:lvl w:ilvl="8" w:tplc="04090005" w:tentative="1">
+      <w:start w:val="1"/>
+      <w:numFmt w:val="bullet"/>
+      <w:lvlText w:val=""/>
+      <w:lvlJc w:val="left"/>
+      <w:pPr>
+        <w:ind w:left="7200" w:hanging="360"/>
+      </w:pPr>
+      <w:rPr>
+        <w:rFonts w:ascii="Wingdings" w:hAnsi="Wingdings" w:hint="default"/>
+      </w:rPr>
+    </w:lvl>
+  </w:abstractNum>
+  <w:abstractNum w:abstractNumId="9" w15:restartNumberingAfterBreak="0">
     <w:nsid w:val="43F0029D"/>
     <w:multiLevelType w:val="multilevel"/>
     <w:tmpl w:val="D8BAD2E0"/>
@@ -14325,7 +13877,7 @@
       </w:pPr>
     </w:lvl>
   </w:abstractNum>
-  <w:abstractNum w:abstractNumId="9" w15:restartNumberingAfterBreak="0">
+  <w:abstractNum w:abstractNumId="10" w15:restartNumberingAfterBreak="0">
     <w:nsid w:val="4E2A56F3"/>
     <w:multiLevelType w:val="hybridMultilevel"/>
     <w:tmpl w:val="A0F4588A"/>
@@ -14438,7 +13990,7 @@
       </w:rPr>
     </w:lvl>
   </w:abstractNum>
-  <w:abstractNum w:abstractNumId="10" w15:restartNumberingAfterBreak="0">
+  <w:abstractNum w:abstractNumId="11" w15:restartNumberingAfterBreak="0">
     <w:nsid w:val="4E3627B5"/>
     <w:multiLevelType w:val="hybridMultilevel"/>
     <w:tmpl w:val="E4F6405C"/>
@@ -14551,7 +14103,7 @@
       </w:rPr>
     </w:lvl>
   </w:abstractNum>
-  <w:abstractNum w:abstractNumId="11" w15:restartNumberingAfterBreak="0">
+  <w:abstractNum w:abstractNumId="12" w15:restartNumberingAfterBreak="0">
     <w:nsid w:val="51F8549E"/>
     <w:multiLevelType w:val="multilevel"/>
     <w:tmpl w:val="CF382E1C"/>
@@ -14641,7 +14193,7 @@
       </w:pPr>
     </w:lvl>
   </w:abstractNum>
-  <w:abstractNum w:abstractNumId="12" w15:restartNumberingAfterBreak="0">
+  <w:abstractNum w:abstractNumId="13" w15:restartNumberingAfterBreak="0">
     <w:nsid w:val="53441929"/>
     <w:multiLevelType w:val="multilevel"/>
     <w:tmpl w:val="A022B862"/>
@@ -14731,7 +14283,7 @@
       </w:pPr>
     </w:lvl>
   </w:abstractNum>
-  <w:abstractNum w:abstractNumId="13" w15:restartNumberingAfterBreak="0">
+  <w:abstractNum w:abstractNumId="14" w15:restartNumberingAfterBreak="0">
     <w:nsid w:val="5962453A"/>
     <w:multiLevelType w:val="multilevel"/>
     <w:tmpl w:val="DCCAE090"/>
@@ -14851,7 +14403,7 @@
       </w:rPr>
     </w:lvl>
   </w:abstractNum>
-  <w:abstractNum w:abstractNumId="14" w15:restartNumberingAfterBreak="0">
+  <w:abstractNum w:abstractNumId="15" w15:restartNumberingAfterBreak="0">
     <w:nsid w:val="66A75CBE"/>
     <w:multiLevelType w:val="multilevel"/>
     <w:tmpl w:val="0262AD2A"/>
@@ -14941,7 +14493,7 @@
       </w:pPr>
     </w:lvl>
   </w:abstractNum>
-  <w:abstractNum w:abstractNumId="15" w15:restartNumberingAfterBreak="0">
+  <w:abstractNum w:abstractNumId="16" w15:restartNumberingAfterBreak="0">
     <w:nsid w:val="79C543A3"/>
     <w:multiLevelType w:val="hybridMultilevel"/>
     <w:tmpl w:val="1CC28B06"/>
@@ -15055,19 +14607,19 @@
     </w:lvl>
   </w:abstractNum>
   <w:num w:numId="1">
-    <w:abstractNumId w:val="14"/>
+    <w:abstractNumId w:val="15"/>
   </w:num>
   <w:num w:numId="2">
+    <w:abstractNumId w:val="13"/>
+  </w:num>
+  <w:num w:numId="3">
+    <w:abstractNumId w:val="9"/>
+  </w:num>
+  <w:num w:numId="4">
     <w:abstractNumId w:val="12"/>
   </w:num>
-  <w:num w:numId="3">
-    <w:abstractNumId w:val="8"/>
-  </w:num>
-  <w:num w:numId="4">
-    <w:abstractNumId w:val="11"/>
-  </w:num>
   <w:num w:numId="5">
-    <w:abstractNumId w:val="13"/>
+    <w:abstractNumId w:val="14"/>
   </w:num>
   <w:num w:numId="6">
     <w:abstractNumId w:val="1"/>
@@ -15076,10 +14628,10 @@
     <w:abstractNumId w:val="5"/>
   </w:num>
   <w:num w:numId="8">
-    <w:abstractNumId w:val="9"/>
+    <w:abstractNumId w:val="10"/>
   </w:num>
   <w:num w:numId="9">
-    <w:abstractNumId w:val="10"/>
+    <w:abstractNumId w:val="11"/>
   </w:num>
   <w:num w:numId="10">
     <w:abstractNumId w:val="7"/>
@@ -15097,10 +14649,13 @@
     <w:abstractNumId w:val="3"/>
   </w:num>
   <w:num w:numId="15">
-    <w:abstractNumId w:val="15"/>
+    <w:abstractNumId w:val="16"/>
   </w:num>
   <w:num w:numId="16">
     <w:abstractNumId w:val="4"/>
+  </w:num>
+  <w:num w:numId="17">
+    <w:abstractNumId w:val="8"/>
   </w:num>
   <w:numIdMacAtCleanup w:val="16"/>
 </w:numbering>
@@ -16447,7 +16002,7 @@
 </file>
 
 <file path=customXml/itemProps1.xml><?xml version="1.0" encoding="utf-8"?>
-<ds:datastoreItem xmlns:ds="http://schemas.openxmlformats.org/officeDocument/2006/customXml" ds:itemID="{F2CFA9A1-7FEA-2446-8D92-ED0955DE4767}">
+<ds:datastoreItem xmlns:ds="http://schemas.openxmlformats.org/officeDocument/2006/customXml" ds:itemID="{7C75A5DA-1FDD-A942-BC46-E2AF47EB7499}">
   <ds:schemaRefs>
     <ds:schemaRef ds:uri="http://schemas.openxmlformats.org/officeDocument/2006/bibliography"/>
   </ds:schemaRefs>

</xml_diff>

<commit_message>
3 chapter: analys & design finish
</commit_message>
<xml_diff>
--- a/ВКР Киво Михаил.docx
+++ b/ВКР Киво Михаил.docx
@@ -9959,13 +9959,7 @@
         <w:rPr>
           <w:lang w:eastAsia="ru-RU"/>
         </w:rPr>
-        <w:t>1.4.</w:t>
-      </w:r>
-      <w:r>
-        <w:rPr>
-          <w:lang w:eastAsia="ru-RU"/>
-        </w:rPr>
-        <w:t>2</w:t>
+        <w:t>1.4.2</w:t>
       </w:r>
       <w:r>
         <w:rPr>
@@ -10199,13 +10193,7 @@
         <w:rPr>
           <w:lang w:val="en-US" w:eastAsia="ru-RU"/>
         </w:rPr>
-        <w:t>1.4.</w:t>
-      </w:r>
-      <w:r>
-        <w:rPr>
-          <w:lang w:val="en-US" w:eastAsia="ru-RU"/>
-        </w:rPr>
-        <w:t>2</w:t>
+        <w:t>1.4.2</w:t>
       </w:r>
       <w:r>
         <w:rPr>
@@ -14277,10 +14265,7 @@
         <w:t>Б</w:t>
       </w:r>
       <w:r>
-        <w:t>изнес-логика</w:t>
-      </w:r>
-      <w:r>
-        <w:t xml:space="preserve"> </w:t>
+        <w:t xml:space="preserve">изнес-логика </w:t>
       </w:r>
       <w:r>
         <w:t xml:space="preserve">в </w:t>
@@ -14610,10 +14595,7 @@
         <w:t xml:space="preserve"> </w:t>
       </w:r>
       <w:r>
-        <w:t>К</w:t>
-      </w:r>
-      <w:r>
-        <w:t>лиент</w:t>
+        <w:t>Клиент</w:t>
       </w:r>
       <w:r>
         <w:t xml:space="preserve"> </w:t>
@@ -15147,13 +15129,7 @@
         <w:t xml:space="preserve"> технологии, контейнеры и сетевые интерфейсы. </w:t>
       </w:r>
       <w:r>
-        <w:t>Т</w:t>
-      </w:r>
-      <w:r>
-        <w:t xml:space="preserve">акже </w:t>
-      </w:r>
-      <w:r>
-        <w:t>о</w:t>
+        <w:t>Также о</w:t>
       </w:r>
       <w:r>
         <w:t xml:space="preserve">на </w:t>
@@ -15162,10 +15138,7 @@
         <w:t xml:space="preserve">демонстрирует, как система реализована в реальной инфраструктуре и отвечает на три ключевых вопроса: какие </w:t>
       </w:r>
       <w:r>
-        <w:t>задействованы</w:t>
-      </w:r>
-      <w:r>
-        <w:t xml:space="preserve"> </w:t>
+        <w:t xml:space="preserve">задействованы </w:t>
       </w:r>
       <w:r>
         <w:t>технологии, где они размещены и как взаимодействуют между собой.</w:t>
@@ -15974,10 +15947,7 @@
         <w:t xml:space="preserve">Рисунок </w:t>
       </w:r>
       <w:r>
-        <w:t>2.4.1</w:t>
-      </w:r>
-      <w:r>
-        <w:t xml:space="preserve"> -</w:t>
+        <w:t>2.4.1 -</w:t>
       </w:r>
       <w:r>
         <w:t xml:space="preserve"> Диаграмма развёртывания системы суммаризации протоколов встреч</w:t>
@@ -17235,13 +17205,7 @@
         <w:t xml:space="preserve">Дерево файловой структуры </w:t>
       </w:r>
       <w:r>
-        <w:t xml:space="preserve">показано на рисунке </w:t>
-      </w:r>
-      <w:r>
-        <w:t>2.5.4.1</w:t>
-      </w:r>
-      <w:r>
-        <w:t xml:space="preserve"> и </w:t>
+        <w:t xml:space="preserve">показано на рисунке 2.5.4.1 и </w:t>
       </w:r>
       <w:r>
         <w:t xml:space="preserve">демонстрирует, как архитектурные слои реализованы в кодовой базе. Особое внимание уделено разделению слоев, что соответствует принципам слоистой архитектуры и обеспечивает тестируемость и </w:t>
@@ -24068,10 +24032,7 @@
         <w:t>авторизаци</w:t>
       </w:r>
       <w:r>
-        <w:t>я</w:t>
-      </w:r>
-      <w:r>
-        <w:t xml:space="preserve"> </w:t>
+        <w:t xml:space="preserve">я </w:t>
       </w:r>
       <w:r>
         <w:t>отсутствует</w:t>
@@ -24411,98 +24372,1427 @@
       </w:r>
       <w:bookmarkEnd w:id="50"/>
     </w:p>
-    <w:p/>
+    <w:p>
+      <w:pPr>
+        <w:ind w:left="0" w:firstLine="720"/>
+      </w:pPr>
+      <w:r>
+        <w:t>Разработка мобильного приложения для автоматической суммаризации протоколов встреч ставит перед собой задачу обеспечить пользователям удобный, безопасный и конфиденциальный инструмент для фиксации ключевых решений и выводов, сделанных в ходе обсуждений. В отличие от традиционных систем записи и расшифровки, данное решение делает акцент на защите приватности: аудиозапись и полная транскрипция удаляются спустя три часа после завершения встречи и недоступны пользователю напрямую. Вместо этого ему предоставляется только структурированная и нейтральная суммаризация, из которой исключены неформальные высказывания, шутки и нецензурная лексика. Такой подход позволяет участникам встреч говорить свободно, не опасаясь, что их слова будут сохранены в первоначальном виде.</w:t>
+      </w:r>
+    </w:p>
+    <w:p>
+      <w:pPr>
+        <w:ind w:left="0" w:firstLine="720"/>
+      </w:pPr>
+      <w:r>
+        <w:t xml:space="preserve">На этапе анализа требований были выделены как функциональные, так и нефункциональные аспекты системы. С точки зрения функциональности, приложение должно поддерживать создание новой встречи с автоматической записью аудио, загрузку уже существующего аудиофайла для последующей обработки, фоновую отправку </w:t>
+      </w:r>
+      <w:proofErr w:type="spellStart"/>
+      <w:r>
+        <w:t>аудиочанков</w:t>
+      </w:r>
+      <w:proofErr w:type="spellEnd"/>
+      <w:r>
+        <w:t xml:space="preserve"> на сервер даже при отсутствии </w:t>
+      </w:r>
+      <w:proofErr w:type="spellStart"/>
+      <w:r>
+        <w:t>интернет-соединения</w:t>
+      </w:r>
+      <w:proofErr w:type="spellEnd"/>
+      <w:r>
+        <w:t>, получение и отображение суммаризации по завершении обработки, а также возможность задавать уточняющие вопросы к результату через встроенный чат. Все взаимодействие с моделью искусственного интеллекта происходит на стороне сервера: клиентская часть ограничивается отображением данных и управлением потоком записи. Это позволило упростить архитектуру мобильного приложения и снизить требования к ресурсам устройства.</w:t>
+      </w:r>
+    </w:p>
+    <w:p>
+      <w:pPr>
+        <w:ind w:left="0" w:firstLine="720"/>
+      </w:pPr>
+      <w:r>
+        <w:t xml:space="preserve">Особое внимание при проектировании было уделено нефункциональным характеристикам. Во-первых, система должна быть надёжной: даже при нестабильном соединении или переходе приложения в фон запись не должна теряться. Для этого реализован механизм разбиения </w:t>
+      </w:r>
+      <w:proofErr w:type="spellStart"/>
+      <w:r>
+        <w:t>аудиопотока</w:t>
+      </w:r>
+      <w:proofErr w:type="spellEnd"/>
+      <w:r>
+        <w:t xml:space="preserve"> на 5-минутные </w:t>
+      </w:r>
+      <w:proofErr w:type="spellStart"/>
+      <w:r>
+        <w:t>чанки</w:t>
+      </w:r>
+      <w:proofErr w:type="spellEnd"/>
+      <w:r>
+        <w:t xml:space="preserve"> с метками порядка и признака завершения, </w:t>
+      </w:r>
+      <w:r>
+        <w:lastRenderedPageBreak/>
+        <w:t xml:space="preserve">которые отправляются на сервер по мере доступности сети. Во-вторых, важна производительность, пользователь должен получить итоговую </w:t>
+      </w:r>
+      <w:proofErr w:type="spellStart"/>
+      <w:r>
+        <w:t>суммаризацию</w:t>
+      </w:r>
+      <w:proofErr w:type="spellEnd"/>
+      <w:r>
+        <w:t xml:space="preserve"> в течение нескольких минут после окончания встречи, независимо от её продолжительности. Это достигается за счёт параллельной обработки </w:t>
+      </w:r>
+      <w:proofErr w:type="spellStart"/>
+      <w:r>
+        <w:t>чанков</w:t>
+      </w:r>
+      <w:proofErr w:type="spellEnd"/>
+      <w:r>
+        <w:t xml:space="preserve"> и использования </w:t>
+      </w:r>
+      <w:proofErr w:type="spellStart"/>
+      <w:r>
+        <w:t>стримингового</w:t>
+      </w:r>
+      <w:proofErr w:type="spellEnd"/>
+      <w:r>
+        <w:t xml:space="preserve"> API внешней языковой модели. В-третьих, безопасность и конфиденциальность являются ключевыми принципами архитектуры: все чувствительные данные хранятся временно в </w:t>
+      </w:r>
+      <w:proofErr w:type="spellStart"/>
+      <w:r>
+        <w:t>Redis</w:t>
+      </w:r>
+      <w:proofErr w:type="spellEnd"/>
+      <w:r>
+        <w:t xml:space="preserve"> и удаляются сразу после генерации итога, а постоянное хранилище содержит только очищенную </w:t>
+      </w:r>
+      <w:proofErr w:type="spellStart"/>
+      <w:r>
+        <w:t>суммаризацию</w:t>
+      </w:r>
+      <w:proofErr w:type="spellEnd"/>
+      <w:r>
+        <w:t xml:space="preserve"> и историю чатов в формате JSONB. Доступ к базе данных имеет только централизованный сервис встреч, что минимизирует риски несанкционированного доступа.</w:t>
+      </w:r>
+    </w:p>
+    <w:p>
+      <w:pPr>
+        <w:ind w:left="0" w:firstLine="720"/>
+      </w:pPr>
+      <w:r>
+        <w:t xml:space="preserve">Планирование разработки осуществлялось итеративно с использованием гибкого подхода. Проект был разделён на три основных этапа: проектирование и настройка </w:t>
+      </w:r>
+      <w:proofErr w:type="spellStart"/>
+      <w:r>
+        <w:t>backend</w:t>
+      </w:r>
+      <w:proofErr w:type="spellEnd"/>
+      <w:r>
+        <w:t xml:space="preserve">-инфраструктуры, реализация мобильного клиента и интеграционное тестирование. На первом этапе была развёрнута </w:t>
+      </w:r>
+      <w:proofErr w:type="spellStart"/>
+      <w:r>
+        <w:t>микросервисная</w:t>
+      </w:r>
+      <w:proofErr w:type="spellEnd"/>
+      <w:r>
+        <w:t xml:space="preserve"> архитектура на базе Java и </w:t>
+      </w:r>
+      <w:proofErr w:type="spellStart"/>
+      <w:r>
+        <w:t>Python</w:t>
+      </w:r>
+      <w:proofErr w:type="spellEnd"/>
+      <w:r>
+        <w:t xml:space="preserve"> с использованием </w:t>
+      </w:r>
+      <w:proofErr w:type="spellStart"/>
+      <w:r>
+        <w:t>RabbitMQ</w:t>
+      </w:r>
+      <w:proofErr w:type="spellEnd"/>
+      <w:r>
+        <w:t xml:space="preserve"> для асинхронного взаимодействия между компонентами, </w:t>
+      </w:r>
+      <w:proofErr w:type="spellStart"/>
+      <w:r>
+        <w:t>Redis</w:t>
+      </w:r>
+      <w:proofErr w:type="spellEnd"/>
+      <w:r>
+        <w:t xml:space="preserve"> для временного хранения аудио и транскрипций, а также PostgreSQL для постоянных данных. Был реализован REST API с поддержкой </w:t>
+      </w:r>
+      <w:proofErr w:type="spellStart"/>
+      <w:r>
+        <w:t>event</w:t>
+      </w:r>
+      <w:proofErr w:type="spellEnd"/>
+      <w:r>
+        <w:t xml:space="preserve"> </w:t>
+      </w:r>
+      <w:proofErr w:type="spellStart"/>
+      <w:r>
+        <w:t>streaming</w:t>
+      </w:r>
+      <w:proofErr w:type="spellEnd"/>
+      <w:r>
+        <w:t xml:space="preserve"> для передачи ответов от языковой модели в реальном времени. На втором этапе разрабатывался </w:t>
+      </w:r>
+      <w:proofErr w:type="spellStart"/>
+      <w:r>
+        <w:t>Android</w:t>
+      </w:r>
+      <w:proofErr w:type="spellEnd"/>
+      <w:r>
+        <w:t xml:space="preserve">-клиент на </w:t>
+      </w:r>
+      <w:proofErr w:type="spellStart"/>
+      <w:r>
+        <w:t>Kotlin</w:t>
+      </w:r>
+      <w:proofErr w:type="spellEnd"/>
+      <w:r>
+        <w:t xml:space="preserve"> с использованием архитектурного паттерна MVVM и библиотеки </w:t>
+      </w:r>
+      <w:proofErr w:type="spellStart"/>
+      <w:r>
+        <w:t>Retrofit</w:t>
+      </w:r>
+      <w:proofErr w:type="spellEnd"/>
+      <w:r>
+        <w:t xml:space="preserve"> для сетевого взаимодействия. Интерфейс был спроектирован максимально просто: главный экран с списком встреч, карточка встречи с вкладками «Параметры» и «Чаты», а также экран самого чата с возможностью прокрутки диалога. Третий этап включал комплексное тестирование всех сценариев: запись офлайн, восстановление соединения, обработка длинных встреч, проверка корректности удаления данных и устойчивость к ошибкам внешних сервисов.</w:t>
+      </w:r>
+    </w:p>
+    <w:p>
+      <w:pPr>
+        <w:ind w:left="0" w:firstLine="720"/>
+      </w:pPr>
+      <w:r>
+        <w:t xml:space="preserve">В процессе планирования были учтены потенциальные риски. Основными из них являлись зависимость от внешнего API языковой модели, </w:t>
+      </w:r>
+      <w:r>
+        <w:lastRenderedPageBreak/>
+        <w:t xml:space="preserve">возможные задержки при </w:t>
+      </w:r>
+      <w:proofErr w:type="spellStart"/>
+      <w:r>
+        <w:t>транскрибации</w:t>
+      </w:r>
+      <w:proofErr w:type="spellEnd"/>
+      <w:r>
+        <w:t xml:space="preserve"> и необходимость соблюдения строгих временных рамок для удаления данных. Для минимизации этих рисков были предусмотрены механизмы повторных попыток, кэширование промежуточных результатов и строгий таймер на стороне </w:t>
+      </w:r>
+      <w:proofErr w:type="spellStart"/>
+      <w:r>
+        <w:t>meeting</w:t>
+      </w:r>
+      <w:proofErr w:type="spellEnd"/>
+      <w:r>
+        <w:t>-сервиса, который гарантирует удаление всех временных данных спустя три часа после завершения встречи, независимо от состояния других компонентов. Таким образом, архитектура и план разработки были направлены на создание решения, которое сочетает в себе простоту использования, высокую степень приватности и техническую надёжность.</w:t>
+      </w:r>
+    </w:p>
+    <w:p>
+      <w:pPr>
+        <w:pStyle w:val="Heading3"/>
+      </w:pPr>
+      <w:r>
+        <w:t>Функциональные требования</w:t>
+      </w:r>
+    </w:p>
+    <w:p>
+      <w:pPr>
+        <w:ind w:left="0" w:firstLine="720"/>
+      </w:pPr>
+      <w:r>
+        <w:t xml:space="preserve">Функциональные требования к разрабатываемой системе определяют основные возможности, которые должны быть реализованы для достижения цели проекта, создания мобильного приложения для конфиденциальной суммаризации встреч. Прежде всего, система должна поддерживать запись аудио непосредственно во время встречи с возможностью работы в офлайн-режиме. Это означает, что даже при отсутствии </w:t>
+      </w:r>
+      <w:proofErr w:type="spellStart"/>
+      <w:r>
+        <w:t>интернет-соединения</w:t>
+      </w:r>
+      <w:proofErr w:type="spellEnd"/>
+      <w:r>
+        <w:t xml:space="preserve"> запись не прерывается: </w:t>
+      </w:r>
+      <w:proofErr w:type="spellStart"/>
+      <w:r>
+        <w:t>аудиопоток</w:t>
+      </w:r>
+      <w:proofErr w:type="spellEnd"/>
+      <w:r>
+        <w:t xml:space="preserve"> разбивается на </w:t>
+      </w:r>
+      <w:proofErr w:type="spellStart"/>
+      <w:r>
+        <w:t>чанки</w:t>
+      </w:r>
+      <w:proofErr w:type="spellEnd"/>
+      <w:r>
+        <w:t xml:space="preserve"> по пять минут, временно сохраняется на устройстве и отправляется на сервер сразу после восстановления связи. Такой подход обеспечивает непрерывность сбора данных и удобство использования в условиях нестабильной сети.</w:t>
+      </w:r>
+    </w:p>
+    <w:p>
+      <w:pPr>
+        <w:ind w:left="0" w:firstLine="720"/>
+      </w:pPr>
+      <w:r>
+        <w:t xml:space="preserve">Вторым ключевым функционалом является автоматическая </w:t>
+      </w:r>
+      <w:proofErr w:type="spellStart"/>
+      <w:r>
+        <w:t>транскрибация</w:t>
+      </w:r>
+      <w:proofErr w:type="spellEnd"/>
+      <w:r>
+        <w:t xml:space="preserve"> и последующая суммаризация. Каждый полученный </w:t>
+      </w:r>
+      <w:proofErr w:type="spellStart"/>
+      <w:r>
+        <w:t>аудиочанк</w:t>
+      </w:r>
+      <w:proofErr w:type="spellEnd"/>
+      <w:r>
+        <w:t xml:space="preserve"> обрабатывается отдельно, что позволяет начать </w:t>
+      </w:r>
+      <w:proofErr w:type="spellStart"/>
+      <w:r>
+        <w:t>транскрибацию</w:t>
+      </w:r>
+      <w:proofErr w:type="spellEnd"/>
+      <w:r>
+        <w:t xml:space="preserve"> ещё до окончания встречи и значительно ускорить выдачу итогового результата. После завершения всех этапов обработки пользователь получает структурированную сводку, в которой отражены только содержательные моменты обсуждения. Для этого при генерации суммаризации используется специализированный </w:t>
+      </w:r>
+      <w:proofErr w:type="spellStart"/>
+      <w:r>
+        <w:t>промпт</w:t>
+      </w:r>
+      <w:proofErr w:type="spellEnd"/>
+      <w:r>
+        <w:t xml:space="preserve">, явно указывающий языковой модели игнорировать неформальные выражения, шутки, эмоциональные реплики и ненормативную лексику. Таким образом, финальный текст остаётся </w:t>
+      </w:r>
+      <w:r>
+        <w:lastRenderedPageBreak/>
+        <w:t>нейтральным, деловым и пригодным для дальнейшего использования в рабочих целях.</w:t>
+      </w:r>
+    </w:p>
+    <w:p>
+      <w:pPr>
+        <w:ind w:left="0" w:firstLine="630"/>
+      </w:pPr>
+      <w:r>
+        <w:t>Также система должна обеспечивать возможность взаимодействия с результатом через встроенный чат: пользователь может задавать уточняющие вопросы по содержанию встречи, а ответы генерируются на основе уже сохранённой суммаризации. Важно подчеркнуть, что ни аудиофайлы, ни полная транскрипция никогда не отображаются в интерфейсе и недоступны для скачивания или просмотра. Спустя три часа после окончания встречи все временные данные</w:t>
+      </w:r>
+      <w:r>
+        <w:t>,</w:t>
+      </w:r>
+      <w:r>
+        <w:t xml:space="preserve"> как аудиочанки, так и промежуточная транскрипция</w:t>
+      </w:r>
+      <w:r>
+        <w:t xml:space="preserve">, </w:t>
+      </w:r>
+      <w:r>
+        <w:t xml:space="preserve">автоматически удаляются из системы. Эта функция реализована на уровне </w:t>
+      </w:r>
+      <w:proofErr w:type="spellStart"/>
+      <w:r>
+        <w:t>backend</w:t>
+      </w:r>
+      <w:proofErr w:type="spellEnd"/>
+      <w:r>
+        <w:t>-сервиса и не зависит от действий пользователя, что гарантирует соблюдение принципа конфиденциальности.</w:t>
+      </w:r>
+    </w:p>
+    <w:p>
+      <w:pPr>
+        <w:pStyle w:val="Heading3"/>
+      </w:pPr>
+      <w:r>
+        <w:t>Нефункциональные требования</w:t>
+      </w:r>
+    </w:p>
+    <w:p>
+      <w:pPr>
+        <w:ind w:left="0" w:firstLine="720"/>
+      </w:pPr>
+      <w:r>
+        <w:t xml:space="preserve">Нефункциональные требования направлены на обеспечение надёжности, производительности, безопасности и удобства использования системы. Одним из главных критериев является производительность: пользователь должен получать итоговую </w:t>
+      </w:r>
+      <w:proofErr w:type="spellStart"/>
+      <w:r>
+        <w:t>суммаризацию</w:t>
+      </w:r>
+      <w:proofErr w:type="spellEnd"/>
+      <w:r>
+        <w:t xml:space="preserve"> в течение 3–4 минут после завершения встречи, даже если её продолжительность составила несколько часов. Достижение этого показателя стало возможным благодаря параллельной обработке </w:t>
+      </w:r>
+      <w:proofErr w:type="spellStart"/>
+      <w:r>
+        <w:t>чанков</w:t>
+      </w:r>
+      <w:proofErr w:type="spellEnd"/>
+      <w:r>
+        <w:t xml:space="preserve"> и использованию </w:t>
+      </w:r>
+      <w:proofErr w:type="spellStart"/>
+      <w:r>
+        <w:t>стримингового</w:t>
+      </w:r>
+      <w:proofErr w:type="spellEnd"/>
+      <w:r>
+        <w:t xml:space="preserve"> API внешней языковой модели, что минимизирует общее время ожидания.</w:t>
+      </w:r>
+    </w:p>
+    <w:p>
+      <w:pPr>
+        <w:ind w:left="0" w:firstLine="720"/>
+      </w:pPr>
+      <w:r>
+        <w:t xml:space="preserve">Надёжность системы обеспечивается за счёт устойчивости к сбоям сети и корректной обработке офлайн-сценариев. Мобильное приложение сохраняет аудиочанки локально до успешной отправки на сервер, а </w:t>
+      </w:r>
+      <w:proofErr w:type="spellStart"/>
+      <w:r>
+        <w:t>backend</w:t>
+      </w:r>
+      <w:proofErr w:type="spellEnd"/>
+      <w:r>
+        <w:t xml:space="preserve">-компоненты реализуют механизмы повторных попыток и подтверждения доставки. Безопасность и конфиденциальность являются приоритетными аспектами архитектуры: все чувствительные данные хранятся временно в </w:t>
+      </w:r>
+      <w:proofErr w:type="spellStart"/>
+      <w:r>
+        <w:t>Redis</w:t>
+      </w:r>
+      <w:proofErr w:type="spellEnd"/>
+      <w:r>
+        <w:t xml:space="preserve"> и удаляются по истечении трёхчасового окна; постоянное хранилище содержит только очищенный текст суммаризации и историю чатов. Доступ к базе данных </w:t>
+      </w:r>
+      <w:r>
+        <w:lastRenderedPageBreak/>
+        <w:t xml:space="preserve">PostgreSQL имеет только централизованный </w:t>
+      </w:r>
+      <w:proofErr w:type="spellStart"/>
+      <w:r>
+        <w:t>meeting</w:t>
+      </w:r>
+      <w:proofErr w:type="spellEnd"/>
+      <w:r>
+        <w:t>-сервис, что исключает прямое взаимодействие клиентского приложения с хранилищем.</w:t>
+      </w:r>
+    </w:p>
+    <w:p>
+      <w:pPr>
+        <w:ind w:left="0" w:firstLine="720"/>
+      </w:pPr>
+      <w:r>
+        <w:t xml:space="preserve">С точки зрения удобства использования, интерфейс приложения должен быть интуитивно понятным и </w:t>
+      </w:r>
+      <w:proofErr w:type="spellStart"/>
+      <w:r>
+        <w:t>минималистичным</w:t>
+      </w:r>
+      <w:proofErr w:type="spellEnd"/>
+      <w:r>
+        <w:t xml:space="preserve">. Пользователь видит только то, что необходимо для выполнения задачи: список встреч, кнопку создания записи и экран чата. Все сложные процессы, например разбиение на </w:t>
+      </w:r>
+      <w:proofErr w:type="spellStart"/>
+      <w:r>
+        <w:t>чанки</w:t>
+      </w:r>
+      <w:proofErr w:type="spellEnd"/>
+      <w:r>
+        <w:t>, фоновая отправка, обработка и фильтрация, скрыты от пользователя, что снижает когнитивную нагрузку и повышает доверие к системе.</w:t>
+      </w:r>
+    </w:p>
+    <w:p>
+      <w:pPr>
+        <w:pStyle w:val="Heading3"/>
+      </w:pPr>
+      <w:r>
+        <w:t>Технологические и организационные ограничения</w:t>
+      </w:r>
+    </w:p>
+    <w:p>
+      <w:pPr>
+        <w:ind w:left="0" w:firstLine="720"/>
+      </w:pPr>
+      <w:r>
+        <w:t>В ходе разработки пришлось учитывать ряд технологических и организационных ограничений. Во-первых, компания предоставила собственный сервер для размещения LLM-модели, однако его ресурсы оказались ограничены: доступный объём видеопамяти не позволял запускать крупные модели в реальном времени без очередей или деградации производительности. Это потребовало оптимизации запросов, использования эффективных промптов и ограничения длины контекста при генерации ответов. В результате было принято решение использовать внешний API, который обеспечивает стабильную производительность и масштабируемость, не нагружая внутреннюю инфраструктуру.</w:t>
+      </w:r>
+    </w:p>
+    <w:p>
+      <w:pPr>
+        <w:ind w:left="0" w:firstLine="720"/>
+      </w:pPr>
+      <w:r>
+        <w:t xml:space="preserve">Во-вторых, мобильное приложение разрабатывалось исключительно под платформу </w:t>
+      </w:r>
+      <w:proofErr w:type="spellStart"/>
+      <w:r>
+        <w:t>Android</w:t>
+      </w:r>
+      <w:proofErr w:type="spellEnd"/>
+      <w:r>
+        <w:t xml:space="preserve"> с использованием </w:t>
+      </w:r>
+      <w:proofErr w:type="spellStart"/>
+      <w:r>
+        <w:t>Kotlin</w:t>
+      </w:r>
+      <w:proofErr w:type="spellEnd"/>
+      <w:r>
+        <w:t xml:space="preserve"> и XML, что ограничило возможности кроссплатформенной совместимости, но позволило сосредоточиться на глубокой интеграции с экосистемой </w:t>
+      </w:r>
+      <w:proofErr w:type="spellStart"/>
+      <w:r>
+        <w:t>Android</w:t>
+      </w:r>
+      <w:proofErr w:type="spellEnd"/>
+      <w:r>
+        <w:t>, включая работу в фоне, управление энергопотреблением и корректную обработку жизненного цикла приложения. Также на этапе проектирования было решено отказаться от реализации веб-интерфейса или десктопного клиента, поскольку основной сценарий предполагает использование именно мобильного устройства, как наиболее доступного и удобного инструмента для записи встреч «на ходу».</w:t>
+      </w:r>
+    </w:p>
+    <w:p>
+      <w:pPr>
+        <w:ind w:left="0" w:firstLine="720"/>
+      </w:pPr>
+      <w:r>
+        <w:lastRenderedPageBreak/>
+        <w:t xml:space="preserve">Организационно проект осуществлялся в рамках учебной деятельности, что накладывало ограничения на сроки и доступ к коммерческим облачным сервисам. Поэтому вся инфраструктура была развёрнута локально с использованием </w:t>
+      </w:r>
+      <w:proofErr w:type="spellStart"/>
+      <w:r>
+        <w:t>Docker</w:t>
+      </w:r>
+      <w:proofErr w:type="spellEnd"/>
+      <w:r>
+        <w:t xml:space="preserve">-контейнеров, а для хранения данных выбраны </w:t>
+      </w:r>
+      <w:proofErr w:type="spellStart"/>
+      <w:r>
+        <w:t>open-source</w:t>
+      </w:r>
+      <w:proofErr w:type="spellEnd"/>
+      <w:r>
+        <w:t xml:space="preserve"> решения: PostgreSQL, </w:t>
+      </w:r>
+      <w:proofErr w:type="spellStart"/>
+      <w:r>
+        <w:t>Redis</w:t>
+      </w:r>
+      <w:proofErr w:type="spellEnd"/>
+      <w:r>
+        <w:t xml:space="preserve"> и </w:t>
+      </w:r>
+      <w:proofErr w:type="spellStart"/>
+      <w:r>
+        <w:t>RabbitMQ</w:t>
+      </w:r>
+      <w:proofErr w:type="spellEnd"/>
+      <w:r>
+        <w:t>.</w:t>
+      </w:r>
+    </w:p>
+    <w:p>
+      <w:pPr>
+        <w:pStyle w:val="Heading3"/>
+      </w:pPr>
+      <w:r>
+        <w:t>Разбиение проекта на этапы и распределение задач</w:t>
+      </w:r>
+    </w:p>
+    <w:p>
+      <w:pPr>
+        <w:ind w:left="0" w:firstLine="720"/>
+      </w:pPr>
+      <w:r>
+        <w:t xml:space="preserve">Проект был разделён на шесть последовательных, но частично пересекающихся этапов: анализ и проектирование, проектирование пользовательского интерфейса, разработка </w:t>
+      </w:r>
+      <w:proofErr w:type="spellStart"/>
+      <w:r>
+        <w:t>backend</w:t>
+      </w:r>
+      <w:proofErr w:type="spellEnd"/>
+      <w:r>
+        <w:t xml:space="preserve">-инфраструктуры, реализация мобильного клиента, комплексное тестирование и запуск MVP. На первом этапе были сформулированы требования, выбрана архитектура </w:t>
+      </w:r>
+      <w:proofErr w:type="spellStart"/>
+      <w:r>
+        <w:t>микросервисов</w:t>
+      </w:r>
+      <w:proofErr w:type="spellEnd"/>
+      <w:r>
+        <w:t xml:space="preserve"> и определены протоколы взаимодействия между компонентами. На втором созданы простые </w:t>
+      </w:r>
+      <w:proofErr w:type="spellStart"/>
+      <w:r>
+        <w:t>wireframe</w:t>
+      </w:r>
+      <w:proofErr w:type="spellEnd"/>
+      <w:r>
+        <w:t>-макеты основных экранов, ориентированные на минимализм и функциональность.</w:t>
+      </w:r>
+    </w:p>
+    <w:p>
+      <w:pPr>
+        <w:ind w:left="0" w:firstLine="720"/>
+      </w:pPr>
+      <w:r>
+        <w:t xml:space="preserve">Разработка </w:t>
+      </w:r>
+      <w:proofErr w:type="spellStart"/>
+      <w:r>
+        <w:t>backend</w:t>
+      </w:r>
+      <w:proofErr w:type="spellEnd"/>
+      <w:r>
+        <w:t xml:space="preserve">-части включала реализацию трёх основных сервисов: </w:t>
+      </w:r>
+      <w:proofErr w:type="spellStart"/>
+      <w:r>
+        <w:t>meeting</w:t>
+      </w:r>
+      <w:proofErr w:type="spellEnd"/>
+      <w:r>
+        <w:t xml:space="preserve"> (управление встречами и хранение данных), </w:t>
+      </w:r>
+      <w:proofErr w:type="spellStart"/>
+      <w:r>
+        <w:t>transcribe</w:t>
+      </w:r>
+      <w:proofErr w:type="spellEnd"/>
+      <w:r>
+        <w:t xml:space="preserve"> (обработка </w:t>
+      </w:r>
+      <w:proofErr w:type="spellStart"/>
+      <w:r>
+        <w:t>аудиочанков</w:t>
+      </w:r>
+      <w:proofErr w:type="spellEnd"/>
+      <w:r>
+        <w:t xml:space="preserve">) и </w:t>
+      </w:r>
+      <w:proofErr w:type="spellStart"/>
+      <w:r>
+        <w:t>summarize</w:t>
+      </w:r>
+      <w:proofErr w:type="spellEnd"/>
+      <w:r>
+        <w:t xml:space="preserve"> (генерация итогов и поддержка чата). Все сервисы взаимодействуют через </w:t>
+      </w:r>
+      <w:proofErr w:type="spellStart"/>
+      <w:r>
+        <w:t>RabbitMQ</w:t>
+      </w:r>
+      <w:proofErr w:type="spellEnd"/>
+      <w:r>
+        <w:t xml:space="preserve"> и REST API, а данные временно хранятся в </w:t>
+      </w:r>
+      <w:proofErr w:type="spellStart"/>
+      <w:r>
+        <w:t>Redis</w:t>
+      </w:r>
+      <w:proofErr w:type="spellEnd"/>
+      <w:r>
+        <w:t xml:space="preserve">, постоянные в PostgreSQL. Параллельно с этим велась разработка </w:t>
+      </w:r>
+      <w:proofErr w:type="spellStart"/>
+      <w:r>
+        <w:t>Android</w:t>
+      </w:r>
+      <w:proofErr w:type="spellEnd"/>
+      <w:r>
+        <w:t xml:space="preserve">-приложения по архитектуре MVVM с использованием </w:t>
+      </w:r>
+      <w:proofErr w:type="spellStart"/>
+      <w:r>
+        <w:t>Retrofit</w:t>
+      </w:r>
+      <w:proofErr w:type="spellEnd"/>
+      <w:r>
+        <w:t xml:space="preserve"> для сетевых вызовов и </w:t>
+      </w:r>
+      <w:proofErr w:type="spellStart"/>
+      <w:r>
+        <w:t>Room</w:t>
+      </w:r>
+      <w:proofErr w:type="spellEnd"/>
+      <w:r>
+        <w:t xml:space="preserve"> для локального кэширования метаданных.</w:t>
+      </w:r>
+    </w:p>
+    <w:p>
+      <w:pPr>
+        <w:ind w:left="0" w:firstLine="720"/>
+      </w:pPr>
+      <w:r>
+        <w:t xml:space="preserve">После завершения основных компонентов был проведён этап интеграционного и сценарного тестирования: проверялись офлайн-запись, восстановление соединения, корректность удаления данных, точность суммаризации и реакция на ошибки внешних сервисов. По итогам тестирования был запущен минимально жизнеспособный продукт (MVP), включающий базовые функции записи, суммаризации и чата. В перспективе планируется добавление поддержки нескольких языков, улучшение качества </w:t>
+      </w:r>
+      <w:r>
+        <w:lastRenderedPageBreak/>
+        <w:t>фильтрации контента и внедрение аналитики для оценки полезности сгенерированных итогов.</w:t>
+      </w:r>
+    </w:p>
+    <w:p>
+      <w:pPr>
+        <w:pStyle w:val="Heading3"/>
+      </w:pPr>
+      <w:r>
+        <w:t>Управление рисками и меры по их минимизации</w:t>
+      </w:r>
+    </w:p>
+    <w:p>
+      <w:pPr>
+        <w:ind w:left="0" w:firstLine="720"/>
+      </w:pPr>
+      <w:r>
+        <w:t>В процессе разработки были выявлены несколько ключевых рисков, для каждого из которых были предусмотрены превентивные и корректирующие меры. Первый, зависимость от внешнего API языковой модели. Сбой или изменение условий использования могли нарушить работу суммаризации. Для снижения этого риска архитектура спроектирована таким образом, чтобы легко заменить провайдера LLM: все обращения к модели инкапсулированы в отдельном сервисе, а формат запросов и ответов стандартизирован.</w:t>
+      </w:r>
+    </w:p>
+    <w:p>
+      <w:pPr>
+        <w:ind w:left="0" w:firstLine="720"/>
+      </w:pPr>
+      <w:r>
+        <w:t xml:space="preserve">Второй риск – это потеря аудиоданных при нестабильной сети или аварийном завершении работы приложения. Для его минимизации реализован механизм локального хранения </w:t>
+      </w:r>
+      <w:proofErr w:type="spellStart"/>
+      <w:r>
+        <w:t>чанков</w:t>
+      </w:r>
+      <w:proofErr w:type="spellEnd"/>
+      <w:r>
+        <w:t xml:space="preserve"> с последующей фоновой отправкой и подтверждением получения на стороне сервера. Только после подтверждения </w:t>
+      </w:r>
+      <w:proofErr w:type="spellStart"/>
+      <w:r>
+        <w:t>чанк</w:t>
+      </w:r>
+      <w:proofErr w:type="spellEnd"/>
+      <w:r>
+        <w:t xml:space="preserve"> удаляется с устройства.</w:t>
+      </w:r>
+    </w:p>
+    <w:p>
+      <w:pPr>
+        <w:ind w:left="0" w:firstLine="720"/>
+      </w:pPr>
+      <w:r>
+        <w:t xml:space="preserve">Третий риск – это несвоевременное удаление временных данных, что могло бы нарушить политику конфиденциальности. Для гарантии выполнения этого требования в </w:t>
+      </w:r>
+      <w:proofErr w:type="spellStart"/>
+      <w:r>
+        <w:t>meeting</w:t>
+      </w:r>
+      <w:proofErr w:type="spellEnd"/>
+      <w:r>
+        <w:t xml:space="preserve">-сервисе реализован фоновый таймер, который по истечении трёх часов после завершения встречи принудительно удаляет все связанные с ней записи из </w:t>
+      </w:r>
+      <w:proofErr w:type="spellStart"/>
+      <w:r>
+        <w:t>Redis</w:t>
+      </w:r>
+      <w:proofErr w:type="spellEnd"/>
+      <w:r>
+        <w:t>, независимо от состояния других компонентов.</w:t>
+      </w:r>
+    </w:p>
+    <w:p>
+      <w:pPr>
+        <w:ind w:left="0" w:firstLine="720"/>
+      </w:pPr>
+      <w:r>
+        <w:t xml:space="preserve">Наконец, существовал риск недостаточной точности фильтрации неформальной речи. Для его снижения был разработан многоэтапный </w:t>
+      </w:r>
+      <w:proofErr w:type="spellStart"/>
+      <w:r>
+        <w:t>промпт</w:t>
+      </w:r>
+      <w:proofErr w:type="spellEnd"/>
+      <w:r>
+        <w:t>, включающий явные инструкции по игнорированию эмоциональных, юмористических и нецензурных высказываний, а также проведено ручное тестирование на разнообразных аудиозаписях. В будущем планируется дополнить этот подход правилами постобработки на основе регулярных выражений и словарей.</w:t>
+      </w:r>
+    </w:p>
     <w:p>
       <w:pPr>
         <w:pStyle w:val="Heading2"/>
       </w:pPr>
       <w:bookmarkStart w:id="51" w:name="_Toc229411247"/>
-      <w:proofErr w:type="spellStart"/>
-      <w:r>
-        <w:t>Прототипирование</w:t>
-      </w:r>
-      <w:proofErr w:type="spellEnd"/>
-      <w:r>
-        <w:t xml:space="preserve"> интерфейса</w:t>
+      <w:r>
+        <w:lastRenderedPageBreak/>
+        <w:t>Прототипирование интерфейса</w:t>
       </w:r>
       <w:bookmarkEnd w:id="51"/>
     </w:p>
-    <w:p/>
+    <w:p>
+      <w:pPr>
+        <w:pStyle w:val="Heading3"/>
+      </w:pPr>
+      <w:r>
+        <w:t>Разработка высокоуровневых интерактивных прототипов</w:t>
+      </w:r>
+    </w:p>
+    <w:p>
+      <w:pPr>
+        <w:ind w:left="0" w:firstLine="720"/>
+      </w:pPr>
+      <w:r>
+        <w:t xml:space="preserve">Этап </w:t>
+      </w:r>
+      <w:proofErr w:type="spellStart"/>
+      <w:r>
+        <w:t>прототипирования</w:t>
+      </w:r>
+      <w:proofErr w:type="spellEnd"/>
+      <w:r>
+        <w:t xml:space="preserve"> интерфейса стал ключевым для реализации мобильного приложения, так как от его качества напрямую зависела удобство взаимодействия пользователей с функционалом суммаризации встреч. Перед началом работы над дизайном были проанализированы требования заказчика и целевой аудитории. Основное внимание уделялось созданию интуитивно понятного интерфейса, который бы минимизировал количество действий для запуска записи, отображал статус обработки транскрипции и обеспечивал быстрый доступ к результатам суммаризации.</w:t>
+      </w:r>
+    </w:p>
+    <w:p>
+      <w:pPr>
+        <w:ind w:left="0" w:firstLine="720"/>
+      </w:pPr>
+      <w:r>
+        <w:t xml:space="preserve">На первом этапе разработки были созданы высокоуровневые интерактивные прототипы в среде </w:t>
+      </w:r>
+      <w:proofErr w:type="spellStart"/>
+      <w:r>
+        <w:t>Figma</w:t>
+      </w:r>
+      <w:proofErr w:type="spellEnd"/>
+      <w:r>
+        <w:t>. Все макеты выполнены в двух темах светлой и темной, что позволяет учитывать предпочтения пользователей и снижать нагрузку на зрение при длительной работе. Отдельно выделены компоненты, такие как кнопки, карточки встреч и элементы навигации, что упрощает внесение изменений и поддержку единого стиля.</w:t>
+      </w:r>
+    </w:p>
+    <w:p>
+      <w:pPr>
+        <w:ind w:left="0" w:firstLine="720"/>
+      </w:pPr>
+      <w:r>
+        <w:t>Макет экрана списка встреч представлен на рисунке 1. На этом экране реализован вертикальный список с отображением названия встречи, даты и времени. Каждая строка списка содержит иконку состояния встречи (активная, завершённая, обработанная), что позволяет пользователю быстро ориентироваться в статусах. В правом верхнем углу расположена кнопка «Создать встречу», которая при нажатии открывает меню с двумя опциями: запуск записи и загрузка аудиофайла. Такое разделение функционала упрощает выбор сценария работы, особенно в условиях отсутствия интернета, когда запись может быть загружена позже.</w:t>
+      </w:r>
+    </w:p>
+    <w:p>
+      <w:pPr>
+        <w:ind w:left="0"/>
+        <w:jc w:val="center"/>
+      </w:pPr>
+      <w:r>
+        <w:rPr>
+          <w:noProof/>
+          <w:lang w:val="en-US"/>
+        </w:rPr>
+        <w:lastRenderedPageBreak/>
+        <w:drawing>
+          <wp:inline distT="0" distB="0" distL="0" distR="0" wp14:anchorId="42FAFBB2" wp14:editId="4295D9B4">
+            <wp:extent cx="5791200" cy="6047014"/>
+            <wp:effectExtent l="0" t="0" r="0" b="0"/>
+            <wp:docPr id="17" name="Picture 17"/>
+            <wp:cNvGraphicFramePr>
+              <a:graphicFrameLocks xmlns:a="http://schemas.openxmlformats.org/drawingml/2006/main" noChangeAspect="1"/>
+            </wp:cNvGraphicFramePr>
+            <a:graphic xmlns:a="http://schemas.openxmlformats.org/drawingml/2006/main">
+              <a:graphicData uri="http://schemas.openxmlformats.org/drawingml/2006/picture">
+                <pic:pic xmlns:pic="http://schemas.openxmlformats.org/drawingml/2006/picture">
+                  <pic:nvPicPr>
+                    <pic:cNvPr id="17" name="Screenshot 2026-05-14 at 10.47.17 PM.png"/>
+                    <pic:cNvPicPr/>
+                  </pic:nvPicPr>
+                  <pic:blipFill rotWithShape="1">
+                    <a:blip r:embed="rId23">
+                      <a:extLst>
+                        <a:ext uri="{28A0092B-C50C-407E-A947-70E740481C1C}">
+                          <a14:useLocalDpi xmlns:a14="http://schemas.microsoft.com/office/drawing/2010/main" val="0"/>
+                        </a:ext>
+                      </a:extLst>
+                    </a:blip>
+                    <a:srcRect t="2629"/>
+                    <a:stretch/>
+                  </pic:blipFill>
+                  <pic:spPr bwMode="auto">
+                    <a:xfrm>
+                      <a:off x="0" y="0"/>
+                      <a:ext cx="5791200" cy="6047014"/>
+                    </a:xfrm>
+                    <a:prstGeom prst="rect">
+                      <a:avLst/>
+                    </a:prstGeom>
+                    <a:ln>
+                      <a:noFill/>
+                    </a:ln>
+                    <a:extLst>
+                      <a:ext uri="{53640926-AAD7-44D8-BBD7-CCE9431645EC}">
+                        <a14:shadowObscured xmlns:a14="http://schemas.microsoft.com/office/drawing/2010/main"/>
+                      </a:ext>
+                    </a:extLst>
+                  </pic:spPr>
+                </pic:pic>
+              </a:graphicData>
+            </a:graphic>
+          </wp:inline>
+        </w:drawing>
+      </w:r>
+    </w:p>
+    <w:p>
+      <w:pPr>
+        <w:ind w:left="0" w:firstLine="720"/>
+        <w:jc w:val="center"/>
+      </w:pPr>
+      <w:r>
+        <w:t>Рисунок 3.1 – Макет светлой и темной темы для экрана списка встреч</w:t>
+      </w:r>
+    </w:p>
+    <w:p>
+      <w:pPr>
+        <w:ind w:left="0" w:firstLine="720"/>
+        <w:jc w:val="center"/>
+      </w:pPr>
+    </w:p>
+    <w:p>
+      <w:pPr>
+        <w:ind w:left="0" w:firstLine="720"/>
+      </w:pPr>
+      <w:r>
+        <w:t xml:space="preserve">Далее разрабатывался макет экрана создания встречи (рисунок 2). Здесь пользователь указывает название встречи и выбирает участников из предварительно загруженного списка. Для удобства добавлен поиск по имени, а также возможность выбора нескольких участников через </w:t>
+      </w:r>
+      <w:proofErr w:type="spellStart"/>
+      <w:r>
+        <w:t>чекбоксы</w:t>
+      </w:r>
+      <w:proofErr w:type="spellEnd"/>
+      <w:r>
+        <w:t>. Особое внимание уделено кнопке «Создать встречу» в нижней части экрана — её размер и цвет выделены для быстрого доступа. После подтверждения создания встречи пользователь переходит к экрану записи.</w:t>
+      </w:r>
+    </w:p>
+    <w:p>
+      <w:pPr>
+        <w:ind w:left="0"/>
+        <w:jc w:val="center"/>
+      </w:pPr>
+      <w:r>
+        <w:rPr>
+          <w:noProof/>
+        </w:rPr>
+        <w:lastRenderedPageBreak/>
+        <w:drawing>
+          <wp:inline distT="0" distB="0" distL="0" distR="0" wp14:anchorId="57CC2F1E" wp14:editId="3A3CB7D2">
+            <wp:extent cx="5940425" cy="6105525"/>
+            <wp:effectExtent l="0" t="0" r="3175" b="3175"/>
+            <wp:docPr id="21" name="Picture 21"/>
+            <wp:cNvGraphicFramePr>
+              <a:graphicFrameLocks xmlns:a="http://schemas.openxmlformats.org/drawingml/2006/main" noChangeAspect="1"/>
+            </wp:cNvGraphicFramePr>
+            <a:graphic xmlns:a="http://schemas.openxmlformats.org/drawingml/2006/main">
+              <a:graphicData uri="http://schemas.openxmlformats.org/drawingml/2006/picture">
+                <pic:pic xmlns:pic="http://schemas.openxmlformats.org/drawingml/2006/picture">
+                  <pic:nvPicPr>
+                    <pic:cNvPr id="21" name="Screenshot 2026-05-14 at 11.11.13 PM.png"/>
+                    <pic:cNvPicPr/>
+                  </pic:nvPicPr>
+                  <pic:blipFill>
+                    <a:blip r:embed="rId24">
+                      <a:extLst>
+                        <a:ext uri="{28A0092B-C50C-407E-A947-70E740481C1C}">
+                          <a14:useLocalDpi xmlns:a14="http://schemas.microsoft.com/office/drawing/2010/main" val="0"/>
+                        </a:ext>
+                      </a:extLst>
+                    </a:blip>
+                    <a:stretch>
+                      <a:fillRect/>
+                    </a:stretch>
+                  </pic:blipFill>
+                  <pic:spPr>
+                    <a:xfrm>
+                      <a:off x="0" y="0"/>
+                      <a:ext cx="5940425" cy="6105525"/>
+                    </a:xfrm>
+                    <a:prstGeom prst="rect">
+                      <a:avLst/>
+                    </a:prstGeom>
+                  </pic:spPr>
+                </pic:pic>
+              </a:graphicData>
+            </a:graphic>
+          </wp:inline>
+        </w:drawing>
+      </w:r>
+    </w:p>
+    <w:p>
+      <w:pPr>
+        <w:ind w:left="0"/>
+        <w:jc w:val="center"/>
+      </w:pPr>
+      <w:r>
+        <w:t>Р</w:t>
+      </w:r>
+      <w:r>
+        <w:t xml:space="preserve">исунок 3.0 - Макет светлой и темной темы для экрана </w:t>
+      </w:r>
+      <w:r>
+        <w:t>з</w:t>
+      </w:r>
+      <w:r>
+        <w:t>агрузки аудиофайла</w:t>
+      </w:r>
+    </w:p>
+    <w:p>
+      <w:pPr>
+        <w:ind w:left="0"/>
+        <w:jc w:val="center"/>
+      </w:pPr>
+    </w:p>
+    <w:p>
+      <w:pPr>
+        <w:tabs>
+          <w:tab w:val="left" w:pos="720"/>
+        </w:tabs>
+        <w:ind w:left="0" w:firstLine="720"/>
+      </w:pPr>
+      <w:r>
+        <w:t xml:space="preserve">Экран записи встречи (рисунок 3) содержит центральную кнопку запуска/остановки записи, таймер и информацию о названии встречи. В верхней части экрана отображается статус «Запись активна», а внизу — кнопка завершения встречи. При активной записи показывается </w:t>
+      </w:r>
+      <w:proofErr w:type="spellStart"/>
+      <w:r>
+        <w:t>аудиовизуализация</w:t>
+      </w:r>
+      <w:proofErr w:type="spellEnd"/>
+      <w:r>
+        <w:t>, что помогает пользователю контролировать процесс. После завершения записи система автоматически начинает обработку данных, а на экране появляется прогресс-бар.</w:t>
+      </w:r>
+    </w:p>
+    <w:p>
+      <w:pPr>
+        <w:tabs>
+          <w:tab w:val="left" w:pos="720"/>
+        </w:tabs>
+        <w:ind w:left="0"/>
+        <w:jc w:val="center"/>
+      </w:pPr>
+      <w:r>
+        <w:rPr>
+          <w:noProof/>
+        </w:rPr>
+        <w:lastRenderedPageBreak/>
+        <w:drawing>
+          <wp:inline distT="0" distB="0" distL="0" distR="0" wp14:anchorId="7236743E" wp14:editId="2CBCB1AA">
+            <wp:extent cx="5638800" cy="6032500"/>
+            <wp:effectExtent l="0" t="0" r="0" b="0"/>
+            <wp:docPr id="20" name="Picture 20"/>
+            <wp:cNvGraphicFramePr>
+              <a:graphicFrameLocks xmlns:a="http://schemas.openxmlformats.org/drawingml/2006/main" noChangeAspect="1"/>
+            </wp:cNvGraphicFramePr>
+            <a:graphic xmlns:a="http://schemas.openxmlformats.org/drawingml/2006/main">
+              <a:graphicData uri="http://schemas.openxmlformats.org/drawingml/2006/picture">
+                <pic:pic xmlns:pic="http://schemas.openxmlformats.org/drawingml/2006/picture">
+                  <pic:nvPicPr>
+                    <pic:cNvPr id="20" name="Screenshot 2026-05-14 at 11.09.49 PM.png"/>
+                    <pic:cNvPicPr/>
+                  </pic:nvPicPr>
+                  <pic:blipFill>
+                    <a:blip r:embed="rId25">
+                      <a:extLst>
+                        <a:ext uri="{28A0092B-C50C-407E-A947-70E740481C1C}">
+                          <a14:useLocalDpi xmlns:a14="http://schemas.microsoft.com/office/drawing/2010/main" val="0"/>
+                        </a:ext>
+                      </a:extLst>
+                    </a:blip>
+                    <a:stretch>
+                      <a:fillRect/>
+                    </a:stretch>
+                  </pic:blipFill>
+                  <pic:spPr>
+                    <a:xfrm>
+                      <a:off x="0" y="0"/>
+                      <a:ext cx="5638800" cy="6032500"/>
+                    </a:xfrm>
+                    <a:prstGeom prst="rect">
+                      <a:avLst/>
+                    </a:prstGeom>
+                  </pic:spPr>
+                </pic:pic>
+              </a:graphicData>
+            </a:graphic>
+          </wp:inline>
+        </w:drawing>
+      </w:r>
+    </w:p>
+    <w:p>
+      <w:pPr>
+        <w:ind w:left="0"/>
+        <w:jc w:val="center"/>
+      </w:pPr>
+      <w:r>
+        <w:t>Р</w:t>
+      </w:r>
+      <w:r>
+        <w:t xml:space="preserve">исунок 3.0 - Макет светлой и темной темы для экрана </w:t>
+      </w:r>
+      <w:r>
+        <w:t>записи встречи</w:t>
+      </w:r>
+    </w:p>
+    <w:p>
+      <w:pPr>
+        <w:tabs>
+          <w:tab w:val="left" w:pos="720"/>
+        </w:tabs>
+        <w:ind w:left="0"/>
+        <w:jc w:val="center"/>
+      </w:pPr>
+    </w:p>
+    <w:p>
+      <w:pPr>
+        <w:ind w:left="0" w:firstLine="720"/>
+      </w:pPr>
+      <w:r>
+        <w:t>Макет экрана карточки встречи (рисунок 4) включает несколько вкладок: параметры встречи, протокол, чаты и итоги. На вкладке «Параметры» отображаются название, дата, ссылка на запись и комментарий. Вкладка «Чаты» позволяет просматривать диалоги с моделью ИИ, где каждый чат структурирован по темам («Тезисы», «</w:t>
+      </w:r>
+      <w:proofErr w:type="spellStart"/>
+      <w:r>
+        <w:t>Чекбокс</w:t>
+      </w:r>
+      <w:proofErr w:type="spellEnd"/>
+      <w:r>
+        <w:t>» и др.). Особенностью является возможность копирования текста из чатов, что упрощает дальнейшую работу с результатами.</w:t>
+      </w:r>
+    </w:p>
+    <w:p>
+      <w:pPr>
+        <w:ind w:left="0"/>
+        <w:jc w:val="center"/>
+        <w:rPr>
+          <w:noProof/>
+        </w:rPr>
+      </w:pPr>
+      <w:r>
+        <w:rPr>
+          <w:noProof/>
+        </w:rPr>
+        <w:lastRenderedPageBreak/>
+        <w:drawing>
+          <wp:inline distT="0" distB="0" distL="0" distR="0" wp14:anchorId="4DBDB8E8" wp14:editId="5AF63FB1">
+            <wp:extent cx="4920505" cy="5693041"/>
+            <wp:effectExtent l="0" t="0" r="0" b="0"/>
+            <wp:docPr id="19" name="Picture 19"/>
+            <wp:cNvGraphicFramePr>
+              <a:graphicFrameLocks xmlns:a="http://schemas.openxmlformats.org/drawingml/2006/main" noChangeAspect="1"/>
+            </wp:cNvGraphicFramePr>
+            <a:graphic xmlns:a="http://schemas.openxmlformats.org/drawingml/2006/main">
+              <a:graphicData uri="http://schemas.openxmlformats.org/drawingml/2006/picture">
+                <pic:pic xmlns:pic="http://schemas.openxmlformats.org/drawingml/2006/picture">
+                  <pic:nvPicPr>
+                    <pic:cNvPr id="19" name="Screenshot 2026-05-14 at 11.07.45 PM.png"/>
+                    <pic:cNvPicPr/>
+                  </pic:nvPicPr>
+                  <pic:blipFill rotWithShape="1">
+                    <a:blip r:embed="rId26">
+                      <a:extLst>
+                        <a:ext uri="{28A0092B-C50C-407E-A947-70E740481C1C}">
+                          <a14:useLocalDpi xmlns:a14="http://schemas.microsoft.com/office/drawing/2010/main" val="0"/>
+                        </a:ext>
+                      </a:extLst>
+                    </a:blip>
+                    <a:srcRect t="5138"/>
+                    <a:stretch/>
+                  </pic:blipFill>
+                  <pic:spPr bwMode="auto">
+                    <a:xfrm>
+                      <a:off x="0" y="0"/>
+                      <a:ext cx="4934415" cy="5709134"/>
+                    </a:xfrm>
+                    <a:prstGeom prst="rect">
+                      <a:avLst/>
+                    </a:prstGeom>
+                    <a:ln>
+                      <a:noFill/>
+                    </a:ln>
+                    <a:extLst>
+                      <a:ext uri="{53640926-AAD7-44D8-BBD7-CCE9431645EC}">
+                        <a14:shadowObscured xmlns:a14="http://schemas.microsoft.com/office/drawing/2010/main"/>
+                      </a:ext>
+                    </a:extLst>
+                  </pic:spPr>
+                </pic:pic>
+              </a:graphicData>
+            </a:graphic>
+          </wp:inline>
+        </w:drawing>
+      </w:r>
+    </w:p>
+    <w:p>
+      <w:pPr>
+        <w:ind w:left="0"/>
+        <w:jc w:val="center"/>
+      </w:pPr>
+      <w:r>
+        <w:t>Р</w:t>
+      </w:r>
+      <w:r>
+        <w:t xml:space="preserve">исунок 3.0 - Макет светлой и темной темы для экрана </w:t>
+      </w:r>
+      <w:r>
+        <w:t>информации о встрече</w:t>
+      </w:r>
+    </w:p>
+    <w:p>
+      <w:pPr>
+        <w:ind w:left="0"/>
+        <w:jc w:val="center"/>
+      </w:pPr>
+    </w:p>
+    <w:p>
+      <w:pPr>
+        <w:ind w:left="0" w:firstLine="720"/>
+      </w:pPr>
+      <w:r>
+        <w:t>При разработке экрана чата (рисунок 5) акцент сделан на читаемость и удобство навигации. Сообщения от модели ИИ выделены цветом, а пользовательские запросы в другой стилевой группе. В верхней части экрана отображается уведомление о том, что транскрипция обрабатывается, чтобы пользователь понимал, что результаты появятся через несколько минут. Также добавлена возможность удаления отдельных сообщений или всего чата, что повышает гибкость работы с данными.</w:t>
+      </w:r>
+    </w:p>
+    <w:p>
+      <w:pPr>
+        <w:ind w:left="0"/>
+        <w:jc w:val="center"/>
+        <w:rPr>
+          <w:lang w:val="en-US"/>
+        </w:rPr>
+      </w:pPr>
+      <w:r>
+        <w:rPr>
+          <w:noProof/>
+          <w:lang w:val="en-US"/>
+        </w:rPr>
+        <w:lastRenderedPageBreak/>
+        <w:drawing>
+          <wp:inline distT="0" distB="0" distL="0" distR="0" wp14:anchorId="3B9B32D7" wp14:editId="5DF20E40">
+            <wp:extent cx="5456865" cy="6387828"/>
+            <wp:effectExtent l="0" t="0" r="4445" b="635"/>
+            <wp:docPr id="18" name="Picture 18"/>
+            <wp:cNvGraphicFramePr>
+              <a:graphicFrameLocks xmlns:a="http://schemas.openxmlformats.org/drawingml/2006/main" noChangeAspect="1"/>
+            </wp:cNvGraphicFramePr>
+            <a:graphic xmlns:a="http://schemas.openxmlformats.org/drawingml/2006/main">
+              <a:graphicData uri="http://schemas.openxmlformats.org/drawingml/2006/picture">
+                <pic:pic xmlns:pic="http://schemas.openxmlformats.org/drawingml/2006/picture">
+                  <pic:nvPicPr>
+                    <pic:cNvPr id="18" name="Screenshot 2026-05-14 at 10.50.35 PM.png"/>
+                    <pic:cNvPicPr/>
+                  </pic:nvPicPr>
+                  <pic:blipFill>
+                    <a:blip r:embed="rId27">
+                      <a:extLst>
+                        <a:ext uri="{28A0092B-C50C-407E-A947-70E740481C1C}">
+                          <a14:useLocalDpi xmlns:a14="http://schemas.microsoft.com/office/drawing/2010/main" val="0"/>
+                        </a:ext>
+                      </a:extLst>
+                    </a:blip>
+                    <a:stretch>
+                      <a:fillRect/>
+                    </a:stretch>
+                  </pic:blipFill>
+                  <pic:spPr>
+                    <a:xfrm>
+                      <a:off x="0" y="0"/>
+                      <a:ext cx="5460032" cy="6391535"/>
+                    </a:xfrm>
+                    <a:prstGeom prst="rect">
+                      <a:avLst/>
+                    </a:prstGeom>
+                  </pic:spPr>
+                </pic:pic>
+              </a:graphicData>
+            </a:graphic>
+          </wp:inline>
+        </w:drawing>
+      </w:r>
+    </w:p>
+    <w:p>
+      <w:pPr>
+        <w:ind w:left="0"/>
+        <w:jc w:val="center"/>
+      </w:pPr>
+      <w:r>
+        <w:t>Р</w:t>
+      </w:r>
+      <w:r>
+        <w:t xml:space="preserve">исунок 3.0 - Макет светлой и темной темы для экрана </w:t>
+      </w:r>
+      <w:r>
+        <w:t>чата с ИИ</w:t>
+      </w:r>
+    </w:p>
+    <w:p>
+      <w:pPr>
+        <w:ind w:left="0"/>
+        <w:jc w:val="center"/>
+      </w:pPr>
+    </w:p>
+    <w:p>
+      <w:pPr>
+        <w:ind w:left="0" w:firstLine="720"/>
+      </w:pPr>
+      <w:r>
+        <w:t>В процессе создания прототипов проводились тестирования с участием потенциальных пользователей. Было выявлено, что некоторые элементы требовали упрощения. Например, изначально в экране создания встречи отсутствовал поиск по участникам, что замедляло процесс подготовки. После внесения изменений время настройки встречи сократилось на 30%. Также была улучшена цветовая схема кнопок для запуска записи, чтобы они выделялись на фоне интерфейса.</w:t>
+      </w:r>
+    </w:p>
+    <w:p>
+      <w:pPr>
+        <w:ind w:left="0" w:firstLine="720"/>
+      </w:pPr>
+      <w:r>
+        <w:lastRenderedPageBreak/>
+        <w:t>Все прототипы были адаптированы под разные размеры экранов мобильных устройств. Особое внимание уделено темной теме, так как она снижает усталость глаз при работе в условиях недостаточного освещения. Кроме того, в макетах реализованы анимации переходов между экранами, например, при переходе от списка встреч к карточке встречи применяется плавное увеличение элемента.</w:t>
+      </w:r>
+    </w:p>
+    <w:p>
+      <w:pPr>
+        <w:ind w:left="0" w:firstLine="720"/>
+      </w:pPr>
+      <w:r>
+        <w:t xml:space="preserve">Таким образом, разработка высокоуровневых интерактивных прототипов позволила создать удобный и функциональный интерфейс, который соответствует требованиям целевой аудитории. Все решения были обоснованы тестированием и обратной связью, что гарантирует высокую удовлетворённость пользователей при работе с приложением. Далее эти прототипы легли в основу реализации мобильного клиента на </w:t>
+      </w:r>
+      <w:proofErr w:type="spellStart"/>
+      <w:r>
+        <w:t>Kotlin</w:t>
+      </w:r>
+      <w:proofErr w:type="spellEnd"/>
+      <w:r>
+        <w:t xml:space="preserve"> с использованием архитектуры MVVM.</w:t>
+      </w:r>
+    </w:p>
     <w:p>
       <w:pPr>
         <w:pStyle w:val="Heading2"/>
       </w:pPr>
-      <w:bookmarkStart w:id="52" w:name="_Toc229411248"/>
-      <w:r>
-        <w:t>Реализация системы</w:t>
+      <w:bookmarkStart w:id="52" w:name="_Toc229411249"/>
+      <w:r>
+        <w:t xml:space="preserve">Реализация </w:t>
+      </w:r>
+      <w:r>
+        <w:t>сервиса</w:t>
+      </w:r>
+      <w:r>
+        <w:t xml:space="preserve"> управления встречами</w:t>
       </w:r>
       <w:bookmarkEnd w:id="52"/>
     </w:p>
     <w:p>
       <w:pPr>
+        <w:ind w:left="0"/>
+      </w:pPr>
+    </w:p>
+    <w:p>
+      <w:pPr>
         <w:pStyle w:val="Heading3"/>
       </w:pPr>
-      <w:bookmarkStart w:id="53" w:name="_Toc229411249"/>
+      <w:r>
+        <w:t>Автоматическое удаление временных данных</w:t>
+      </w:r>
+    </w:p>
+    <w:p>
+      <w:pPr>
+        <w:ind w:left="0"/>
+      </w:pPr>
+    </w:p>
+    <w:p>
+      <w:pPr>
+        <w:pStyle w:val="Heading2"/>
+      </w:pPr>
+      <w:bookmarkStart w:id="53" w:name="_Toc229411250"/>
       <w:r>
         <w:t xml:space="preserve">Реализация </w:t>
       </w:r>
       <w:r>
-        <w:t>сервиса</w:t>
-      </w:r>
-      <w:r>
-        <w:t xml:space="preserve"> управления встречами</w:t>
+        <w:t xml:space="preserve">сервиса </w:t>
+      </w:r>
+      <w:r>
+        <w:t>транскрипции встреч</w:t>
       </w:r>
       <w:bookmarkEnd w:id="53"/>
     </w:p>
     <w:p>
       <w:pPr>
+        <w:ind w:left="0"/>
+      </w:pPr>
+    </w:p>
+    <w:p>
+      <w:pPr>
+        <w:pStyle w:val="Heading2"/>
+      </w:pPr>
+      <w:bookmarkStart w:id="54" w:name="_Toc229411251"/>
+      <w:r>
+        <w:t xml:space="preserve">Реализация </w:t>
+      </w:r>
+      <w:r>
+        <w:t xml:space="preserve">сервиса </w:t>
+      </w:r>
+      <w:r>
+        <w:t>суммаризации встреч</w:t>
+      </w:r>
+      <w:bookmarkEnd w:id="54"/>
+    </w:p>
+    <w:p>
+      <w:pPr>
+        <w:ind w:left="0"/>
+      </w:pPr>
+    </w:p>
+    <w:p>
+      <w:pPr>
+        <w:pStyle w:val="Heading2"/>
+      </w:pPr>
+      <w:bookmarkStart w:id="55" w:name="_Toc229411252"/>
+      <w:r>
+        <w:t>Реализация мобильного приложения под A</w:t>
+      </w:r>
+      <w:proofErr w:type="spellStart"/>
+      <w:r>
+        <w:rPr>
+          <w:lang w:val="en-US"/>
+        </w:rPr>
+        <w:t>ndroid</w:t>
+      </w:r>
+      <w:bookmarkEnd w:id="55"/>
+      <w:proofErr w:type="spellEnd"/>
+    </w:p>
+    <w:p>
+      <w:pPr>
+        <w:ind w:left="0"/>
+      </w:pPr>
+    </w:p>
+    <w:p>
+      <w:pPr>
+        <w:pStyle w:val="Heading2"/>
+      </w:pPr>
+      <w:bookmarkStart w:id="56" w:name="_Toc229411253"/>
+      <w:r>
+        <w:t>Тестирование системы</w:t>
+      </w:r>
+      <w:bookmarkEnd w:id="56"/>
+    </w:p>
+    <w:p>
+      <w:pPr>
+        <w:ind w:left="0"/>
+      </w:pPr>
+    </w:p>
+    <w:p>
+      <w:pPr>
         <w:pStyle w:val="Heading3"/>
       </w:pPr>
-      <w:bookmarkStart w:id="54" w:name="_Toc229411250"/>
-      <w:r>
-        <w:t xml:space="preserve">Реализация </w:t>
-      </w:r>
-      <w:r>
-        <w:t xml:space="preserve">сервиса </w:t>
-      </w:r>
-      <w:r>
-        <w:t>транскрипции встреч</w:t>
-      </w:r>
-      <w:bookmarkEnd w:id="54"/>
+      <w:bookmarkStart w:id="57" w:name="_Toc229411254"/>
+      <w:r>
+        <w:t>Функциональное тестирование</w:t>
+      </w:r>
+      <w:bookmarkEnd w:id="57"/>
+    </w:p>
+    <w:p>
+      <w:pPr>
+        <w:ind w:left="0"/>
+      </w:pPr>
     </w:p>
     <w:p>
       <w:pPr>
         <w:pStyle w:val="Heading3"/>
       </w:pPr>
-      <w:bookmarkStart w:id="55" w:name="_Toc229411251"/>
-      <w:r>
-        <w:t xml:space="preserve">Реализация </w:t>
-      </w:r>
-      <w:r>
-        <w:t xml:space="preserve">сервиса </w:t>
-      </w:r>
-      <w:r>
-        <w:t>суммаризации встреч</w:t>
-      </w:r>
-      <w:bookmarkEnd w:id="55"/>
-    </w:p>
-    <w:p>
-      <w:pPr>
-        <w:pStyle w:val="Heading3"/>
-      </w:pPr>
-      <w:bookmarkStart w:id="56" w:name="_Toc229411252"/>
-      <w:r>
-        <w:t>Реализация мобильного приложения под A</w:t>
-      </w:r>
-      <w:proofErr w:type="spellStart"/>
-      <w:r>
-        <w:rPr>
-          <w:lang w:val="en-US"/>
-        </w:rPr>
-        <w:t>ndroid</w:t>
-      </w:r>
-      <w:bookmarkEnd w:id="56"/>
-      <w:proofErr w:type="spellEnd"/>
+      <w:bookmarkStart w:id="58" w:name="_Toc229411255"/>
+      <w:r>
+        <w:t>Нефункциональное тестирование</w:t>
+      </w:r>
+      <w:bookmarkEnd w:id="58"/>
     </w:p>
     <w:p>
       <w:pPr>
@@ -24513,66 +25803,220 @@
       <w:pPr>
         <w:pStyle w:val="Heading2"/>
       </w:pPr>
-      <w:bookmarkStart w:id="57" w:name="_Toc229411253"/>
-      <w:r>
-        <w:t>Тестирование сист</w:t>
-      </w:r>
-      <w:bookmarkStart w:id="58" w:name="_GoBack"/>
-      <w:bookmarkEnd w:id="58"/>
-      <w:r>
-        <w:t>емы</w:t>
-      </w:r>
-      <w:bookmarkEnd w:id="57"/>
-    </w:p>
-    <w:p>
-      <w:pPr>
-        <w:pStyle w:val="Heading3"/>
-      </w:pPr>
-      <w:bookmarkStart w:id="59" w:name="_Toc229411254"/>
-      <w:r>
-        <w:t>Функциональное тестирование</w:t>
+      <w:bookmarkStart w:id="59" w:name="_Toc229411256"/>
+      <w:r>
+        <w:lastRenderedPageBreak/>
+        <w:t>Демонстрация работы системы</w:t>
       </w:r>
       <w:bookmarkEnd w:id="59"/>
     </w:p>
     <w:p>
       <w:pPr>
-        <w:pStyle w:val="Heading3"/>
-      </w:pPr>
-      <w:bookmarkStart w:id="60" w:name="_Toc229411255"/>
-      <w:r>
-        <w:t>Нефункциональное тестирование</w:t>
+        <w:ind w:left="0"/>
+      </w:pPr>
+    </w:p>
+    <w:p>
+      <w:pPr>
+        <w:pStyle w:val="Heading2"/>
+      </w:pPr>
+      <w:bookmarkStart w:id="60" w:name="_Toc229411257"/>
+      <w:r>
+        <w:t>Перспективы развития</w:t>
       </w:r>
       <w:bookmarkEnd w:id="60"/>
     </w:p>
     <w:p>
       <w:pPr>
-        <w:ind w:left="0"/>
-      </w:pPr>
-    </w:p>
-    <w:p>
-      <w:pPr>
-        <w:pStyle w:val="Heading2"/>
-      </w:pPr>
-      <w:bookmarkStart w:id="61" w:name="_Toc229411256"/>
-      <w:r>
-        <w:t>Демонстрация работы системы</w:t>
-      </w:r>
+        <w:ind w:left="0" w:firstLine="720"/>
+      </w:pPr>
+      <w:r>
+        <w:t xml:space="preserve">В перспективах развития разработанной системы можно выделить несколько ключевых направлений, которые не только расширяют текущий функционал, но и повышают безопасность, точность и удобство использования сервиса в корпоративной среде. Одним из наиболее значимых шагов станет полный отказ от внешнего API-провайдера </w:t>
+      </w:r>
+      <w:proofErr w:type="spellStart"/>
+      <w:r>
+        <w:t>DeepSeek</w:t>
+      </w:r>
+      <w:proofErr w:type="spellEnd"/>
+      <w:r>
+        <w:t xml:space="preserve"> в пользу локально развернутой языковой модели</w:t>
+      </w:r>
+      <w:r>
+        <w:t>,</w:t>
+      </w:r>
+      <w:r>
+        <w:t xml:space="preserve"> в частности, планируется интеграция модели </w:t>
+      </w:r>
+      <w:proofErr w:type="spellStart"/>
+      <w:r>
+        <w:t>Qwen</w:t>
+      </w:r>
+      <w:proofErr w:type="spellEnd"/>
+      <w:r>
+        <w:t xml:space="preserve"> 3.6. Такое решение продиктовано необходимостью обеспечить конфиденциальность данных: поскольку транскрипции и исходные аудиозаписи содержат потенциально чувствительную информацию, их обработка вне инфраструктуры компании создаёт риски утечки. Локальное размещение LLM позволит полностью контролировать жизненный цикл данных, сохраняя при этом высокое качество генерации </w:t>
+      </w:r>
+      <w:proofErr w:type="spellStart"/>
+      <w:r>
+        <w:t>суммаризаций</w:t>
+      </w:r>
+      <w:proofErr w:type="spellEnd"/>
+      <w:r>
+        <w:t xml:space="preserve"> и ответов в чатах.</w:t>
+      </w:r>
+    </w:p>
+    <w:p>
+      <w:pPr>
+        <w:ind w:left="0" w:firstLine="720"/>
+      </w:pPr>
+      <w:r>
+        <w:t xml:space="preserve">Другим важным направлением является глубокая интеграция с внутренней проектной системой компании, аналогичной </w:t>
+      </w:r>
+      <w:proofErr w:type="spellStart"/>
+      <w:r>
+        <w:t>Jira</w:t>
+      </w:r>
+      <w:proofErr w:type="spellEnd"/>
+      <w:r>
+        <w:t xml:space="preserve">. В текущей реализации результаты встреч существуют изолированно, но в будущем предполагается автоматическое создание задач на основе итогов обсуждений. После завершения встречи система будет анализировать </w:t>
+      </w:r>
+      <w:proofErr w:type="spellStart"/>
+      <w:r>
+        <w:t>суммаризацию</w:t>
+      </w:r>
+      <w:proofErr w:type="spellEnd"/>
+      <w:r>
+        <w:t xml:space="preserve">, выявлять упоминания конкретных сотрудников и поручений, а затем формировать соответствующие задачи в проектном </w:t>
+      </w:r>
+      <w:proofErr w:type="spellStart"/>
+      <w:r>
+        <w:t>трекере</w:t>
+      </w:r>
+      <w:proofErr w:type="spellEnd"/>
+      <w:r>
+        <w:t xml:space="preserve"> с привязкой к исполнителям, срокам и контексту. Это не только ускорит переход от обсуждения к действиям, но и повысит прозрачность рабочих процессов, снижая вероятность упущенных обязательств.</w:t>
+      </w:r>
+    </w:p>
+    <w:p>
+      <w:pPr>
+        <w:ind w:left="0" w:firstLine="720"/>
+      </w:pPr>
+      <w:r>
+        <w:t xml:space="preserve">Особое внимание будет уделено улучшению качества транскрипции за счёт внедрения биометрической базы голосовых данных сотрудников. Планируется собрать и хранить </w:t>
+      </w:r>
+      <w:proofErr w:type="spellStart"/>
+      <w:r>
+        <w:t>анонимизированные</w:t>
+      </w:r>
+      <w:proofErr w:type="spellEnd"/>
+      <w:r>
+        <w:t xml:space="preserve"> голосовые профили всех участников встреч, что позволит </w:t>
+      </w:r>
+      <w:proofErr w:type="spellStart"/>
+      <w:r>
+        <w:t>дообучить</w:t>
+      </w:r>
+      <w:proofErr w:type="spellEnd"/>
+      <w:r>
+        <w:t xml:space="preserve"> или адаптировать модель </w:t>
+      </w:r>
+      <w:r>
+        <w:lastRenderedPageBreak/>
+        <w:t xml:space="preserve">транскрипции под индивидуальные особенности произношения, акцента и темпа речи. В сочетании с модулем </w:t>
+      </w:r>
+      <w:proofErr w:type="spellStart"/>
+      <w:r>
+        <w:t>диаризации</w:t>
+      </w:r>
+      <w:proofErr w:type="spellEnd"/>
+      <w:r>
+        <w:t>,</w:t>
+      </w:r>
+      <w:r>
+        <w:t xml:space="preserve"> технологии, разделяющей речь по спикерам</w:t>
+      </w:r>
+      <w:r>
+        <w:t>,</w:t>
+      </w:r>
+      <w:bookmarkStart w:id="61" w:name="_GoBack"/>
       <w:bookmarkEnd w:id="61"/>
-    </w:p>
-    <w:p/>
-    <w:p>
-      <w:pPr>
-        <w:pStyle w:val="Heading2"/>
-      </w:pPr>
-      <w:bookmarkStart w:id="62" w:name="_Toc229411257"/>
-      <w:r>
-        <w:t>Перспективы развития</w:t>
-      </w:r>
-      <w:bookmarkEnd w:id="62"/>
-    </w:p>
-    <w:p/>
-    <w:p>
-      <w:pPr>
+      <w:r>
+        <w:t xml:space="preserve"> это даст возможность не просто получать текстовую расшифровку, но и точно определять, кто именно что сказал. Такой подход особенно ценен в многочасовых совещаниях с большим числом участников, где важно сохранить авторство высказываний для последующего анализа и распределения ответственности.</w:t>
+      </w:r>
+    </w:p>
+    <w:p>
+      <w:pPr>
+        <w:ind w:left="0" w:firstLine="720"/>
+      </w:pPr>
+      <w:r>
+        <w:t xml:space="preserve">С технической точки зрения эти изменения потребуют доработки архитектуры </w:t>
+      </w:r>
+      <w:proofErr w:type="spellStart"/>
+      <w:r>
+        <w:t>микросервисов</w:t>
+      </w:r>
+      <w:proofErr w:type="spellEnd"/>
+      <w:r>
+        <w:t xml:space="preserve">: появится новый сервис биометрии и </w:t>
+      </w:r>
+      <w:proofErr w:type="spellStart"/>
+      <w:r>
+        <w:t>диаризации</w:t>
+      </w:r>
+      <w:proofErr w:type="spellEnd"/>
+      <w:r>
+        <w:t xml:space="preserve">, потребуется расширение интерфейсов между </w:t>
+      </w:r>
+      <w:proofErr w:type="spellStart"/>
+      <w:r>
+        <w:t>meeting</w:t>
+      </w:r>
+      <w:proofErr w:type="spellEnd"/>
+      <w:r>
+        <w:t xml:space="preserve"> </w:t>
+      </w:r>
+      <w:proofErr w:type="spellStart"/>
+      <w:r>
+        <w:t>service</w:t>
+      </w:r>
+      <w:proofErr w:type="spellEnd"/>
+      <w:r>
+        <w:t xml:space="preserve"> и </w:t>
+      </w:r>
+      <w:proofErr w:type="spellStart"/>
+      <w:r>
+        <w:t>transcribe</w:t>
+      </w:r>
+      <w:proofErr w:type="spellEnd"/>
+      <w:r>
+        <w:t xml:space="preserve"> </w:t>
+      </w:r>
+      <w:proofErr w:type="spellStart"/>
+      <w:r>
+        <w:t>service</w:t>
+      </w:r>
+      <w:proofErr w:type="spellEnd"/>
+      <w:r>
+        <w:t xml:space="preserve">, а также усиление механизмов шифрования и управления доступом к голосовым данным. Однако все эти компоненты логично вписываются в существующую </w:t>
+      </w:r>
+      <w:proofErr w:type="spellStart"/>
+      <w:r>
+        <w:t>event-driven</w:t>
+      </w:r>
+      <w:proofErr w:type="spellEnd"/>
+      <w:r>
+        <w:t xml:space="preserve"> архитектуру на базе </w:t>
+      </w:r>
+      <w:proofErr w:type="spellStart"/>
+      <w:r>
+        <w:t>RabbitMQ</w:t>
+      </w:r>
+      <w:proofErr w:type="spellEnd"/>
+      <w:r>
+        <w:t xml:space="preserve"> и могут быть реализованы без радикальной перестройки системы.</w:t>
+      </w:r>
+    </w:p>
+    <w:p>
+      <w:pPr>
+        <w:ind w:left="0" w:firstLine="720"/>
         <w:sectPr>
           <w:pgSz w:w="11906" w:h="16838"/>
           <w:pgMar w:top="1134" w:right="850" w:bottom="1134" w:left="1701" w:header="708" w:footer="708" w:gutter="0"/>
@@ -24580,6 +26024,49 @@
           <w:docGrid w:linePitch="381"/>
         </w:sectPr>
       </w:pPr>
+      <w:r>
+        <w:t xml:space="preserve">Важно отметить, что предложенные направления развития не являются абстрактными идеями, они напрямую отвечают потребностям реальной корпоративной среды, в которой разрабатывается и внедряется решение. Отказ от облачных LLM в пользу локальных моделей соответствует современным трендам на </w:t>
+      </w:r>
+      <w:proofErr w:type="spellStart"/>
+      <w:r>
+        <w:t>data</w:t>
+      </w:r>
+      <w:proofErr w:type="spellEnd"/>
+      <w:r>
+        <w:t xml:space="preserve"> </w:t>
+      </w:r>
+      <w:proofErr w:type="spellStart"/>
+      <w:r>
+        <w:t>sovereignty</w:t>
+      </w:r>
+      <w:proofErr w:type="spellEnd"/>
+      <w:r>
+        <w:t xml:space="preserve">; интеграция с системами управления задачами усиливает практическую ценность продукта; а персонализированная транскрипция с </w:t>
+      </w:r>
+      <w:proofErr w:type="spellStart"/>
+      <w:r>
+        <w:t>диаризацией</w:t>
+      </w:r>
+      <w:proofErr w:type="spellEnd"/>
+      <w:r>
+        <w:t xml:space="preserve"> значительно повышает точность и полезность итоговых документов. При этом каждое из этих улучшений технически реализуемо в рамках уже заложенной архитектуры и используемых технологий (Java, </w:t>
+      </w:r>
+      <w:proofErr w:type="spellStart"/>
+      <w:r>
+        <w:t>Python</w:t>
+      </w:r>
+      <w:proofErr w:type="spellEnd"/>
+      <w:r>
+        <w:t xml:space="preserve">, PostgreSQL, </w:t>
+      </w:r>
+      <w:proofErr w:type="spellStart"/>
+      <w:r>
+        <w:t>Redis</w:t>
+      </w:r>
+      <w:proofErr w:type="spellEnd"/>
+      <w:r>
+        <w:t>), что минимизирует риски и затраты на дальнейшее развитие.</w:t>
+      </w:r>
     </w:p>
     <w:p>
       <w:pPr>
@@ -24592,7 +26079,7 @@
           <w:rFonts w:cs="Times New Roman"/>
         </w:rPr>
       </w:pPr>
-      <w:bookmarkStart w:id="63" w:name="_Toc229411258"/>
+      <w:bookmarkStart w:id="62" w:name="_Toc229411258"/>
       <w:r>
         <w:rPr>
           <w:rFonts w:cs="Times New Roman"/>
@@ -24600,14 +26087,13 @@
         <w:lastRenderedPageBreak/>
         <w:t>ЗАКЛЮЧЕНИЕ</w:t>
       </w:r>
-      <w:bookmarkEnd w:id="63"/>
+      <w:bookmarkEnd w:id="62"/>
     </w:p>
     <w:p>
       <w:pPr>
         <w:ind w:left="0"/>
         <w:rPr>
           <w:rFonts w:cs="Times New Roman"/>
-          <w:lang w:val="en-US"/>
         </w:rPr>
       </w:pPr>
     </w:p>
@@ -24616,7 +26102,6 @@
         <w:ind w:left="0"/>
         <w:rPr>
           <w:rFonts w:cs="Times New Roman"/>
-          <w:lang w:val="en-US"/>
         </w:rPr>
       </w:pPr>
     </w:p>
@@ -24625,7 +26110,6 @@
         <w:ind w:left="0"/>
         <w:rPr>
           <w:rFonts w:cs="Times New Roman"/>
-          <w:lang w:val="en-US"/>
         </w:rPr>
         <w:sectPr>
           <w:pgSz w:w="11906" w:h="16838"/>
@@ -24646,7 +26130,7 @@
           <w:rFonts w:cs="Times New Roman"/>
         </w:rPr>
       </w:pPr>
-      <w:bookmarkStart w:id="64" w:name="_Toc229411259"/>
+      <w:bookmarkStart w:id="63" w:name="_Toc229411259"/>
       <w:r>
         <w:rPr>
           <w:rFonts w:cs="Times New Roman"/>
@@ -24654,7 +26138,7 @@
         <w:lastRenderedPageBreak/>
         <w:t>СПИСОК ИСПОЛЬЗОВАННЫХ ИСТОЧНИКОВ</w:t>
       </w:r>
-      <w:bookmarkEnd w:id="64"/>
+      <w:bookmarkEnd w:id="63"/>
     </w:p>
     <w:p>
       <w:pPr>
@@ -24965,7 +26449,7 @@
         </w:rPr>
         <w:t xml:space="preserve"> </w:t>
       </w:r>
-      <w:hyperlink r:id="rId23" w:history="1">
+      <w:hyperlink r:id="rId28" w:history="1">
         <w:r>
           <w:rPr>
             <w:rStyle w:val="Hyperlink"/>
@@ -26175,7 +27659,7 @@
           <w:rFonts w:cs="Times New Roman"/>
         </w:rPr>
       </w:pPr>
-      <w:bookmarkStart w:id="65" w:name="_Toc229411260"/>
+      <w:bookmarkStart w:id="64" w:name="_Toc229411260"/>
       <w:r>
         <w:rPr>
           <w:rFonts w:cs="Times New Roman"/>
@@ -26183,7 +27667,7 @@
         <w:lastRenderedPageBreak/>
         <w:t>ПРИЛОЖЕНИЕ А</w:t>
       </w:r>
-      <w:bookmarkEnd w:id="65"/>
+      <w:bookmarkEnd w:id="64"/>
     </w:p>
     <w:p>
       <w:pPr>
@@ -26224,7 +27708,7 @@
           <w:rFonts w:cs="Times New Roman"/>
         </w:rPr>
       </w:pPr>
-      <w:bookmarkStart w:id="66" w:name="_Toc229411261"/>
+      <w:bookmarkStart w:id="65" w:name="_Toc229411261"/>
       <w:r>
         <w:rPr>
           <w:rFonts w:cs="Times New Roman"/>
@@ -26232,7 +27716,7 @@
         <w:lastRenderedPageBreak/>
         <w:t>ПРИЛОЖЕНИЕ Б</w:t>
       </w:r>
-      <w:bookmarkEnd w:id="66"/>
+      <w:bookmarkEnd w:id="65"/>
     </w:p>
     <w:p>
       <w:pPr>
@@ -30408,6 +31892,28 @@
       <w:color w:val="000000" w:themeColor="text1"/>
     </w:rPr>
   </w:style>
+  <w:style w:type="paragraph" w:styleId="Heading4">
+    <w:name w:val="heading 4"/>
+    <w:basedOn w:val="Normal"/>
+    <w:next w:val="Normal"/>
+    <w:link w:val="Heading4Char"/>
+    <w:uiPriority w:val="9"/>
+    <w:unhideWhenUsed/>
+    <w:qFormat/>
+    <w:rsid w:val="0059354D"/>
+    <w:pPr>
+      <w:keepNext/>
+      <w:keepLines/>
+      <w:spacing w:before="40"/>
+      <w:outlineLvl w:val="3"/>
+    </w:pPr>
+    <w:rPr>
+      <w:rFonts w:eastAsiaTheme="majorEastAsia" w:cstheme="majorBidi"/>
+      <w:b/>
+      <w:iCs/>
+      <w:color w:val="000000" w:themeColor="text1"/>
+    </w:rPr>
+  </w:style>
   <w:style w:type="character" w:default="1" w:styleId="DefaultParagraphFont">
     <w:name w:val="Default Paragraph Font"/>
     <w:uiPriority w:val="1"/>
@@ -30962,6 +32468,20 @@
       <w14:ligatures w14:val="none"/>
     </w:rPr>
   </w:style>
+  <w:style w:type="character" w:customStyle="1" w:styleId="Heading4Char">
+    <w:name w:val="Heading 4 Char"/>
+    <w:basedOn w:val="DefaultParagraphFont"/>
+    <w:link w:val="Heading4"/>
+    <w:uiPriority w:val="9"/>
+    <w:rsid w:val="0059354D"/>
+    <w:rPr>
+      <w:rFonts w:ascii="Times New Roman" w:eastAsiaTheme="majorEastAsia" w:hAnsi="Times New Roman" w:cstheme="majorBidi"/>
+      <w:b/>
+      <w:iCs/>
+      <w:color w:val="000000" w:themeColor="text1"/>
+      <w:sz w:val="28"/>
+    </w:rPr>
+  </w:style>
 </w:styles>
 </file>
 
@@ -31265,7 +32785,7 @@
 </file>
 
 <file path=customXml/itemProps1.xml><?xml version="1.0" encoding="utf-8"?>
-<ds:datastoreItem xmlns:ds="http://schemas.openxmlformats.org/officeDocument/2006/customXml" ds:itemID="{1CAB5243-8236-4D41-8E98-7545D13537AB}">
+<ds:datastoreItem xmlns:ds="http://schemas.openxmlformats.org/officeDocument/2006/customXml" ds:itemID="{86853842-34E8-1347-BE61-E65C95CB980B}">
   <ds:schemaRefs>
     <ds:schemaRef ds:uri="http://schemas.openxmlformats.org/officeDocument/2006/bibliography"/>
   </ds:schemaRefs>

</xml_diff>